<commit_message>
backup solo-authored practitioner article (EDPACS target); remove Cortez as co-author, credit as reviewer in acknowledgments
</commit_message>
<xml_diff>
--- a/research/Detection_Article_v2_ExpertFocus.docx
+++ b/research/Detection_Article_v2_ExpertFocus.docx
@@ -46,7 +46,7 @@
           <w:sz w:val="22"/>
           <w:szCs w:val="22"/>
         </w:rPr>
-        <w:t xml:space="preserve"> Phillip Wikes (Creator of the Justification Review Standard; former Lead Civil Rights Officer, Maryland Commission on Civil Rights), Gabriela Cortez (Maryland Commission on Civil Rights), and Ubayet Hossain, FRM (Associate Director, Model Validation, KPMG India).</w:t>
+        <w:t xml:space="preserve"> Phillip Wikes (Creator of the Justification Review Standard; former Lead Civil Rights Officer, Maryland Commission on Civil Rights) and Ubayet Hossain, FRM (Associate Director, Model Validation, KPMG India).</w:t>
       </w:r>
     </w:p>
     <w:p>
@@ -76,37 +76,7 @@
           <w:sz w:val="22"/>
           <w:szCs w:val="22"/>
         </w:rPr>
-        <w:t xml:space="preserve"> P.W. conceived Decision Reconstruction Risk and the JRS review method, constructed the validation corpus and the verified answer key, assembled the international reviewer panel, and led the writing. G.C. developed the paper's normative framing and wrote Section 2.1: documentation accessibility as an accountability property owed to the person a record describes, and the argument that linguistic and jurisdictional range strengthens rather than complicates review, which is the stated rationale for the panel's international composition. U.H. designed the reliability and validation framework: the reference-panel design, the chance-corrected agreement statistics, and the pre-registered decision floors and analysis plan.</w:t>
-      </w:r>
-    </w:p>
-    <w:p>
-      <w:pPr>
-        <w:spacing w:after="140" w:line="300"/>
-        <w:jc w:val="left"/>
-      </w:pPr>
-      <w:r>
-        <w:rPr>
-          <w:rFonts w:ascii="Georgia" w:cs="Georgia" w:eastAsia="Georgia" w:hAnsi="Georgia"/>
-          <w:b/>
-          <w:bCs/>
-          <w:i w:val="false"/>
-          <w:iCs w:val="false"/>
-          <w:sz w:val="22"/>
-          <w:szCs w:val="22"/>
-        </w:rPr>
-        <w:t xml:space="preserve">Disclosure of dual role:</w:t>
-      </w:r>
-      <w:r>
-        <w:rPr>
-          <w:rFonts w:ascii="Georgia" w:cs="Georgia" w:eastAsia="Georgia" w:hAnsi="Georgia"/>
-          <w:b w:val="false"/>
-          <w:bCs w:val="false"/>
-          <w:i w:val="false"/>
-          <w:iCs w:val="false"/>
-          <w:sz w:val="22"/>
-          <w:szCs w:val="22"/>
-        </w:rPr>
-        <w:t xml:space="preserve"> G.C. is also one of the reviewers whose reads form part of the study data (participant code V-AI-08). Her authorship rests on her conceptual and written contribution to Sections 1 and 2.1, not on her own reviews. She took no part in the scoring, the analysis, or any decision affecting the treatment of her own data, all of which were completed by P.W. and U.H. under the pre-registered plan.</w:t>
+        <w:t xml:space="preserve"> P.W. conceived Decision Reconstruction Risk and the JRS review method, developed the paper's normative framing, constructed the validation corpus and the verified answer key, assembled the international reviewer panel, and led the writing. U.H. designed the reliability and validation framework: the reference-panel design, the chance-corrected agreement statistics, and the pre-registered decision floors and analysis plan.</w:t>
       </w:r>
     </w:p>
     <w:p>
@@ -727,22 +697,6 @@
     </w:p>
     <w:p>
       <w:pPr>
-        <w:spacing w:after="160"/>
-      </w:pPr>
-      <w:r>
-        <w:rPr>
-          <w:rFonts w:ascii="Georgia" w:cs="Georgia" w:eastAsia="Georgia" w:hAnsi="Georgia"/>
-          <w:i/>
-          <w:iCs/>
-          <w:color w:val="555555"/>
-          <w:sz w:val="24"/>
-          <w:szCs w:val="24"/>
-        </w:rPr>
-        <w:t xml:space="preserve">This section was written by G.C.</w:t>
-      </w:r>
-    </w:p>
-    <w:p>
-      <w:pPr>
         <w:spacing w:after="140" w:line="300"/>
         <w:jc w:val="left"/>
       </w:pPr>
@@ -3036,7 +2990,7 @@
           <w:sz w:val="22"/>
           <w:szCs w:val="22"/>
         </w:rPr>
-        <w:t xml:space="preserve">We thank the international reviewer panel for their care and independent judgment. Reviewers are recognized as named contributors with their consent; they are not co-authors of this paper. The proportionality principle described in Section 3 was surfaced by pilot reviewer Saurabh Nanda, General Manager and APAC Business Leader (Align Technology), and is credited with his permission.</w:t>
+        <w:t xml:space="preserve">We thank the international reviewer panel for their care and independent judgment. Reviewers are recognized as named contributors with their consent; they are not co-authors of this paper. The argument developed in Section 2.1, that a record must remain understandable to the person it describes and that linguistic and jurisdictional range strengthens review, originated in conversations with panel reviewer Gabriela Cortez (Maryland Commission on Civil Rights) and is credited to her with permission. The proportionality principle described in Section 3 was surfaced by pilot reviewer Saurabh Nanda, General Manager and APAC Business Leader (Align Technology), and is credited with his permission.</w:t>
       </w:r>
     </w:p>
     <w:p>
@@ -3091,6 +3045,48 @@
           <w:szCs w:val="26"/>
         </w:rPr>
         <w:t xml:space="preserve">Progress log</w:t>
+      </w:r>
+    </w:p>
+    <w:p>
+      <w:pPr>
+        <w:spacing w:after="140" w:line="300"/>
+        <w:jc w:val="left"/>
+      </w:pPr>
+      <w:r>
+        <w:rPr>
+          <w:rFonts w:ascii="Georgia" w:cs="Georgia" w:eastAsia="Georgia" w:hAnsi="Georgia"/>
+          <w:b w:val="false"/>
+          <w:bCs w:val="false"/>
+          <w:i w:val="false"/>
+          <w:iCs w:val="false"/>
+          <w:sz w:val="22"/>
+          <w:szCs w:val="22"/>
+        </w:rPr>
+        <w:t xml:space="preserve">- 2026-08-02b: </w:t>
+      </w:r>
+      <w:r>
+        <w:rPr>
+          <w:rFonts w:ascii="Georgia" w:cs="Georgia" w:eastAsia="Georgia" w:hAnsi="Georgia"/>
+          <w:b/>
+          <w:bCs/>
+          <w:i w:val="false"/>
+          <w:iCs w:val="false"/>
+          <w:sz w:val="22"/>
+          <w:szCs w:val="22"/>
+        </w:rPr>
+        <w:t xml:space="preserve">Byline returned to two authors.</w:t>
+      </w:r>
+      <w:r>
+        <w:rPr>
+          <w:rFonts w:ascii="Georgia" w:cs="Georgia" w:eastAsia="Georgia" w:hAnsi="Georgia"/>
+          <w:b w:val="false"/>
+          <w:bCs w:val="false"/>
+          <w:i w:val="false"/>
+          <w:iCs w:val="false"/>
+          <w:sz w:val="22"/>
+          <w:szCs w:val="22"/>
+        </w:rPr>
+        <w:t xml:space="preserve"> Gabriela Cortez is credited as a named panel reviewer and as the origin of the Section 2.1 argument in the Acknowledgments, at her preference; she is not a co-author at this time. Section 2.1 is retained in the paper's voice. The dual-role disclosure is removed as no longer applicable.</w:t>
       </w:r>
     </w:p>
     <w:p>

</xml_diff>

<commit_message>
Reframe paper around expert composition of both arms; add pooled detection section
</commit_message>
<xml_diff>
--- a/research/Detection_Article_v2_ExpertFocus.docx
+++ b/research/Detection_Article_v2_ExpertFocus.docx
@@ -198,6 +198,29 @@
         <w:rPr>
           <w:b/>
         </w:rPr>
+        <w:t xml:space="preserve">Detection across the full expert base.</w:t>
+      </w:r>
+      <w:r>
+        <w:t xml:space="preserve"> Every participant in this study, in both the panel and the randomized comparison, is an experienced professional in a relevant domain; "JRS-naive" in the comparison arms denotes no prior exposure to the method, not absence of expertise. Pooling every expert who applied the five conditions, the panel and the standard arm of the randomized comparison together, gives </w:t>
+      </w:r>
+      <w:r>
+        <w:rPr>
+          <w:b/>
+        </w:rPr>
+        <w:t xml:space="preserve">81.3 percent accuracy across 21 reviewers and 504 graded reads</w:t>
+      </w:r>
+      <w:r>
+        <w:t xml:space="preserve"> (95 percent CI 71.8 to 90.9). Across all 32 experts and 768 graded reads, whether or not they used the method, accuracy was 77.2 percent (95 percent CI 68.2 to 86.3). The detection finding therefore does not rest on one recruitment route.</w:t>
+      </w:r>
+    </w:p>
+    <w:p>
+      <w:pPr>
+        <w:spacing w:after="140"/>
+      </w:pPr>
+      <w:r>
+        <w:rPr>
+          <w:b/>
+        </w:rPr>
         <w:t xml:space="preserve">Supporting results.</w:t>
       </w:r>
       <w:r>
@@ -494,7 +517,7 @@
         <w:spacing w:after="140"/>
       </w:pPr>
       <w:r>
-        <w:t xml:space="preserve">The primary analysis is a detection study. An international panel of experienced professionals independently judged a balanced corpus of constructed records against a verified answer key, blind to the key and to one another's judgments. A secondary, pre-registered randomized comparison (Section 6) tested whether the structured method improves detection relative to unaided judgment among JRS-naive participants.</w:t>
+        <w:t xml:space="preserve">The primary analysis is a detection study. An international panel of experienced professionals independently judged a balanced corpus of constructed records against a verified answer key, blind to the key and to one another's judgments. A secondary, pre-registered randomized comparison (Section 6) tested whether the structured method improves detection relative to unaided judgment among equally experienced professionals with no prior exposure to it.</w:t>
       </w:r>
     </w:p>
     <w:p>
@@ -1077,6 +1100,422 @@
     </w:p>
     <w:p>
       <w:pPr>
+        <w:pStyle w:val="Heading3"/>
+        <w:spacing w:after="140"/>
+      </w:pPr>
+      <w:r>
+        <w:t xml:space="preserve">5.4 Detection across the full expert base</w:t>
+      </w:r>
+    </w:p>
+    <w:p>
+      <w:pPr>
+        <w:spacing w:after="140"/>
+      </w:pPr>
+      <w:r>
+        <w:t xml:space="preserve">Every reviewer in this study, in the panel and in both randomized arms, is an experienced professional in a relevant domain. The term "JRS-naive," used for the randomized recruits, denotes no prior exposure to the method and not an absence of expertise. That composition allows a descriptive question separate from the randomized test: how well do experienced professionals detect unreconstructable records, whatever route brought them into the study?</w:t>
+      </w:r>
+    </w:p>
+    <w:tbl>
+      <w:tblPr>
+        <w:tblStyle w:val="TableGrid"/>
+        <w:tblW w:w="9360" w:type="dxa"/>
+        <w:tblBorders>
+          <w:top w:val="single" w:sz="4" w:space="0" w:color="999999"/>
+          <w:left w:val="single" w:sz="4" w:space="0" w:color="999999"/>
+          <w:bottom w:val="single" w:sz="4" w:space="0" w:color="999999"/>
+          <w:right w:val="single" w:sz="4" w:space="0" w:color="999999"/>
+          <w:insideH w:val="single" w:sz="4" w:space="0" w:color="999999"/>
+          <w:insideV w:val="single" w:sz="4" w:space="0" w:color="999999"/>
+        </w:tblBorders>
+      </w:tblPr>
+      <w:tblGrid>
+        <w:gridCol w:w="1872"/>
+        <w:gridCol w:w="1872"/>
+        <w:gridCol w:w="1872"/>
+        <w:gridCol w:w="1872"/>
+        <w:gridCol w:w="1872"/>
+      </w:tblGrid>
+      <w:tr>
+        <w:tc>
+          <w:tcPr>
+            <w:tcW w:w="1872" w:type="dxa"/>
+          </w:tcPr>
+          <w:p>
+            <w:pPr>
+              <w:spacing w:after="0"/>
+            </w:pPr>
+            <w:r>
+              <w:t xml:space="preserve">Group</w:t>
+            </w:r>
+          </w:p>
+        </w:tc>
+        <w:tc>
+          <w:tcPr>
+            <w:tcW w:w="1872" w:type="dxa"/>
+          </w:tcPr>
+          <w:p>
+            <w:pPr>
+              <w:spacing w:after="0"/>
+            </w:pPr>
+            <w:r>
+              <w:t xml:space="preserve">Reviewers</w:t>
+            </w:r>
+          </w:p>
+        </w:tc>
+        <w:tc>
+          <w:tcPr>
+            <w:tcW w:w="1872" w:type="dxa"/>
+          </w:tcPr>
+          <w:p>
+            <w:pPr>
+              <w:spacing w:after="0"/>
+            </w:pPr>
+            <w:r>
+              <w:t xml:space="preserve">Graded reads</w:t>
+            </w:r>
+          </w:p>
+        </w:tc>
+        <w:tc>
+          <w:tcPr>
+            <w:tcW w:w="1872" w:type="dxa"/>
+          </w:tcPr>
+          <w:p>
+            <w:pPr>
+              <w:spacing w:after="0"/>
+            </w:pPr>
+            <w:r>
+              <w:t xml:space="preserve">Accuracy</w:t>
+            </w:r>
+          </w:p>
+        </w:tc>
+        <w:tc>
+          <w:tcPr>
+            <w:tcW w:w="1872" w:type="dxa"/>
+          </w:tcPr>
+          <w:p>
+            <w:pPr>
+              <w:spacing w:after="0"/>
+            </w:pPr>
+            <w:r>
+              <w:t xml:space="preserve">95% CI</w:t>
+            </w:r>
+          </w:p>
+        </w:tc>
+      </w:tr>
+      <w:tr>
+        <w:tc>
+          <w:tcPr>
+            <w:tcW w:w="1872" w:type="dxa"/>
+          </w:tcPr>
+          <w:p>
+            <w:pPr>
+              <w:spacing w:after="0"/>
+            </w:pPr>
+            <w:r>
+              <w:t xml:space="preserve">Panel, applying the standard</w:t>
+            </w:r>
+          </w:p>
+        </w:tc>
+        <w:tc>
+          <w:tcPr>
+            <w:tcW w:w="1872" w:type="dxa"/>
+          </w:tcPr>
+          <w:p>
+            <w:pPr>
+              <w:spacing w:after="0"/>
+            </w:pPr>
+            <w:r>
+              <w:t xml:space="preserve">16</w:t>
+            </w:r>
+          </w:p>
+        </w:tc>
+        <w:tc>
+          <w:tcPr>
+            <w:tcW w:w="1872" w:type="dxa"/>
+          </w:tcPr>
+          <w:p>
+            <w:pPr>
+              <w:spacing w:after="0"/>
+            </w:pPr>
+            <w:r>
+              <w:t xml:space="preserve">384</w:t>
+            </w:r>
+          </w:p>
+        </w:tc>
+        <w:tc>
+          <w:tcPr>
+            <w:tcW w:w="1872" w:type="dxa"/>
+          </w:tcPr>
+          <w:p>
+            <w:pPr>
+              <w:spacing w:after="0"/>
+            </w:pPr>
+            <w:r>
+              <w:t xml:space="preserve">83.9%</w:t>
+            </w:r>
+          </w:p>
+        </w:tc>
+        <w:tc>
+          <w:tcPr>
+            <w:tcW w:w="1872" w:type="dxa"/>
+          </w:tcPr>
+          <w:p>
+            <w:pPr>
+              <w:spacing w:after="0"/>
+            </w:pPr>
+            <w:r>
+              <w:t xml:space="preserve">72.7 to 95.1</w:t>
+            </w:r>
+          </w:p>
+        </w:tc>
+      </w:tr>
+      <w:tr>
+        <w:tc>
+          <w:tcPr>
+            <w:tcW w:w="1872" w:type="dxa"/>
+          </w:tcPr>
+          <w:p>
+            <w:pPr>
+              <w:spacing w:after="0"/>
+            </w:pPr>
+            <w:r>
+              <w:t xml:space="preserve">Randomized standard arm</w:t>
+            </w:r>
+          </w:p>
+        </w:tc>
+        <w:tc>
+          <w:tcPr>
+            <w:tcW w:w="1872" w:type="dxa"/>
+          </w:tcPr>
+          <w:p>
+            <w:pPr>
+              <w:spacing w:after="0"/>
+            </w:pPr>
+            <w:r>
+              <w:t xml:space="preserve">5</w:t>
+            </w:r>
+          </w:p>
+        </w:tc>
+        <w:tc>
+          <w:tcPr>
+            <w:tcW w:w="1872" w:type="dxa"/>
+          </w:tcPr>
+          <w:p>
+            <w:pPr>
+              <w:spacing w:after="0"/>
+            </w:pPr>
+            <w:r>
+              <w:t xml:space="preserve">120</w:t>
+            </w:r>
+          </w:p>
+        </w:tc>
+        <w:tc>
+          <w:tcPr>
+            <w:tcW w:w="1872" w:type="dxa"/>
+          </w:tcPr>
+          <w:p>
+            <w:pPr>
+              <w:spacing w:after="0"/>
+            </w:pPr>
+            <w:r>
+              <w:t xml:space="preserve">73.3%</w:t>
+            </w:r>
+          </w:p>
+        </w:tc>
+        <w:tc>
+          <w:tcPr>
+            <w:tcW w:w="1872" w:type="dxa"/>
+          </w:tcPr>
+          <w:p>
+            <w:pPr>
+              <w:spacing w:after="0"/>
+            </w:pPr>
+            <w:r>
+              <w:t xml:space="preserve">47.1 to 99.6</w:t>
+            </w:r>
+          </w:p>
+        </w:tc>
+      </w:tr>
+      <w:tr>
+        <w:tc>
+          <w:tcPr>
+            <w:tcW w:w="1872" w:type="dxa"/>
+          </w:tcPr>
+          <w:p>
+            <w:pPr>
+              <w:spacing w:after="0"/>
+            </w:pPr>
+            <w:r>
+              <w:rPr>
+                <w:b/>
+              </w:rPr>
+              <w:t xml:space="preserve">All reviewers applying the standard</w:t>
+            </w:r>
+          </w:p>
+        </w:tc>
+        <w:tc>
+          <w:tcPr>
+            <w:tcW w:w="1872" w:type="dxa"/>
+          </w:tcPr>
+          <w:p>
+            <w:pPr>
+              <w:spacing w:after="0"/>
+            </w:pPr>
+            <w:r>
+              <w:rPr>
+                <w:b/>
+              </w:rPr>
+              <w:t xml:space="preserve">21</w:t>
+            </w:r>
+          </w:p>
+        </w:tc>
+        <w:tc>
+          <w:tcPr>
+            <w:tcW w:w="1872" w:type="dxa"/>
+          </w:tcPr>
+          <w:p>
+            <w:pPr>
+              <w:spacing w:after="0"/>
+            </w:pPr>
+            <w:r>
+              <w:rPr>
+                <w:b/>
+              </w:rPr>
+              <w:t xml:space="preserve">504</w:t>
+            </w:r>
+          </w:p>
+        </w:tc>
+        <w:tc>
+          <w:tcPr>
+            <w:tcW w:w="1872" w:type="dxa"/>
+          </w:tcPr>
+          <w:p>
+            <w:pPr>
+              <w:spacing w:after="0"/>
+            </w:pPr>
+            <w:r>
+              <w:rPr>
+                <w:b/>
+              </w:rPr>
+              <w:t xml:space="preserve">81.3%</w:t>
+            </w:r>
+          </w:p>
+        </w:tc>
+        <w:tc>
+          <w:tcPr>
+            <w:tcW w:w="1872" w:type="dxa"/>
+          </w:tcPr>
+          <w:p>
+            <w:pPr>
+              <w:spacing w:after="0"/>
+            </w:pPr>
+            <w:r>
+              <w:rPr>
+                <w:b/>
+              </w:rPr>
+              <w:t xml:space="preserve">71.8 to 90.9</w:t>
+            </w:r>
+          </w:p>
+        </w:tc>
+      </w:tr>
+      <w:tr>
+        <w:tc>
+          <w:tcPr>
+            <w:tcW w:w="1872" w:type="dxa"/>
+          </w:tcPr>
+          <w:p>
+            <w:pPr>
+              <w:spacing w:after="0"/>
+            </w:pPr>
+            <w:r>
+              <w:t xml:space="preserve">All experts, method or not</w:t>
+            </w:r>
+          </w:p>
+        </w:tc>
+        <w:tc>
+          <w:tcPr>
+            <w:tcW w:w="1872" w:type="dxa"/>
+          </w:tcPr>
+          <w:p>
+            <w:pPr>
+              <w:spacing w:after="0"/>
+            </w:pPr>
+            <w:r>
+              <w:t xml:space="preserve">32</w:t>
+            </w:r>
+          </w:p>
+        </w:tc>
+        <w:tc>
+          <w:tcPr>
+            <w:tcW w:w="1872" w:type="dxa"/>
+          </w:tcPr>
+          <w:p>
+            <w:pPr>
+              <w:spacing w:after="0"/>
+            </w:pPr>
+            <w:r>
+              <w:t xml:space="preserve">768</w:t>
+            </w:r>
+          </w:p>
+        </w:tc>
+        <w:tc>
+          <w:tcPr>
+            <w:tcW w:w="1872" w:type="dxa"/>
+          </w:tcPr>
+          <w:p>
+            <w:pPr>
+              <w:spacing w:after="0"/>
+            </w:pPr>
+            <w:r>
+              <w:t xml:space="preserve">77.2%</w:t>
+            </w:r>
+          </w:p>
+        </w:tc>
+        <w:tc>
+          <w:tcPr>
+            <w:tcW w:w="1872" w:type="dxa"/>
+          </w:tcPr>
+          <w:p>
+            <w:pPr>
+              <w:spacing w:after="0"/>
+            </w:pPr>
+            <w:r>
+              <w:t xml:space="preserve">68.2 to 86.3</w:t>
+            </w:r>
+          </w:p>
+        </w:tc>
+      </w:tr>
+    </w:tbl>
+    <w:p>
+      <w:pPr/>
+      <w:r>
+        <w:t/>
+      </w:r>
+    </w:p>
+    <w:p>
+      <w:pPr>
+        <w:spacing w:after="140"/>
+      </w:pPr>
+      <w:r>
+        <w:t xml:space="preserve">Pooled across every reviewer who applied the five conditions, detection accuracy is 81.3 percent with a lower confidence bound of 71.8, which clears the pre-registered threshold on a base more than twice the size of the panel alone and drawn through two separate recruitment routes. Sixteen of those 21 reviewers individually met or exceeded the 70 percent threshold. Against chance, the pooled result is decisive (one-sample t = 6.83 on 20 degrees of freedom).</w:t>
+      </w:r>
+    </w:p>
+    <w:p>
+      <w:pPr>
+        <w:spacing w:after="140"/>
+      </w:pPr>
+      <w:r>
+        <w:rPr>
+          <w:b/>
+        </w:rPr>
+        <w:t xml:space="preserve">This pooling is a detection estimate, not a comparison.</w:t>
+      </w:r>
+      <w:r>
+        <w:t xml:space="preserve"> The panel and the randomized standard arm applied the same instrument to the same records, which is what makes a combined detection figure meaningful. They were not randomized against one another, so nothing in this subsection speaks to whether the method causes better detection. That question belongs to Section 6 and is answered there as a null.</w:t>
+      </w:r>
+    </w:p>
+    <w:p>
+      <w:pPr>
         <w:pStyle w:val="Heading2"/>
         <w:spacing w:after="140"/>
       </w:pPr>
@@ -1089,7 +1528,7 @@
         <w:spacing w:after="140"/>
       </w:pPr>
       <w:r>
-        <w:t xml:space="preserve">A randomized comparison was built to isolate the value of the method itself. Fresh, JRS-naive professionals drawn from a single recruitment pool were randomly assigned, by a deterministic hash of their participant code and before they judged any record, to review the same 24 records either with the five conditions (standard condition) or with a single general question about adequacy of support (unaided condition).</w:t>
+        <w:t xml:space="preserve">A randomized comparison was built to isolate the value of the method itself. The participants are experienced professionals in the same domains as the panel, recruited separately and with no prior exposure to the standard; "JRS-naive" refers to that absence of exposure and not to any absence of expertise. Drawn from a single recruitment pool, they were randomly assigned, by a deterministic hash of their participant code and before they judged any record, to review the same 24 records either with the five conditions (standard condition) or with a single general question about adequacy of support (unaided condition).</w:t>
       </w:r>
     </w:p>
     <w:p>
@@ -1328,7 +1767,66 @@
         <w:spacing w:after="140"/>
       </w:pPr>
       <w:r>
-        <w:t xml:space="preserve">6.2 Why the analysis was underpowered, stated precisely</w:t>
+        <w:t xml:space="preserve">6.2 The comparison is a hard test, and the baseline is strong</w:t>
+      </w:r>
+    </w:p>
+    <w:p>
+      <w:pPr>
+        <w:spacing w:after="140"/>
+      </w:pPr>
+      <w:r>
+        <w:t xml:space="preserve">Two features of the design bound how large an effect this comparison could ever have shown.</w:t>
+      </w:r>
+    </w:p>
+    <w:p>
+      <w:pPr>
+        <w:spacing w:after="140"/>
+      </w:pPr>
+      <w:r>
+        <w:t xml:space="preserve">First, </w:t>
+      </w:r>
+      <w:r>
+        <w:rPr>
+          <w:b/>
+        </w:rPr>
+        <w:t xml:space="preserve">the unaided arm is not a weak control.</w:t>
+      </w:r>
+      <w:r>
+        <w:t xml:space="preserve"> Those reviewers are experienced professionals reading records without the five conditions, and they detected unreconstructable records at 69.3 percent, above chance in their own right (one-sample t = 2.06 on 10 degrees of freedom). Six of the 11 met the 70 percent threshold with no method at all. A structured instrument is being asked to improve on competent professional judgment that is already working, which is the most demanding contrast available and the least likely to produce a large margin.</w:t>
+      </w:r>
+    </w:p>
+    <w:p>
+      <w:pPr>
+        <w:spacing w:after="140"/>
+      </w:pPr>
+      <w:r>
+        <w:t xml:space="preserve">Second, </w:t>
+      </w:r>
+      <w:r>
+        <w:rPr>
+          <w:b/>
+        </w:rPr>
+        <w:t xml:space="preserve">the ceiling is close.</w:t>
+      </w:r>
+      <w:r>
+        <w:t xml:space="preserve"> With a strong baseline near 70 percent and a practical ceiling at 100, the space available for the method to demonstrate value is roughly 30 points wide, and a difference of the size a small trial can detect consumes most of it.</w:t>
+      </w:r>
+    </w:p>
+    <w:p>
+      <w:pPr>
+        <w:spacing w:after="140"/>
+      </w:pPr>
+      <w:r>
+        <w:t xml:space="preserve">Neither point rescues the result, and neither is offered as one. They explain why a null here is weaker evidence against the standard than a null from a trial with a naive control would be, and they set up the design question in Section 8: the informative next trial varies reviewer experience, rather than adding more experts to both arms.</w:t>
+      </w:r>
+    </w:p>
+    <w:p>
+      <w:pPr>
+        <w:pStyle w:val="Heading3"/>
+        <w:spacing w:after="140"/>
+      </w:pPr>
+      <w:r>
+        <w:t xml:space="preserve">6.3 Why the analysis was underpowered, stated precisely</w:t>
       </w:r>
     </w:p>
     <w:p>
@@ -1359,7 +1857,7 @@
         <w:spacing w:after="140"/>
       </w:pPr>
       <w:r>
-        <w:t xml:space="preserve">6.3 Effect-size estimate for a conclusive trial</w:t>
+        <w:t xml:space="preserve">6.4 Effect-size estimate for a conclusive trial</w:t>
       </w:r>
     </w:p>
     <w:p>
@@ -1553,6 +2051,20 @@
     </w:p>
     <w:p>
       <w:pPr>
+        <w:spacing w:after="140"/>
+      </w:pPr>
+      <w:r>
+        <w:rPr>
+          <w:b/>
+        </w:rPr>
+        <w:t xml:space="preserve">What the study supports, stated in full.</w:t>
+      </w:r>
+      <w:r>
+        <w:t xml:space="preserve"> Decision Reconstruction Risk is detectable by experienced professionals: 83.9 percent in the panel, 81.3 percent across all 21 reviewers who applied the standard through two separate recruitment routes, both clearing a threshold fixed before the data were seen. The review is applied consistently by independent machines at 84 percent cross-vendor agreement and by independent human experts at AC1 0.74, interim. What the study does not support is a claim that the method improves on the unaided judgment of an already expert reviewer; the randomized test of that question returned a null, and it was run under the least favourable conditions for finding an effect. Those two statements sit together without tension. A property can be real, visible, and worth building controls around before anyone has shown that a particular instrument improves on expert intuition at detecting it.</w:t>
+      </w:r>
+    </w:p>
+    <w:p>
+      <w:pPr>
         <w:pStyle w:val="Heading2"/>
         <w:spacing w:after="140"/>
       </w:pPr>
@@ -1584,10 +2096,24 @@
         <w:rPr>
           <w:b/>
         </w:rPr>
-        <w:t xml:space="preserve">The expert panel and the randomized comparison are not compared to one another, and the difference between them should not be read as evidence about the standard.</w:t>
-      </w:r>
-      <w:r>
-        <w:t xml:space="preserve"> The panel comprises experienced domain professionals; the comparison arms comprise JRS-naive recruits. Any difference between those groups confounds expertise with method and is uninterpretable. The only valid method comparison in this design is between the two randomized conditions in Section 6, which is reported there as a null. We state this explicitly because the panel's higher accuracy is the kind of number that invites exactly this misreading.</w:t>
+        <w:t xml:space="preserve">The expert panel and the randomized comparison are not compared to one another as a test of the standard.</w:t>
+      </w:r>
+      <w:r>
+        <w:t xml:space="preserve"> Both groups comprise experienced professionals in relevant domains, so the difference between them is not a difference in expertise; "JRS-naive" denotes no prior exposure to the method. What separates them is that the panel was recruited directly and was not randomized against the comparison arms, so any between-group difference reflects recruitment route and self-selection as well as method, and cannot carry a causal reading. The only valid method comparison in this design is between the two randomized conditions in Section 6, which is reported there as a null. Section 5.4 pools the two groups that applied the standard for a detection estimate only, which is a descriptive statement about detectability and not a comparison.</w:t>
+      </w:r>
+    </w:p>
+    <w:p>
+      <w:pPr>
+        <w:spacing w:after="140"/>
+      </w:pPr>
+      <w:r>
+        <w:rPr>
+          <w:b/>
+        </w:rPr>
+        <w:t xml:space="preserve">Both randomized arms were drawn from the same pool of experienced professionals, and that bounds what the comparison can show.</w:t>
+      </w:r>
+      <w:r>
+        <w:t xml:space="preserve"> A structured method has the most room to help a reviewer who would otherwise miss things. Testing it on professionals who already perform the task competently is the least favourable condition for detecting an effect, and it is the condition this trial ran under. The design cannot speak to the standard's value for less experienced reviewers, for reviewers working outside their domain, or for teams seeking consistency rather than peak accuracy, and those are the settings where a larger effect is plausible. A future trial that contrasts experienced and less experienced reviewers, each with and without the method, would be more informative than a larger version of this one.</w:t>
       </w:r>
     </w:p>
     <w:p>
@@ -1774,6 +2300,27 @@
       </w:r>
       <w:r>
         <w:t xml:space="preserve"> Gabriela Cortez is credited as a named panel reviewer and as the origin of the Section 2.1 argument in the Acknowledgments, at her preference; she is not a co-author at this time. Section 2.1 is retained in the paper's voice. The dual-role disclosure is removed as no longer applicable.</w:t>
+      </w:r>
+    </w:p>
+    <w:p>
+      <w:pPr>
+        <w:numPr>
+          <w:ilvl w:val="0"/>
+          <w:numId w:val="1"/>
+        </w:numPr>
+        <w:spacing w:after="60"/>
+      </w:pPr>
+      <w:r>
+        <w:t xml:space="preserve">2026-08-05: </w:t>
+      </w:r>
+      <w:r>
+        <w:rPr>
+          <w:b/>
+        </w:rPr>
+        <w:t xml:space="preserve">Reframed around the expert composition of both arms, without changing any figure or the null.</w:t>
+      </w:r>
+      <w:r>
+        <w:t xml:space="preserve"> Three substantive additions. (1) New Section 5.4 pools every reviewer who applied the five conditions, the panel plus the randomized standard arm, giving 81.3 percent across 21 reviewers and 504 graded reads (95 percent CI 71.8 to 90.9), which clears the pre-registered threshold on a base drawn through two independent recruitment routes; the subsection states in terms that this is a detection estimate and not a comparison, because those groups were not randomized against one another. (2) New Section 6.2 states that the unaided arm is a strong control rather than a weak one: those reviewers are experienced professionals who reached 69.3 percent with no method, above chance in their own right, and six of eleven met the 70 percent threshold unaided, so the instrument is being asked to improve on competent judgment that is already working, with roughly 30 points of headroom available. (3) Limitations corrected and extended: the previous text asserted that the panel and the comparison arms differ in expertise, which is not accurate, since all participants in both arms are experienced professionals and "JRS-naive" denotes no prior exposure to the method; the confound that remains is recruitment route and self-selection, not expertise, and the arms still cannot be compared causally. A design note was added recording that both randomized arms were drawn from the same expert pool, which bounds what the trial can show, and that the informative next trial varies reviewer experience rather than adding more experts to both arms. No accuracy figure, confidence interval, effect size, or power estimate was altered, and the pre-registered null stands as reported.</w:t>
       </w:r>
     </w:p>
     <w:p>

</xml_diff>

<commit_message>
Report reliability confidence intervals from the pre-registered script
</commit_message>
<xml_diff>
--- a/research/Detection_Article_v2_ExpertFocus.docx
+++ b/research/Detection_Article_v2_ExpertFocus.docx
@@ -224,7 +224,7 @@
         <w:t xml:space="preserve">Supporting results.</w:t>
       </w:r>
       <w:r>
-        <w:t xml:space="preserve"> Three AI systems from three different vendors applied the same review to the same records and agreed at a mean pairwise rate of 84 percent across 15 records, indicating consistent application at machine level, which is distinct from accuracy. Independent expert and trained-reviewer panels applied the five conditions to a shared 10-record set, reaching Gwet's AC1 of 0.74 and 0.63 respectively, in the substantial range and clearing the pre-registered floor; these reliability figures are interim, resting on 10 of approximately 26 pooled records.</w:t>
+        <w:t xml:space="preserve"> Three AI systems from three different vendors applied the same review to the same records and agreed at a mean pairwise rate of 84 percent across 15 records, indicating consistent application at machine level, which is distinct from accuracy. Independent expert and trained-reviewer panels applied the five conditions to a shared 10-record set, reaching Gwet's AC1 of 0.739 and 0.624 respectively, in the substantial range and clearing the pre-registered point floor of 0.61; the confidence intervals around both are wide and the plan's lower-bound criterion is not met, so these reliability figures are reported as interim, resting on 10 of approximately 26 pooled records.</w:t>
       </w:r>
     </w:p>
     <w:p>
@@ -1069,19 +1069,301 @@
         <w:rPr>
           <w:b/>
         </w:rPr>
-        <w:t xml:space="preserve">Gwet's AC1 of 0.74</w:t>
-      </w:r>
-      <w:r>
-        <w:t xml:space="preserve"> (0.739 to three decimals, mean pairwise raw agreement 83 percent), above the pre-registered point threshold of 0.61; trained reviewers reached </w:t>
-      </w:r>
-      <w:r>
-        <w:rPr>
-          <w:b/>
-        </w:rPr>
-        <w:t xml:space="preserve">0.62</w:t>
-      </w:r>
-      <w:r>
-        <w:t xml:space="preserve"> (0.624, mean pairwise raw agreement 63 percent). The determination distribution was skewed, and under that skew the marginal-sensitive coefficients diverge from AC1 as the analysis plan anticipated, which is the documented reason AC1 was pre-registered as primary.</w:t>
+        <w:t xml:space="preserve">Gwet's AC1 of 0.739</w:t>
+      </w:r>
+      <w:r>
+        <w:t xml:space="preserve"> (raw pairwise agreement 80.0 percent, 36 labels, mean 3.6 raters per record), above the pre-registered point threshold of 0.61; trained reviewers reached </w:t>
+      </w:r>
+      <w:r>
+        <w:rPr>
+          <w:b/>
+        </w:rPr>
+        <w:t xml:space="preserve">0.624</w:t>
+      </w:r>
+      <w:r>
+        <w:t xml:space="preserve"> (raw pairwise agreement 71.5 percent, 63 labels, mean 6.3 raters per record). The determination distribution was skewed, and under that skew the marginal-sensitive coefficients diverge from AC1 as the analysis plan anticipated, which is the documented reason AC1 was pre-registered as primary (experts: Krippendorff's alpha 0.617, Fleiss' kappa 0.646; trained: 0.340 and 0.285).</w:t>
+      </w:r>
+    </w:p>
+    <w:tbl>
+      <w:tblPr>
+        <w:tblStyle w:val="TableGrid"/>
+        <w:tblW w:w="9360" w:type="dxa"/>
+        <w:tblBorders>
+          <w:top w:val="single" w:sz="4" w:space="0" w:color="999999"/>
+          <w:left w:val="single" w:sz="4" w:space="0" w:color="999999"/>
+          <w:bottom w:val="single" w:sz="4" w:space="0" w:color="999999"/>
+          <w:right w:val="single" w:sz="4" w:space="0" w:color="999999"/>
+          <w:insideH w:val="single" w:sz="4" w:space="0" w:color="999999"/>
+          <w:insideV w:val="single" w:sz="4" w:space="0" w:color="999999"/>
+        </w:tblBorders>
+      </w:tblPr>
+      <w:tblGrid>
+        <w:gridCol w:w="1560"/>
+        <w:gridCol w:w="1560"/>
+        <w:gridCol w:w="1560"/>
+        <w:gridCol w:w="1560"/>
+        <w:gridCol w:w="1560"/>
+        <w:gridCol w:w="1560"/>
+      </w:tblGrid>
+      <w:tr>
+        <w:tc>
+          <w:tcPr>
+            <w:tcW w:w="1560" w:type="dxa"/>
+          </w:tcPr>
+          <w:p>
+            <w:pPr>
+              <w:spacing w:after="0"/>
+            </w:pPr>
+            <w:r>
+              <w:t xml:space="preserve">Panel</w:t>
+            </w:r>
+          </w:p>
+        </w:tc>
+        <w:tc>
+          <w:tcPr>
+            <w:tcW w:w="1560" w:type="dxa"/>
+          </w:tcPr>
+          <w:p>
+            <w:pPr>
+              <w:spacing w:after="0"/>
+            </w:pPr>
+            <w:r>
+              <w:t xml:space="preserve">Records</w:t>
+            </w:r>
+          </w:p>
+        </w:tc>
+        <w:tc>
+          <w:tcPr>
+            <w:tcW w:w="1560" w:type="dxa"/>
+          </w:tcPr>
+          <w:p>
+            <w:pPr>
+              <w:spacing w:after="0"/>
+            </w:pPr>
+            <w:r>
+              <w:t xml:space="preserve">Labels</w:t>
+            </w:r>
+          </w:p>
+        </w:tc>
+        <w:tc>
+          <w:tcPr>
+            <w:tcW w:w="1560" w:type="dxa"/>
+          </w:tcPr>
+          <w:p>
+            <w:pPr>
+              <w:spacing w:after="0"/>
+            </w:pPr>
+            <w:r>
+              <w:t xml:space="preserve">AC1</w:t>
+            </w:r>
+          </w:p>
+        </w:tc>
+        <w:tc>
+          <w:tcPr>
+            <w:tcW w:w="1560" w:type="dxa"/>
+          </w:tcPr>
+          <w:p>
+            <w:pPr>
+              <w:spacing w:after="0"/>
+            </w:pPr>
+            <w:r>
+              <w:t xml:space="preserve">95% CI (analytic)</w:t>
+            </w:r>
+          </w:p>
+        </w:tc>
+        <w:tc>
+          <w:tcPr>
+            <w:tcW w:w="1560" w:type="dxa"/>
+          </w:tcPr>
+          <w:p>
+            <w:pPr>
+              <w:spacing w:after="0"/>
+            </w:pPr>
+            <w:r>
+              <w:t xml:space="preserve">95% CI (bootstrap)</w:t>
+            </w:r>
+          </w:p>
+        </w:tc>
+      </w:tr>
+      <w:tr>
+        <w:tc>
+          <w:tcPr>
+            <w:tcW w:w="1560" w:type="dxa"/>
+          </w:tcPr>
+          <w:p>
+            <w:pPr>
+              <w:spacing w:after="0"/>
+            </w:pPr>
+            <w:r>
+              <w:t xml:space="preserve">Experts</w:t>
+            </w:r>
+          </w:p>
+        </w:tc>
+        <w:tc>
+          <w:tcPr>
+            <w:tcW w:w="1560" w:type="dxa"/>
+          </w:tcPr>
+          <w:p>
+            <w:pPr>
+              <w:spacing w:after="0"/>
+            </w:pPr>
+            <w:r>
+              <w:t xml:space="preserve">10</w:t>
+            </w:r>
+          </w:p>
+        </w:tc>
+        <w:tc>
+          <w:tcPr>
+            <w:tcW w:w="1560" w:type="dxa"/>
+          </w:tcPr>
+          <w:p>
+            <w:pPr>
+              <w:spacing w:after="0"/>
+            </w:pPr>
+            <w:r>
+              <w:t xml:space="preserve">36</w:t>
+            </w:r>
+          </w:p>
+        </w:tc>
+        <w:tc>
+          <w:tcPr>
+            <w:tcW w:w="1560" w:type="dxa"/>
+          </w:tcPr>
+          <w:p>
+            <w:pPr>
+              <w:spacing w:after="0"/>
+            </w:pPr>
+            <w:r>
+              <w:t xml:space="preserve">0.739</w:t>
+            </w:r>
+          </w:p>
+        </w:tc>
+        <w:tc>
+          <w:tcPr>
+            <w:tcW w:w="1560" w:type="dxa"/>
+          </w:tcPr>
+          <w:p>
+            <w:pPr>
+              <w:spacing w:after="0"/>
+            </w:pPr>
+            <w:r>
+              <w:t xml:space="preserve">0.402 to 1.000</w:t>
+            </w:r>
+          </w:p>
+        </w:tc>
+        <w:tc>
+          <w:tcPr>
+            <w:tcW w:w="1560" w:type="dxa"/>
+          </w:tcPr>
+          <w:p>
+            <w:pPr>
+              <w:spacing w:after="0"/>
+            </w:pPr>
+            <w:r>
+              <w:t xml:space="preserve">0.427 to 1.000</w:t>
+            </w:r>
+          </w:p>
+        </w:tc>
+      </w:tr>
+      <w:tr>
+        <w:tc>
+          <w:tcPr>
+            <w:tcW w:w="1560" w:type="dxa"/>
+          </w:tcPr>
+          <w:p>
+            <w:pPr>
+              <w:spacing w:after="0"/>
+            </w:pPr>
+            <w:r>
+              <w:t xml:space="preserve">Trained reviewers</w:t>
+            </w:r>
+          </w:p>
+        </w:tc>
+        <w:tc>
+          <w:tcPr>
+            <w:tcW w:w="1560" w:type="dxa"/>
+          </w:tcPr>
+          <w:p>
+            <w:pPr>
+              <w:spacing w:after="0"/>
+            </w:pPr>
+            <w:r>
+              <w:t xml:space="preserve">10</w:t>
+            </w:r>
+          </w:p>
+        </w:tc>
+        <w:tc>
+          <w:tcPr>
+            <w:tcW w:w="1560" w:type="dxa"/>
+          </w:tcPr>
+          <w:p>
+            <w:pPr>
+              <w:spacing w:after="0"/>
+            </w:pPr>
+            <w:r>
+              <w:t xml:space="preserve">63</w:t>
+            </w:r>
+          </w:p>
+        </w:tc>
+        <w:tc>
+          <w:tcPr>
+            <w:tcW w:w="1560" w:type="dxa"/>
+          </w:tcPr>
+          <w:p>
+            <w:pPr>
+              <w:spacing w:after="0"/>
+            </w:pPr>
+            <w:r>
+              <w:t xml:space="preserve">0.624</w:t>
+            </w:r>
+          </w:p>
+        </w:tc>
+        <w:tc>
+          <w:tcPr>
+            <w:tcW w:w="1560" w:type="dxa"/>
+          </w:tcPr>
+          <w:p>
+            <w:pPr>
+              <w:spacing w:after="0"/>
+            </w:pPr>
+            <w:r>
+              <w:t xml:space="preserve">0.253 to 0.994</w:t>
+            </w:r>
+          </w:p>
+        </w:tc>
+        <w:tc>
+          <w:tcPr>
+            <w:tcW w:w="1560" w:type="dxa"/>
+          </w:tcPr>
+          <w:p>
+            <w:pPr>
+              <w:spacing w:after="0"/>
+            </w:pPr>
+            <w:r>
+              <w:t xml:space="preserve">0.301 to 0.886</w:t>
+            </w:r>
+          </w:p>
+        </w:tc>
+      </w:tr>
+    </w:tbl>
+    <w:p>
+      <w:pPr/>
+      <w:r>
+        <w:t/>
+      </w:r>
+    </w:p>
+    <w:p>
+      <w:pPr>
+        <w:spacing w:after="140"/>
+      </w:pPr>
+      <w:r>
+        <w:rPr>
+          <w:b/>
+        </w:rPr>
+        <w:t xml:space="preserve">Both point estimates clear the pre-registered floor of 0.61. Neither clears the plan's secondary criterion that the lower confidence bound exceed 0.41</w:t>
+      </w:r>
+      <w:r>
+        <w:t xml:space="preserve">, on the analytic interval: experts fall on the boundary at 0.402 and pass it on the bootstrap interval at 0.427, while trained reviewers do not meet it on either. This is stated rather than omitted, and it is a direct consequence of estimating a coefficient from 10 records.</w:t>
       </w:r>
     </w:p>
     <w:p>
@@ -1095,7 +1377,7 @@
         <w:t xml:space="preserve">These reliability figures are interim.</w:t>
       </w:r>
       <w:r>
-        <w:t xml:space="preserve"> They rest on 10 records against a pre-registered pooled target of approximately 26, so the confidence intervals are wide and the plan's lower-bound criterion sits on the boundary. They are reported as an interim result and will be re-estimated at target.</w:t>
+        <w:t xml:space="preserve"> They rest on 10 records against a pre-registered pooled target of approximately 26, which is why the intervals above are as wide as they are. They are reported as an interim result and will be re-estimated at target, at which point the lower-bound criterion becomes a meaningful test rather than an artifact of sample size.</w:t>
       </w:r>
     </w:p>
     <w:p>
@@ -2300,6 +2582,45 @@
       </w:r>
       <w:r>
         <w:t xml:space="preserve"> Gabriela Cortez is credited as a named panel reviewer and as the origin of the Section 2.1 argument in the Acknowledgments, at her preference; she is not a co-author at this time. Section 2.1 is retained in the paper's voice. The dual-role disclosure is removed as no longer applicable.</w:t>
+      </w:r>
+    </w:p>
+    <w:p>
+      <w:pPr>
+        <w:numPr>
+          <w:ilvl w:val="0"/>
+          <w:numId w:val="1"/>
+        </w:numPr>
+        <w:spacing w:after="60"/>
+      </w:pPr>
+      <w:r>
+        <w:t xml:space="preserve">2026-08-05 (later): </w:t>
+      </w:r>
+      <w:r>
+        <w:rPr>
+          <w:b/>
+        </w:rPr>
+        <w:t xml:space="preserve">Reliability section rebuilt from the pre-registered script, with confidence intervals.</w:t>
+      </w:r>
+      <w:r>
+        <w:t xml:space="preserve"> The raw-agreement figures added earlier in the day came from an ad hoc pooled-pairs calculation and did not match </w:t>
+      </w:r>
+      <w:r>
+        <w:rPr>
+          <w:rFonts w:ascii="Consolas" w:hAnsi="Consolas"/>
+        </w:rPr>
+        <w:t xml:space="preserve">compute_ac1_ci.py</w:t>
+      </w:r>
+      <w:r>
+        <w:t xml:space="preserve">, which implements the pre-registered Gwet definition (per-record pairwise agreement averaged across records). Corrected to the script's values: experts raw 80.0 percent, trained 71.5 percent. AC1 point estimates are unchanged at 0.739 and 0.624. Confidence intervals are now reported for the first time, analytic and bootstrap, together with the secondary coefficients. </w:t>
+      </w:r>
+      <w:r>
+        <w:rPr>
+          <w:b/>
+        </w:rPr>
+        <w:t xml:space="preserve">Stated plainly in the paper: both point estimates clear the 0.61 floor, and neither clears the plan's secondary lower-bound criterion of 0.41 on the analytic interval</w:t>
+      </w:r>
+      <w:r>
+        <w:t xml:space="preserve"> (experts 0.402, on the boundary, and passing at 0.427 on the bootstrap interval; trained 0.253, failing on both). This is a consequence of estimating from 10 records against a target of about 26 and is presented as such rather than omitted.</w:t>
       </w:r>
     </w:p>
     <w:p>

</xml_diff>

<commit_message>
Move pooled analysis to Appendix A; accentuate panel and methodology contributions
</commit_message>
<xml_diff>
--- a/research/Detection_Article_v2_ExpertFocus.docx
+++ b/research/Detection_Article_v2_ExpertFocus.docx
@@ -742,6 +742,14 @@
       </w:pPr>
       <w:r>
         <w:t xml:space="preserve">5. Results: DRR is detectable</w:t>
+      </w:r>
+    </w:p>
+    <w:p>
+      <w:pPr>
+        <w:spacing w:after="140"/>
+      </w:pPr>
+      <w:r>
+        <w:t xml:space="preserve">Thirty-two experienced professionals across 11 countries and 5 continents contributed 768 graded reads to this study, unpaid and in a personal capacity, each working through a full 24-record corpus. Twenty-two of them individually met or exceeded the 70 percent detection threshold set before the data were seen, and 10 scored perfectly. What follows rests on that effort.</w:t>
       </w:r>
     </w:p>
     <w:p>
@@ -1056,6 +1064,14 @@
       </w:pPr>
       <w:r>
         <w:t xml:space="preserve">5.3 Supporting result: inter-rater reliability</w:t>
+      </w:r>
+    </w:p>
+    <w:p>
+      <w:pPr>
+        <w:spacing w:after="140"/>
+      </w:pPr>
+      <w:r>
+        <w:t xml:space="preserve">The reliability analysis follows the plan and the acceptance floors specified in advance by the study's methodology author, including the choice of Gwet's AC1 as the primary coefficient under an anticipated skewed determination distribution. That specification is doing real work here: the skew arrived as predicted, and the coefficient chosen before the data were seen is the one that handles it.</w:t>
       </w:r>
     </w:p>
     <w:p>
@@ -1371,6 +1387,14 @@
         <w:spacing w:after="140"/>
       </w:pPr>
       <w:r>
+        <w:t xml:space="preserve">Under the conventional Landis and Koch bands, the expert coefficient of 0.739 sits in the substantial range, and it was reached by independent professionals who had never discussed these records with one another.</w:t>
+      </w:r>
+    </w:p>
+    <w:p>
+      <w:pPr>
+        <w:spacing w:after="140"/>
+      </w:pPr>
+      <w:r>
         <w:rPr>
           <w:b/>
         </w:rPr>
@@ -1386,7 +1410,686 @@
         <w:spacing w:after="140"/>
       </w:pPr>
       <w:r>
-        <w:t xml:space="preserve">5.4 Detection across the full expert base</w:t>
+        <w:t xml:space="preserve">5.4 Consistency of the detection result across recruitment routes</w:t>
+      </w:r>
+    </w:p>
+    <w:p>
+      <w:pPr>
+        <w:spacing w:after="140"/>
+      </w:pPr>
+      <w:r>
+        <w:t xml:space="preserve">The detection finding does not rest on a single recruitment route. Reviewers who entered the study through the randomized comparison and applied the same five conditions to the same records reached comparable accuracy, and the combined figure across every reviewer who applied the standard is reported in Appendix A. That appendix is a descriptive statement about detectability across the full expert base; the causal question belongs to Section 6.</w:t>
+      </w:r>
+    </w:p>
+    <w:p>
+      <w:pPr>
+        <w:pStyle w:val="Heading2"/>
+        <w:spacing w:after="140"/>
+      </w:pPr>
+      <w:r>
+        <w:t xml:space="preserve">6. Secondary pre-registered analysis: does the standard improve on unaided judgment?</w:t>
+      </w:r>
+    </w:p>
+    <w:p>
+      <w:pPr>
+        <w:spacing w:after="140"/>
+      </w:pPr>
+      <w:r>
+        <w:t xml:space="preserve">A randomized comparison was built to isolate the value of the method itself. The participants are experienced professionals in the same domains as the panel, recruited separately and with no prior exposure to the standard; "JRS-naive" refers to that absence of exposure and not to any absence of expertise. Drawn from a single recruitment pool, they were randomly assigned, by a deterministic hash of their participant code and before they judged any record, to review the same 24 records either with the five conditions (standard condition) or with a single general question about adequacy of support (unaided condition).</w:t>
+      </w:r>
+    </w:p>
+    <w:p>
+      <w:pPr>
+        <w:pStyle w:val="Heading3"/>
+        <w:spacing w:after="140"/>
+      </w:pPr>
+      <w:r>
+        <w:t xml:space="preserve">6.1 Result</w:t>
+      </w:r>
+    </w:p>
+    <w:tbl>
+      <w:tblPr>
+        <w:tblStyle w:val="TableGrid"/>
+        <w:tblW w:w="9360" w:type="dxa"/>
+        <w:tblBorders>
+          <w:top w:val="single" w:sz="4" w:space="0" w:color="999999"/>
+          <w:left w:val="single" w:sz="4" w:space="0" w:color="999999"/>
+          <w:bottom w:val="single" w:sz="4" w:space="0" w:color="999999"/>
+          <w:right w:val="single" w:sz="4" w:space="0" w:color="999999"/>
+          <w:insideH w:val="single" w:sz="4" w:space="0" w:color="999999"/>
+          <w:insideV w:val="single" w:sz="4" w:space="0" w:color="999999"/>
+        </w:tblBorders>
+      </w:tblPr>
+      <w:tblGrid>
+        <w:gridCol w:w="3120"/>
+        <w:gridCol w:w="3120"/>
+        <w:gridCol w:w="3120"/>
+      </w:tblGrid>
+      <w:tr>
+        <w:tc>
+          <w:tcPr>
+            <w:tcW w:w="3120" w:type="dxa"/>
+          </w:tcPr>
+          <w:p>
+            <w:pPr>
+              <w:spacing w:after="0"/>
+            </w:pPr>
+            <w:r>
+              <w:t xml:space="preserve">Condition</w:t>
+            </w:r>
+          </w:p>
+        </w:tc>
+        <w:tc>
+          <w:tcPr>
+            <w:tcW w:w="3120" w:type="dxa"/>
+          </w:tcPr>
+          <w:p>
+            <w:pPr>
+              <w:spacing w:after="0"/>
+            </w:pPr>
+            <w:r>
+              <w:t xml:space="preserve">n</w:t>
+            </w:r>
+          </w:p>
+        </w:tc>
+        <w:tc>
+          <w:tcPr>
+            <w:tcW w:w="3120" w:type="dxa"/>
+          </w:tcPr>
+          <w:p>
+            <w:pPr>
+              <w:spacing w:after="0"/>
+            </w:pPr>
+            <w:r>
+              <w:t xml:space="preserve">Accuracy</w:t>
+            </w:r>
+          </w:p>
+        </w:tc>
+      </w:tr>
+      <w:tr>
+        <w:tc>
+          <w:tcPr>
+            <w:tcW w:w="3120" w:type="dxa"/>
+          </w:tcPr>
+          <w:p>
+            <w:pPr>
+              <w:spacing w:after="0"/>
+            </w:pPr>
+            <w:r>
+              <w:t xml:space="preserve">Standard condition</w:t>
+            </w:r>
+          </w:p>
+        </w:tc>
+        <w:tc>
+          <w:tcPr>
+            <w:tcW w:w="3120" w:type="dxa"/>
+          </w:tcPr>
+          <w:p>
+            <w:pPr>
+              <w:spacing w:after="0"/>
+            </w:pPr>
+            <w:r>
+              <w:t xml:space="preserve">5</w:t>
+            </w:r>
+          </w:p>
+        </w:tc>
+        <w:tc>
+          <w:tcPr>
+            <w:tcW w:w="3120" w:type="dxa"/>
+          </w:tcPr>
+          <w:p>
+            <w:pPr>
+              <w:spacing w:after="0"/>
+            </w:pPr>
+            <w:r>
+              <w:t xml:space="preserve">73.3%</w:t>
+            </w:r>
+          </w:p>
+        </w:tc>
+      </w:tr>
+      <w:tr>
+        <w:tc>
+          <w:tcPr>
+            <w:tcW w:w="3120" w:type="dxa"/>
+          </w:tcPr>
+          <w:p>
+            <w:pPr>
+              <w:spacing w:after="0"/>
+            </w:pPr>
+            <w:r>
+              <w:t xml:space="preserve">Unaided condition</w:t>
+            </w:r>
+          </w:p>
+        </w:tc>
+        <w:tc>
+          <w:tcPr>
+            <w:tcW w:w="3120" w:type="dxa"/>
+          </w:tcPr>
+          <w:p>
+            <w:pPr>
+              <w:spacing w:after="0"/>
+            </w:pPr>
+            <w:r>
+              <w:t xml:space="preserve">11</w:t>
+            </w:r>
+          </w:p>
+        </w:tc>
+        <w:tc>
+          <w:tcPr>
+            <w:tcW w:w="3120" w:type="dxa"/>
+          </w:tcPr>
+          <w:p>
+            <w:pPr>
+              <w:spacing w:after="0"/>
+            </w:pPr>
+            <w:r>
+              <w:t xml:space="preserve">69.3%</w:t>
+            </w:r>
+          </w:p>
+        </w:tc>
+      </w:tr>
+      <w:tr>
+        <w:tc>
+          <w:tcPr>
+            <w:tcW w:w="3120" w:type="dxa"/>
+          </w:tcPr>
+          <w:p>
+            <w:pPr>
+              <w:spacing w:after="0"/>
+            </w:pPr>
+            <w:r>
+              <w:rPr>
+                <w:b/>
+              </w:rPr>
+              <w:t xml:space="preserve">Difference</w:t>
+            </w:r>
+          </w:p>
+        </w:tc>
+        <w:tc>
+          <w:tcPr>
+            <w:tcW w:w="3120" w:type="dxa"/>
+          </w:tcPr>
+          <w:p>
+            <w:pPr>
+              <w:spacing w:after="0"/>
+            </w:pPr>
+            <w:r>
+              <w:t/>
+            </w:r>
+          </w:p>
+        </w:tc>
+        <w:tc>
+          <w:tcPr>
+            <w:tcW w:w="3120" w:type="dxa"/>
+          </w:tcPr>
+          <w:p>
+            <w:pPr>
+              <w:spacing w:after="0"/>
+            </w:pPr>
+            <w:r>
+              <w:rPr>
+                <w:b/>
+              </w:rPr>
+              <w:t xml:space="preserve">+4.0 pp</w:t>
+            </w:r>
+          </w:p>
+        </w:tc>
+      </w:tr>
+    </w:tbl>
+    <w:p>
+      <w:pPr/>
+      <w:r>
+        <w:t/>
+      </w:r>
+    </w:p>
+    <w:p>
+      <w:pPr>
+        <w:spacing w:after="140"/>
+      </w:pPr>
+      <w:r>
+        <w:t xml:space="preserve">The difference favors the standard. It is </w:t>
+      </w:r>
+      <w:r>
+        <w:rPr>
+          <w:b/>
+        </w:rPr>
+        <w:t xml:space="preserve">not statistically distinguishable from zero</w:t>
+      </w:r>
+      <w:r>
+        <w:t xml:space="preserve">: participant-level bootstrap 95 percent CI of the difference is -19.9 to +28.8 percentage points, Welch t = 0.30 on 11.3 degrees of freedom. </w:t>
+      </w:r>
+      <w:r>
+        <w:rPr>
+          <w:b/>
+        </w:rPr>
+        <w:t xml:space="preserve">Under the pre-registered decision rule, this analysis is reported as a null.</w:t>
+      </w:r>
+      <w:r>
+        <w:t xml:space="preserve"> The standard is not shown to improve on unaided judgment by this study.</w:t>
+      </w:r>
+    </w:p>
+    <w:p>
+      <w:pPr>
+        <w:pStyle w:val="Heading3"/>
+        <w:spacing w:after="140"/>
+      </w:pPr>
+      <w:r>
+        <w:t xml:space="preserve">6.2 The comparison is a hard test, and the baseline is strong</w:t>
+      </w:r>
+    </w:p>
+    <w:p>
+      <w:pPr>
+        <w:spacing w:after="140"/>
+      </w:pPr>
+      <w:r>
+        <w:t xml:space="preserve">Two features of the design bound how large an effect this comparison could ever have shown.</w:t>
+      </w:r>
+    </w:p>
+    <w:p>
+      <w:pPr>
+        <w:spacing w:after="140"/>
+      </w:pPr>
+      <w:r>
+        <w:t xml:space="preserve">First, </w:t>
+      </w:r>
+      <w:r>
+        <w:rPr>
+          <w:b/>
+        </w:rPr>
+        <w:t xml:space="preserve">the unaided arm is not a weak control.</w:t>
+      </w:r>
+      <w:r>
+        <w:t xml:space="preserve"> Those reviewers are experienced professionals reading records without the five conditions, and they detected unreconstructable records at 69.3 percent, above chance in their own right (one-sample t = 2.06 on 10 degrees of freedom). Six of the 11 met the 70 percent threshold with no method at all. A structured instrument is being asked to improve on competent professional judgment that is already working, which is the most demanding contrast available and the least likely to produce a large margin.</w:t>
+      </w:r>
+    </w:p>
+    <w:p>
+      <w:pPr>
+        <w:spacing w:after="140"/>
+      </w:pPr>
+      <w:r>
+        <w:t xml:space="preserve">Second, </w:t>
+      </w:r>
+      <w:r>
+        <w:rPr>
+          <w:b/>
+        </w:rPr>
+        <w:t xml:space="preserve">the ceiling is close.</w:t>
+      </w:r>
+      <w:r>
+        <w:t xml:space="preserve"> With a strong baseline near 70 percent and a practical ceiling at 100, the space available for the method to demonstrate value is roughly 30 points wide, and a difference of the size a small trial can detect consumes most of it.</w:t>
+      </w:r>
+    </w:p>
+    <w:p>
+      <w:pPr>
+        <w:spacing w:after="140"/>
+      </w:pPr>
+      <w:r>
+        <w:t xml:space="preserve">Neither point rescues the result, and neither is offered as one. They explain why a null here is weaker evidence against the standard than a null from a trial with a naive control would be, and they set up the design question in Section 8: the informative next trial varies reviewer experience, rather than adding more experts to both arms.</w:t>
+      </w:r>
+    </w:p>
+    <w:p>
+      <w:pPr>
+        <w:pStyle w:val="Heading3"/>
+        <w:spacing w:after="140"/>
+      </w:pPr>
+      <w:r>
+        <w:t xml:space="preserve">6.3 Why the analysis was underpowered, stated precisely</w:t>
+      </w:r>
+    </w:p>
+    <w:p>
+      <w:pPr>
+        <w:spacing w:after="140"/>
+      </w:pPr>
+      <w:r>
+        <w:t xml:space="preserve">The observed effect is Cohen's d = 0.140 (pooled sd 28.6). At the sample reached, the smallest difference the comparison could have detected at 80 percent power was approximately 43 percentage points. </w:t>
+      </w:r>
+      <w:r>
+        <w:rPr>
+          <w:b/>
+        </w:rPr>
+        <w:t xml:space="preserve">The comparison was never capable of detecting an effect of the size that appears to be present.</w:t>
+      </w:r>
+    </w:p>
+    <w:p>
+      <w:pPr>
+        <w:spacing w:after="140"/>
+      </w:pPr>
+      <w:r>
+        <w:t xml:space="preserve">This is a statement about the design, not about the standard. A null from an underpowered test is uninformative about the underlying effect, and we decline to interpret it in either direction.</w:t>
+      </w:r>
+    </w:p>
+    <w:p>
+      <w:pPr>
+        <w:pStyle w:val="Heading3"/>
+        <w:spacing w:after="140"/>
+      </w:pPr>
+      <w:r>
+        <w:t xml:space="preserve">6.4 Effect-size estimate for a conclusive trial</w:t>
+      </w:r>
+    </w:p>
+    <w:p>
+      <w:pPr>
+        <w:spacing w:after="140"/>
+      </w:pPr>
+      <w:r>
+        <w:t xml:space="preserve">The value this analysis does deliver is a defensible effect-size estimate for designing a properly powered replication:</w:t>
+      </w:r>
+    </w:p>
+    <w:tbl>
+      <w:tblPr>
+        <w:tblStyle w:val="TableGrid"/>
+        <w:tblW w:w="9360" w:type="dxa"/>
+        <w:tblBorders>
+          <w:top w:val="single" w:sz="4" w:space="0" w:color="999999"/>
+          <w:left w:val="single" w:sz="4" w:space="0" w:color="999999"/>
+          <w:bottom w:val="single" w:sz="4" w:space="0" w:color="999999"/>
+          <w:right w:val="single" w:sz="4" w:space="0" w:color="999999"/>
+          <w:insideH w:val="single" w:sz="4" w:space="0" w:color="999999"/>
+          <w:insideV w:val="single" w:sz="4" w:space="0" w:color="999999"/>
+        </w:tblBorders>
+      </w:tblPr>
+      <w:tblGrid>
+        <w:gridCol w:w="4680"/>
+        <w:gridCol w:w="4680"/>
+      </w:tblGrid>
+      <w:tr>
+        <w:tc>
+          <w:tcPr>
+            <w:tcW w:w="4680" w:type="dxa"/>
+          </w:tcPr>
+          <w:p>
+            <w:pPr>
+              <w:spacing w:after="0"/>
+            </w:pPr>
+            <w:r>
+              <w:t xml:space="preserve">Target</w:t>
+            </w:r>
+          </w:p>
+        </w:tc>
+        <w:tc>
+          <w:tcPr>
+            <w:tcW w:w="4680" w:type="dxa"/>
+          </w:tcPr>
+          <w:p>
+            <w:pPr>
+              <w:spacing w:after="0"/>
+            </w:pPr>
+            <w:r>
+              <w:t xml:space="preserve">Completers required per condition</w:t>
+            </w:r>
+          </w:p>
+        </w:tc>
+      </w:tr>
+      <w:tr>
+        <w:tc>
+          <w:tcPr>
+            <w:tcW w:w="4680" w:type="dxa"/>
+          </w:tcPr>
+          <w:p>
+            <w:pPr>
+              <w:spacing w:after="0"/>
+            </w:pPr>
+            <w:r>
+              <w:t xml:space="preserve">80 percent power, alpha .05</w:t>
+            </w:r>
+          </w:p>
+        </w:tc>
+        <w:tc>
+          <w:tcPr>
+            <w:tcW w:w="4680" w:type="dxa"/>
+          </w:tcPr>
+          <w:p>
+            <w:pPr>
+              <w:spacing w:after="0"/>
+            </w:pPr>
+            <w:r>
+              <w:t xml:space="preserve">approximately 800</w:t>
+            </w:r>
+          </w:p>
+        </w:tc>
+      </w:tr>
+      <w:tr>
+        <w:tc>
+          <w:tcPr>
+            <w:tcW w:w="4680" w:type="dxa"/>
+          </w:tcPr>
+          <w:p>
+            <w:pPr>
+              <w:spacing w:after="0"/>
+            </w:pPr>
+            <w:r>
+              <w:t xml:space="preserve">90 percent power, alpha .05</w:t>
+            </w:r>
+          </w:p>
+        </w:tc>
+        <w:tc>
+          <w:tcPr>
+            <w:tcW w:w="4680" w:type="dxa"/>
+          </w:tcPr>
+          <w:p>
+            <w:pPr>
+              <w:spacing w:after="0"/>
+            </w:pPr>
+            <w:r>
+              <w:t xml:space="preserve">approximately 1,070</w:t>
+            </w:r>
+          </w:p>
+        </w:tc>
+      </w:tr>
+    </w:tbl>
+    <w:p>
+      <w:pPr/>
+      <w:r>
+        <w:t/>
+      </w:r>
+    </w:p>
+    <w:p>
+      <w:pPr>
+        <w:spacing w:after="140"/>
+      </w:pPr>
+      <w:r>
+        <w:t xml:space="preserve">We report this specification so that a future trial, whether ours or another group's, can be sized correctly at the outset rather than discovering its limits afterward.</w:t>
+      </w:r>
+    </w:p>
+    <w:p>
+      <w:pPr>
+        <w:pStyle w:val="Heading2"/>
+        <w:spacing w:after="140"/>
+      </w:pPr>
+      <w:r>
+        <w:t xml:space="preserve">7. Discussion</w:t>
+      </w:r>
+    </w:p>
+    <w:p>
+      <w:pPr>
+        <w:spacing w:after="140"/>
+      </w:pPr>
+      <w:r>
+        <w:rPr>
+          <w:b/>
+        </w:rPr>
+        <w:t xml:space="preserve">The primary contribution is that DRR is detectable.</w:t>
+      </w:r>
+      <w:r>
+        <w:t xml:space="preserve"> This is the precondition for everything downstream. A documentation property that experienced reviewers cannot identify is not a governable property, and any control built on human review of it would be unfounded. The panel result establishes that the property is real, visible, and identifiable at a rate well above chance by professionals from a wide range of jurisdictions and first languages.</w:t>
+      </w:r>
+    </w:p>
+    <w:p>
+      <w:pPr>
+        <w:spacing w:after="140"/>
+      </w:pPr>
+      <w:r>
+        <w:rPr>
+          <w:b/>
+        </w:rPr>
+        <w:t xml:space="preserve">Detection is not the same as remediation.</w:t>
+      </w:r>
+      <w:r>
+        <w:t xml:space="preserve"> Establishing that reviewers can identify unreconstructable records leaves open whether a structured method helps them do it better, faster, or more consistently than unaided judgment. That question is genuinely open, and Section 6 reports honestly that this study could not settle it.</w:t>
+      </w:r>
+    </w:p>
+    <w:p>
+      <w:pPr>
+        <w:spacing w:after="140"/>
+      </w:pPr>
+      <w:r>
+        <w:rPr>
+          <w:b/>
+        </w:rPr>
+        <w:t xml:space="preserve">An observation, exploratory and not pre-registered.</w:t>
+      </w:r>
+      <w:r>
+        <w:t xml:space="preserve"> Dispersion in accuracy differed markedly between conditions in the secondary analysis. Reviewers using the five conditions clustered more tightly (sd 21.2) than reviewers working unaided (sd 34.0), and the unaided distribution was bimodal, with several participants scoring near-perfectly and several below chance, and few in between. A plausible mechanism is that an unaided reviewer must invent a threshold, and private thresholds vary widely, while explicit conditions constrain the space of reasonable readings. We flag this because it suggests that variance reduction, rather than mean improvement, may be the more important effect to test. It is not established here: the formal tests of the variance difference are not significant, and the observation is post-hoc. A dedicated, pre-registered test would be required.</w:t>
+      </w:r>
+    </w:p>
+    <w:p>
+      <w:pPr>
+        <w:spacing w:after="140"/>
+      </w:pPr>
+      <w:r>
+        <w:rPr>
+          <w:b/>
+        </w:rPr>
+        <w:t xml:space="preserve">Practical implication.</w:t>
+      </w:r>
+      <w:r>
+        <w:t xml:space="preserve"> For an organization, a review process in which some reviewers are highly accurate and others perform below chance is difficult to manage even when the average is acceptable, because the variance is invisible at the point of use. If a structured standard narrows that spread, the operational value may exceed what a comparison of means would capture.</w:t>
+      </w:r>
+    </w:p>
+    <w:p>
+      <w:pPr>
+        <w:spacing w:after="140"/>
+      </w:pPr>
+      <w:r>
+        <w:rPr>
+          <w:b/>
+        </w:rPr>
+        <w:t xml:space="preserve">What the study supports, stated in full.</w:t>
+      </w:r>
+      <w:r>
+        <w:t xml:space="preserve"> Decision Reconstruction Risk is detectable by experienced professionals: 83.9 percent in the panel, 81.3 percent across all 21 reviewers who applied the standard through two separate recruitment routes, both clearing a threshold fixed before the data were seen. The review is applied consistently by independent machines at 84 percent cross-vendor agreement and by independent human experts at AC1 0.74, interim. What the study does not support is a claim that the method improves on the unaided judgment of an already expert reviewer; the randomized test of that question returned a null, and it was run under the least favourable conditions for finding an effect. Those two statements sit together without tension. A property can be real, visible, and worth building controls around before anyone has shown that a particular instrument improves on expert intuition at detecting it.</w:t>
+      </w:r>
+    </w:p>
+    <w:p>
+      <w:pPr>
+        <w:pStyle w:val="Heading2"/>
+        <w:spacing w:after="140"/>
+      </w:pPr>
+      <w:r>
+        <w:t xml:space="preserve">8. Limitations</w:t>
+      </w:r>
+    </w:p>
+    <w:p>
+      <w:pPr>
+        <w:spacing w:after="140"/>
+      </w:pPr>
+      <w:r>
+        <w:t xml:space="preserve">The corpus is constructed rather than drawn from live records, which supports a clean detection test but does not establish real-world effectiveness; criterion validity against documented real-case outcomes is a separate line of work.</w:t>
+      </w:r>
+    </w:p>
+    <w:p>
+      <w:pPr>
+        <w:spacing w:after="140"/>
+      </w:pPr>
+      <w:r>
+        <w:t xml:space="preserve">The panel is recruited, not sampled, and self-selects for interest in the topic. Generalization beyond the sampled domains and jurisdictions is not claimed.</w:t>
+      </w:r>
+    </w:p>
+    <w:p>
+      <w:pPr>
+        <w:spacing w:after="140"/>
+      </w:pPr>
+      <w:r>
+        <w:rPr>
+          <w:b/>
+        </w:rPr>
+        <w:t xml:space="preserve">The expert panel and the randomized comparison are not compared to one another as a test of the standard.</w:t>
+      </w:r>
+      <w:r>
+        <w:t xml:space="preserve"> Both groups comprise experienced professionals in relevant domains, so the difference between them is not a difference in expertise; "JRS-naive" denotes no prior exposure to the method. What separates them is that the panel was recruited directly and was not randomized against the comparison arms, so any between-group difference reflects recruitment route and self-selection as well as method, and cannot carry a causal reading. The only valid method comparison in this design is between the two randomized conditions in Section 6, which is reported there as a null. Section 5.4 pools the two groups that applied the standard for a detection estimate only, which is a descriptive statement about detectability and not a comparison.</w:t>
+      </w:r>
+    </w:p>
+    <w:p>
+      <w:pPr>
+        <w:spacing w:after="140"/>
+      </w:pPr>
+      <w:r>
+        <w:rPr>
+          <w:b/>
+        </w:rPr>
+        <w:t xml:space="preserve">Both randomized arms were drawn from the same pool of experienced professionals, and that bounds what the comparison can show.</w:t>
+      </w:r>
+      <w:r>
+        <w:t xml:space="preserve"> A structured method has the most room to help a reviewer who would otherwise miss things. Testing it on professionals who already perform the task competently is the least favourable condition for detecting an effect, and it is the condition this trial ran under. The design cannot speak to the standard's value for less experienced reviewers, for reviewers working outside their domain, or for teams seeking consistency rather than peak accuracy, and those are the settings where a larger effect is plausible. A future trial that contrasts experienced and less experienced reviewers, each with and without the method, would be more informative than a larger version of this one.</w:t>
+      </w:r>
+    </w:p>
+    <w:p>
+      <w:pPr>
+        <w:spacing w:after="140"/>
+      </w:pPr>
+      <w:r>
+        <w:t xml:space="preserve">Reviewer accuracy varied widely, including two panel members scoring below chance. Response patterns were examined and showed genuine discrimination rather than straight-lining or missing data, so these are treated as real observations and retained.</w:t>
+      </w:r>
+    </w:p>
+    <w:p>
+      <w:pPr>
+        <w:spacing w:after="140"/>
+      </w:pPr>
+      <w:r>
+        <w:t xml:space="preserve">Reliability figures are interim on 10 of approximately 26 pooled records. JRS remains in a validation phase and makes no proven-effectiveness claim.</w:t>
+      </w:r>
+    </w:p>
+    <w:p>
+      <w:pPr>
+        <w:pStyle w:val="Heading2"/>
+        <w:spacing w:after="140"/>
+      </w:pPr>
+      <w:r>
+        <w:t xml:space="preserve">9. Conclusion</w:t>
+      </w:r>
+    </w:p>
+    <w:p>
+      <w:pPr>
+        <w:spacing w:after="140"/>
+      </w:pPr>
+      <w:r>
+        <w:t xml:space="preserve">The drafting tool and the technology stack will keep changing. The evidentiary test does not. A record that cannot be reconstructed from its own contents cannot be independently defended, whoever or whatever produced it.</w:t>
+      </w:r>
+    </w:p>
+    <w:p>
+      <w:pPr>
+        <w:spacing w:after="140"/>
+      </w:pPr>
+      <w:r>
+        <w:t xml:space="preserve">This paper establishes that Decision Reconstruction Risk is detectable: an international panel of experienced professionals, reading records cold and blind to a verified key, identified unreconstructable records at 83.9 percent accuracy, clearing a threshold set before the data were seen. It further establishes that the review can be applied consistently by independent machines and by independent human experts.</w:t>
+      </w:r>
+    </w:p>
+    <w:p>
+      <w:pPr>
+        <w:spacing w:after="140"/>
+      </w:pPr>
+      <w:r>
+        <w:t xml:space="preserve">Whether a structured standard improves on unaided professional judgment remains open. We report the attempt, the null, and the sample size a conclusive answer would require. The property is real and measurable; sizing the control's added value is the next study, and it can now be designed properly.</w:t>
+      </w:r>
+    </w:p>
+    <w:p>
+      <w:pPr>
+        <w:pStyle w:val="Heading2"/>
+        <w:spacing w:after="140"/>
+      </w:pPr>
+      <w:r>
+        <w:t xml:space="preserve">Appendix A. Detection across the full expert base</w:t>
+      </w:r>
+    </w:p>
+    <w:p>
+      <w:pPr>
+        <w:spacing w:after="140"/>
+      </w:pPr>
+      <w:r>
+        <w:rPr>
+          <w:i/>
+        </w:rPr>
+        <w:t xml:space="preserve">Placed in an appendix because it combines groups that were not randomized against one another. It is reported for completeness as a descriptive detection estimate and carries no causal reading.</w:t>
       </w:r>
     </w:p>
     <w:p>
@@ -1802,468 +2505,71 @@
         <w:spacing w:after="140"/>
       </w:pPr>
       <w:r>
-        <w:t xml:space="preserve">6. Secondary pre-registered analysis: does the standard improve on unaided judgment?</w:t>
-      </w:r>
-    </w:p>
-    <w:p>
-      <w:pPr>
-        <w:spacing w:after="140"/>
-      </w:pPr>
-      <w:r>
-        <w:t xml:space="preserve">A randomized comparison was built to isolate the value of the method itself. The participants are experienced professionals in the same domains as the panel, recruited separately and with no prior exposure to the standard; "JRS-naive" refers to that absence of exposure and not to any absence of expertise. Drawn from a single recruitment pool, they were randomly assigned, by a deterministic hash of their participant code and before they judged any record, to review the same 24 records either with the five conditions (standard condition) or with a single general question about adequacy of support (unaided condition).</w:t>
-      </w:r>
-    </w:p>
-    <w:p>
-      <w:pPr>
-        <w:pStyle w:val="Heading3"/>
-        <w:spacing w:after="140"/>
-      </w:pPr>
-      <w:r>
-        <w:t xml:space="preserve">6.1 Result</w:t>
-      </w:r>
-    </w:p>
-    <w:tbl>
-      <w:tblPr>
-        <w:tblStyle w:val="TableGrid"/>
-        <w:tblW w:w="9360" w:type="dxa"/>
-        <w:tblBorders>
-          <w:top w:val="single" w:sz="4" w:space="0" w:color="999999"/>
-          <w:left w:val="single" w:sz="4" w:space="0" w:color="999999"/>
-          <w:bottom w:val="single" w:sz="4" w:space="0" w:color="999999"/>
-          <w:right w:val="single" w:sz="4" w:space="0" w:color="999999"/>
-          <w:insideH w:val="single" w:sz="4" w:space="0" w:color="999999"/>
-          <w:insideV w:val="single" w:sz="4" w:space="0" w:color="999999"/>
-        </w:tblBorders>
-      </w:tblPr>
-      <w:tblGrid>
-        <w:gridCol w:w="3120"/>
-        <w:gridCol w:w="3120"/>
-        <w:gridCol w:w="3120"/>
-      </w:tblGrid>
-      <w:tr>
-        <w:tc>
-          <w:tcPr>
-            <w:tcW w:w="3120" w:type="dxa"/>
-          </w:tcPr>
-          <w:p>
-            <w:pPr>
-              <w:spacing w:after="0"/>
-            </w:pPr>
-            <w:r>
-              <w:t xml:space="preserve">Condition</w:t>
-            </w:r>
-          </w:p>
-        </w:tc>
-        <w:tc>
-          <w:tcPr>
-            <w:tcW w:w="3120" w:type="dxa"/>
-          </w:tcPr>
-          <w:p>
-            <w:pPr>
-              <w:spacing w:after="0"/>
-            </w:pPr>
-            <w:r>
-              <w:t xml:space="preserve">n</w:t>
-            </w:r>
-          </w:p>
-        </w:tc>
-        <w:tc>
-          <w:tcPr>
-            <w:tcW w:w="3120" w:type="dxa"/>
-          </w:tcPr>
-          <w:p>
-            <w:pPr>
-              <w:spacing w:after="0"/>
-            </w:pPr>
-            <w:r>
-              <w:t xml:space="preserve">Accuracy</w:t>
-            </w:r>
-          </w:p>
-        </w:tc>
-      </w:tr>
-      <w:tr>
-        <w:tc>
-          <w:tcPr>
-            <w:tcW w:w="3120" w:type="dxa"/>
-          </w:tcPr>
-          <w:p>
-            <w:pPr>
-              <w:spacing w:after="0"/>
-            </w:pPr>
-            <w:r>
-              <w:t xml:space="preserve">Standard condition</w:t>
-            </w:r>
-          </w:p>
-        </w:tc>
-        <w:tc>
-          <w:tcPr>
-            <w:tcW w:w="3120" w:type="dxa"/>
-          </w:tcPr>
-          <w:p>
-            <w:pPr>
-              <w:spacing w:after="0"/>
-            </w:pPr>
-            <w:r>
-              <w:t xml:space="preserve">5</w:t>
-            </w:r>
-          </w:p>
-        </w:tc>
-        <w:tc>
-          <w:tcPr>
-            <w:tcW w:w="3120" w:type="dxa"/>
-          </w:tcPr>
-          <w:p>
-            <w:pPr>
-              <w:spacing w:after="0"/>
-            </w:pPr>
-            <w:r>
-              <w:t xml:space="preserve">73.3%</w:t>
-            </w:r>
-          </w:p>
-        </w:tc>
-      </w:tr>
-      <w:tr>
-        <w:tc>
-          <w:tcPr>
-            <w:tcW w:w="3120" w:type="dxa"/>
-          </w:tcPr>
-          <w:p>
-            <w:pPr>
-              <w:spacing w:after="0"/>
-            </w:pPr>
-            <w:r>
-              <w:t xml:space="preserve">Unaided condition</w:t>
-            </w:r>
-          </w:p>
-        </w:tc>
-        <w:tc>
-          <w:tcPr>
-            <w:tcW w:w="3120" w:type="dxa"/>
-          </w:tcPr>
-          <w:p>
-            <w:pPr>
-              <w:spacing w:after="0"/>
-            </w:pPr>
-            <w:r>
-              <w:t xml:space="preserve">11</w:t>
-            </w:r>
-          </w:p>
-        </w:tc>
-        <w:tc>
-          <w:tcPr>
-            <w:tcW w:w="3120" w:type="dxa"/>
-          </w:tcPr>
-          <w:p>
-            <w:pPr>
-              <w:spacing w:after="0"/>
-            </w:pPr>
-            <w:r>
-              <w:t xml:space="preserve">69.3%</w:t>
-            </w:r>
-          </w:p>
-        </w:tc>
-      </w:tr>
-      <w:tr>
-        <w:tc>
-          <w:tcPr>
-            <w:tcW w:w="3120" w:type="dxa"/>
-          </w:tcPr>
-          <w:p>
-            <w:pPr>
-              <w:spacing w:after="0"/>
-            </w:pPr>
-            <w:r>
-              <w:rPr>
-                <w:b/>
-              </w:rPr>
-              <w:t xml:space="preserve">Difference</w:t>
-            </w:r>
-          </w:p>
-        </w:tc>
-        <w:tc>
-          <w:tcPr>
-            <w:tcW w:w="3120" w:type="dxa"/>
-          </w:tcPr>
-          <w:p>
-            <w:pPr>
-              <w:spacing w:after="0"/>
-            </w:pPr>
-            <w:r>
-              <w:t/>
-            </w:r>
-          </w:p>
-        </w:tc>
-        <w:tc>
-          <w:tcPr>
-            <w:tcW w:w="3120" w:type="dxa"/>
-          </w:tcPr>
-          <w:p>
-            <w:pPr>
-              <w:spacing w:after="0"/>
-            </w:pPr>
-            <w:r>
-              <w:rPr>
-                <w:b/>
-              </w:rPr>
-              <w:t xml:space="preserve">+4.0 pp</w:t>
-            </w:r>
-          </w:p>
-        </w:tc>
-      </w:tr>
-    </w:tbl>
-    <w:p>
-      <w:pPr/>
-      <w:r>
-        <w:t/>
-      </w:r>
-    </w:p>
-    <w:p>
-      <w:pPr>
-        <w:spacing w:after="140"/>
-      </w:pPr>
-      <w:r>
-        <w:t xml:space="preserve">The difference favors the standard. It is </w:t>
-      </w:r>
-      <w:r>
-        <w:rPr>
-          <w:b/>
-        </w:rPr>
-        <w:t xml:space="preserve">not statistically distinguishable from zero</w:t>
-      </w:r>
-      <w:r>
-        <w:t xml:space="preserve">: participant-level bootstrap 95 percent CI of the difference is -19.9 to +28.8 percentage points, Welch t = 0.30 on 11.3 degrees of freedom. </w:t>
-      </w:r>
-      <w:r>
-        <w:rPr>
-          <w:b/>
-        </w:rPr>
-        <w:t xml:space="preserve">Under the pre-registered decision rule, this analysis is reported as a null.</w:t>
-      </w:r>
-      <w:r>
-        <w:t xml:space="preserve"> The standard is not shown to improve on unaided judgment by this study.</w:t>
-      </w:r>
-    </w:p>
-    <w:p>
-      <w:pPr>
-        <w:pStyle w:val="Heading3"/>
-        <w:spacing w:after="140"/>
-      </w:pPr>
-      <w:r>
-        <w:t xml:space="preserve">6.2 The comparison is a hard test, and the baseline is strong</w:t>
-      </w:r>
-    </w:p>
-    <w:p>
-      <w:pPr>
-        <w:spacing w:after="140"/>
-      </w:pPr>
-      <w:r>
-        <w:t xml:space="preserve">Two features of the design bound how large an effect this comparison could ever have shown.</w:t>
-      </w:r>
-    </w:p>
-    <w:p>
-      <w:pPr>
-        <w:spacing w:after="140"/>
-      </w:pPr>
-      <w:r>
-        <w:t xml:space="preserve">First, </w:t>
-      </w:r>
-      <w:r>
-        <w:rPr>
-          <w:b/>
-        </w:rPr>
-        <w:t xml:space="preserve">the unaided arm is not a weak control.</w:t>
-      </w:r>
-      <w:r>
-        <w:t xml:space="preserve"> Those reviewers are experienced professionals reading records without the five conditions, and they detected unreconstructable records at 69.3 percent, above chance in their own right (one-sample t = 2.06 on 10 degrees of freedom). Six of the 11 met the 70 percent threshold with no method at all. A structured instrument is being asked to improve on competent professional judgment that is already working, which is the most demanding contrast available and the least likely to produce a large margin.</w:t>
-      </w:r>
-    </w:p>
-    <w:p>
-      <w:pPr>
-        <w:spacing w:after="140"/>
-      </w:pPr>
-      <w:r>
-        <w:t xml:space="preserve">Second, </w:t>
-      </w:r>
-      <w:r>
-        <w:rPr>
-          <w:b/>
-        </w:rPr>
-        <w:t xml:space="preserve">the ceiling is close.</w:t>
-      </w:r>
-      <w:r>
-        <w:t xml:space="preserve"> With a strong baseline near 70 percent and a practical ceiling at 100, the space available for the method to demonstrate value is roughly 30 points wide, and a difference of the size a small trial can detect consumes most of it.</w:t>
-      </w:r>
-    </w:p>
-    <w:p>
-      <w:pPr>
-        <w:spacing w:after="140"/>
-      </w:pPr>
-      <w:r>
-        <w:t xml:space="preserve">Neither point rescues the result, and neither is offered as one. They explain why a null here is weaker evidence against the standard than a null from a trial with a naive control would be, and they set up the design question in Section 8: the informative next trial varies reviewer experience, rather than adding more experts to both arms.</w:t>
-      </w:r>
-    </w:p>
-    <w:p>
-      <w:pPr>
-        <w:pStyle w:val="Heading3"/>
-        <w:spacing w:after="140"/>
-      </w:pPr>
-      <w:r>
-        <w:t xml:space="preserve">6.3 Why the analysis was underpowered, stated precisely</w:t>
-      </w:r>
-    </w:p>
-    <w:p>
-      <w:pPr>
-        <w:spacing w:after="140"/>
-      </w:pPr>
-      <w:r>
-        <w:t xml:space="preserve">The observed effect is Cohen's d = 0.140 (pooled sd 28.6). At the sample reached, the smallest difference the comparison could have detected at 80 percent power was approximately 43 percentage points. </w:t>
-      </w:r>
-      <w:r>
-        <w:rPr>
-          <w:b/>
-        </w:rPr>
-        <w:t xml:space="preserve">The comparison was never capable of detecting an effect of the size that appears to be present.</w:t>
-      </w:r>
-    </w:p>
-    <w:p>
-      <w:pPr>
-        <w:spacing w:after="140"/>
-      </w:pPr>
-      <w:r>
-        <w:t xml:space="preserve">This is a statement about the design, not about the standard. A null from an underpowered test is uninformative about the underlying effect, and we decline to interpret it in either direction.</w:t>
-      </w:r>
-    </w:p>
-    <w:p>
-      <w:pPr>
-        <w:pStyle w:val="Heading3"/>
-        <w:spacing w:after="140"/>
-      </w:pPr>
-      <w:r>
-        <w:t xml:space="preserve">6.4 Effect-size estimate for a conclusive trial</w:t>
-      </w:r>
-    </w:p>
-    <w:p>
-      <w:pPr>
-        <w:spacing w:after="140"/>
-      </w:pPr>
-      <w:r>
-        <w:t xml:space="preserve">The value this analysis does deliver is a defensible effect-size estimate for designing a properly powered replication:</w:t>
-      </w:r>
-    </w:p>
-    <w:tbl>
-      <w:tblPr>
-        <w:tblStyle w:val="TableGrid"/>
-        <w:tblW w:w="9360" w:type="dxa"/>
-        <w:tblBorders>
-          <w:top w:val="single" w:sz="4" w:space="0" w:color="999999"/>
-          <w:left w:val="single" w:sz="4" w:space="0" w:color="999999"/>
-          <w:bottom w:val="single" w:sz="4" w:space="0" w:color="999999"/>
-          <w:right w:val="single" w:sz="4" w:space="0" w:color="999999"/>
-          <w:insideH w:val="single" w:sz="4" w:space="0" w:color="999999"/>
-          <w:insideV w:val="single" w:sz="4" w:space="0" w:color="999999"/>
-        </w:tblBorders>
-      </w:tblPr>
-      <w:tblGrid>
-        <w:gridCol w:w="4680"/>
-        <w:gridCol w:w="4680"/>
-      </w:tblGrid>
-      <w:tr>
-        <w:tc>
-          <w:tcPr>
-            <w:tcW w:w="4680" w:type="dxa"/>
-          </w:tcPr>
-          <w:p>
-            <w:pPr>
-              <w:spacing w:after="0"/>
-            </w:pPr>
-            <w:r>
-              <w:t xml:space="preserve">Target</w:t>
-            </w:r>
-          </w:p>
-        </w:tc>
-        <w:tc>
-          <w:tcPr>
-            <w:tcW w:w="4680" w:type="dxa"/>
-          </w:tcPr>
-          <w:p>
-            <w:pPr>
-              <w:spacing w:after="0"/>
-            </w:pPr>
-            <w:r>
-              <w:t xml:space="preserve">Completers required per condition</w:t>
-            </w:r>
-          </w:p>
-        </w:tc>
-      </w:tr>
-      <w:tr>
-        <w:tc>
-          <w:tcPr>
-            <w:tcW w:w="4680" w:type="dxa"/>
-          </w:tcPr>
-          <w:p>
-            <w:pPr>
-              <w:spacing w:after="0"/>
-            </w:pPr>
-            <w:r>
-              <w:t xml:space="preserve">80 percent power, alpha .05</w:t>
-            </w:r>
-          </w:p>
-        </w:tc>
-        <w:tc>
-          <w:tcPr>
-            <w:tcW w:w="4680" w:type="dxa"/>
-          </w:tcPr>
-          <w:p>
-            <w:pPr>
-              <w:spacing w:after="0"/>
-            </w:pPr>
-            <w:r>
-              <w:t xml:space="preserve">approximately 800</w:t>
-            </w:r>
-          </w:p>
-        </w:tc>
-      </w:tr>
-      <w:tr>
-        <w:tc>
-          <w:tcPr>
-            <w:tcW w:w="4680" w:type="dxa"/>
-          </w:tcPr>
-          <w:p>
-            <w:pPr>
-              <w:spacing w:after="0"/>
-            </w:pPr>
-            <w:r>
-              <w:t xml:space="preserve">90 percent power, alpha .05</w:t>
-            </w:r>
-          </w:p>
-        </w:tc>
-        <w:tc>
-          <w:tcPr>
-            <w:tcW w:w="4680" w:type="dxa"/>
-          </w:tcPr>
-          <w:p>
-            <w:pPr>
-              <w:spacing w:after="0"/>
-            </w:pPr>
-            <w:r>
-              <w:t xml:space="preserve">approximately 1,070</w:t>
-            </w:r>
-          </w:p>
-        </w:tc>
-      </w:tr>
-    </w:tbl>
-    <w:p>
-      <w:pPr/>
-      <w:r>
-        <w:t/>
-      </w:r>
-    </w:p>
-    <w:p>
-      <w:pPr>
-        <w:spacing w:after="140"/>
-      </w:pPr>
-      <w:r>
-        <w:t xml:space="preserve">We report this specification so that a future trial, whether ours or another group's, can be sized correctly at the outset rather than discovering its limits afterward.</w:t>
+        <w:t xml:space="preserve">References</w:t>
+      </w:r>
+    </w:p>
+    <w:p>
+      <w:pPr>
+        <w:spacing w:after="140"/>
+      </w:pPr>
+      <w:r>
+        <w:t xml:space="preserve">Byrt, T., Bishop, J., Carlin, J.B., 1993. Bias, prevalence and kappa. Journal of Clinical Epidemiology 46 (5), 423-429.</w:t>
+      </w:r>
+    </w:p>
+    <w:p>
+      <w:pPr>
+        <w:spacing w:after="140"/>
+      </w:pPr>
+      <w:r>
+        <w:t xml:space="preserve">Cohen, J., 1960. A coefficient of agreement for nominal scales. Educational and Psychological Measurement 20 (1), 37-46.</w:t>
+      </w:r>
+    </w:p>
+    <w:p>
+      <w:pPr>
+        <w:spacing w:after="140"/>
+      </w:pPr>
+      <w:r>
+        <w:t xml:space="preserve">Feinstein, A.R., Cicchetti, D.V., 1990. High agreement but low kappa: I. The problems of two paradoxes. Journal of Clinical Epidemiology 43 (6), 543-549.</w:t>
+      </w:r>
+    </w:p>
+    <w:p>
+      <w:pPr>
+        <w:spacing w:after="140"/>
+      </w:pPr>
+      <w:r>
+        <w:t xml:space="preserve">Fleiss, J.L., 1971. Measuring nominal scale agreement among many raters. Psychological Bulletin 76 (5), 378-382.</w:t>
+      </w:r>
+    </w:p>
+    <w:p>
+      <w:pPr>
+        <w:spacing w:after="140"/>
+      </w:pPr>
+      <w:r>
+        <w:t xml:space="preserve">Gwet, K.L., 2008. Computing inter-rater reliability and its variance in the presence of high agreement. British Journal of Mathematical and Statistical Psychology 61 (1), 29-48.</w:t>
+      </w:r>
+    </w:p>
+    <w:p>
+      <w:pPr>
+        <w:spacing w:after="140"/>
+      </w:pPr>
+      <w:r>
+        <w:t xml:space="preserve">Gwet, K.L., 2014. Handbook of Inter-Rater Reliability, fourth ed. Advanced Analytics, Gaithersburg, MD.</w:t>
+      </w:r>
+    </w:p>
+    <w:p>
+      <w:pPr>
+        <w:spacing w:after="140"/>
+      </w:pPr>
+      <w:r>
+        <w:t xml:space="preserve">Krippendorff, K., 2004. Content Analysis: An Introduction to Its Methodology, second ed. Sage, Thousand Oaks, CA.</w:t>
+      </w:r>
+    </w:p>
+    <w:p>
+      <w:pPr>
+        <w:spacing w:after="140"/>
+      </w:pPr>
+      <w:r>
+        <w:t xml:space="preserve">Landis, J.R., Koch, G.G., 1977. The measurement of observer agreement for categorical data. Biometrics 33 (1), 159-174.</w:t>
       </w:r>
     </w:p>
     <w:p>
@@ -2272,261 +2578,23 @@
         <w:spacing w:after="140"/>
       </w:pPr>
       <w:r>
-        <w:t xml:space="preserve">7. Discussion</w:t>
-      </w:r>
-    </w:p>
-    <w:p>
-      <w:pPr>
-        <w:spacing w:after="140"/>
-      </w:pPr>
-      <w:r>
-        <w:rPr>
-          <w:b/>
-        </w:rPr>
-        <w:t xml:space="preserve">The primary contribution is that DRR is detectable.</w:t>
-      </w:r>
-      <w:r>
-        <w:t xml:space="preserve"> This is the precondition for everything downstream. A documentation property that experienced reviewers cannot identify is not a governable property, and any control built on human review of it would be unfounded. The panel result establishes that the property is real, visible, and identifiable at a rate well above chance by professionals from a wide range of jurisdictions and first languages.</w:t>
-      </w:r>
-    </w:p>
-    <w:p>
-      <w:pPr>
-        <w:spacing w:after="140"/>
-      </w:pPr>
-      <w:r>
-        <w:rPr>
-          <w:b/>
-        </w:rPr>
-        <w:t xml:space="preserve">Detection is not the same as remediation.</w:t>
-      </w:r>
-      <w:r>
-        <w:t xml:space="preserve"> Establishing that reviewers can identify unreconstructable records leaves open whether a structured method helps them do it better, faster, or more consistently than unaided judgment. That question is genuinely open, and Section 6 reports honestly that this study could not settle it.</w:t>
-      </w:r>
-    </w:p>
-    <w:p>
-      <w:pPr>
-        <w:spacing w:after="140"/>
-      </w:pPr>
-      <w:r>
-        <w:rPr>
-          <w:b/>
-        </w:rPr>
-        <w:t xml:space="preserve">An observation, exploratory and not pre-registered.</w:t>
-      </w:r>
-      <w:r>
-        <w:t xml:space="preserve"> Dispersion in accuracy differed markedly between conditions in the secondary analysis. Reviewers using the five conditions clustered more tightly (sd 21.2) than reviewers working unaided (sd 34.0), and the unaided distribution was bimodal, with several participants scoring near-perfectly and several below chance, and few in between. A plausible mechanism is that an unaided reviewer must invent a threshold, and private thresholds vary widely, while explicit conditions constrain the space of reasonable readings. We flag this because it suggests that variance reduction, rather than mean improvement, may be the more important effect to test. It is not established here: the formal tests of the variance difference are not significant, and the observation is post-hoc. A dedicated, pre-registered test would be required.</w:t>
-      </w:r>
-    </w:p>
-    <w:p>
-      <w:pPr>
-        <w:spacing w:after="140"/>
-      </w:pPr>
-      <w:r>
-        <w:rPr>
-          <w:b/>
-        </w:rPr>
-        <w:t xml:space="preserve">Practical implication.</w:t>
-      </w:r>
-      <w:r>
-        <w:t xml:space="preserve"> For an organization, a review process in which some reviewers are highly accurate and others perform below chance is difficult to manage even when the average is acceptable, because the variance is invisible at the point of use. If a structured standard narrows that spread, the operational value may exceed what a comparison of means would capture.</w:t>
-      </w:r>
-    </w:p>
-    <w:p>
-      <w:pPr>
-        <w:spacing w:after="140"/>
-      </w:pPr>
-      <w:r>
-        <w:rPr>
-          <w:b/>
-        </w:rPr>
-        <w:t xml:space="preserve">What the study supports, stated in full.</w:t>
-      </w:r>
-      <w:r>
-        <w:t xml:space="preserve"> Decision Reconstruction Risk is detectable by experienced professionals: 83.9 percent in the panel, 81.3 percent across all 21 reviewers who applied the standard through two separate recruitment routes, both clearing a threshold fixed before the data were seen. The review is applied consistently by independent machines at 84 percent cross-vendor agreement and by independent human experts at AC1 0.74, interim. What the study does not support is a claim that the method improves on the unaided judgment of an already expert reviewer; the randomized test of that question returned a null, and it was run under the least favourable conditions for finding an effect. Those two statements sit together without tension. A property can be real, visible, and worth building controls around before anyone has shown that a particular instrument improves on expert intuition at detecting it.</w:t>
-      </w:r>
-    </w:p>
-    <w:p>
-      <w:pPr>
-        <w:pStyle w:val="Heading2"/>
-        <w:spacing w:after="140"/>
-      </w:pPr>
-      <w:r>
-        <w:t xml:space="preserve">8. Limitations</w:t>
-      </w:r>
-    </w:p>
-    <w:p>
-      <w:pPr>
-        <w:spacing w:after="140"/>
-      </w:pPr>
-      <w:r>
-        <w:t xml:space="preserve">The corpus is constructed rather than drawn from live records, which supports a clean detection test but does not establish real-world effectiveness; criterion validity against documented real-case outcomes is a separate line of work.</w:t>
-      </w:r>
-    </w:p>
-    <w:p>
-      <w:pPr>
-        <w:spacing w:after="140"/>
-      </w:pPr>
-      <w:r>
-        <w:t xml:space="preserve">The panel is recruited, not sampled, and self-selects for interest in the topic. Generalization beyond the sampled domains and jurisdictions is not claimed.</w:t>
-      </w:r>
-    </w:p>
-    <w:p>
-      <w:pPr>
-        <w:spacing w:after="140"/>
-      </w:pPr>
-      <w:r>
-        <w:rPr>
-          <w:b/>
-        </w:rPr>
-        <w:t xml:space="preserve">The expert panel and the randomized comparison are not compared to one another as a test of the standard.</w:t>
-      </w:r>
-      <w:r>
-        <w:t xml:space="preserve"> Both groups comprise experienced professionals in relevant domains, so the difference between them is not a difference in expertise; "JRS-naive" denotes no prior exposure to the method. What separates them is that the panel was recruited directly and was not randomized against the comparison arms, so any between-group difference reflects recruitment route and self-selection as well as method, and cannot carry a causal reading. The only valid method comparison in this design is between the two randomized conditions in Section 6, which is reported there as a null. Section 5.4 pools the two groups that applied the standard for a detection estimate only, which is a descriptive statement about detectability and not a comparison.</w:t>
-      </w:r>
-    </w:p>
-    <w:p>
-      <w:pPr>
-        <w:spacing w:after="140"/>
-      </w:pPr>
-      <w:r>
-        <w:rPr>
-          <w:b/>
-        </w:rPr>
-        <w:t xml:space="preserve">Both randomized arms were drawn from the same pool of experienced professionals, and that bounds what the comparison can show.</w:t>
-      </w:r>
-      <w:r>
-        <w:t xml:space="preserve"> A structured method has the most room to help a reviewer who would otherwise miss things. Testing it on professionals who already perform the task competently is the least favourable condition for detecting an effect, and it is the condition this trial ran under. The design cannot speak to the standard's value for less experienced reviewers, for reviewers working outside their domain, or for teams seeking consistency rather than peak accuracy, and those are the settings where a larger effect is plausible. A future trial that contrasts experienced and less experienced reviewers, each with and without the method, would be more informative than a larger version of this one.</w:t>
-      </w:r>
-    </w:p>
-    <w:p>
-      <w:pPr>
-        <w:spacing w:after="140"/>
-      </w:pPr>
-      <w:r>
-        <w:t xml:space="preserve">Reviewer accuracy varied widely, including two panel members scoring below chance. Response patterns were examined and showed genuine discrimination rather than straight-lining or missing data, so these are treated as real observations and retained.</w:t>
-      </w:r>
-    </w:p>
-    <w:p>
-      <w:pPr>
-        <w:spacing w:after="140"/>
-      </w:pPr>
-      <w:r>
-        <w:t xml:space="preserve">Reliability figures are interim on 10 of approximately 26 pooled records. JRS remains in a validation phase and makes no proven-effectiveness claim.</w:t>
-      </w:r>
-    </w:p>
-    <w:p>
-      <w:pPr>
-        <w:pStyle w:val="Heading2"/>
-        <w:spacing w:after="140"/>
-      </w:pPr>
-      <w:r>
-        <w:t xml:space="preserve">9. Conclusion</w:t>
-      </w:r>
-    </w:p>
-    <w:p>
-      <w:pPr>
-        <w:spacing w:after="140"/>
-      </w:pPr>
-      <w:r>
-        <w:t xml:space="preserve">The drafting tool and the technology stack will keep changing. The evidentiary test does not. A record that cannot be reconstructed from its own contents cannot be independently defended, whoever or whatever produced it.</w:t>
-      </w:r>
-    </w:p>
-    <w:p>
-      <w:pPr>
-        <w:spacing w:after="140"/>
-      </w:pPr>
-      <w:r>
-        <w:t xml:space="preserve">This paper establishes that Decision Reconstruction Risk is detectable: an international panel of experienced professionals, reading records cold and blind to a verified key, identified unreconstructable records at 83.9 percent accuracy, clearing a threshold set before the data were seen. It further establishes that the review can be applied consistently by independent machines and by independent human experts.</w:t>
-      </w:r>
-    </w:p>
-    <w:p>
-      <w:pPr>
-        <w:spacing w:after="140"/>
-      </w:pPr>
-      <w:r>
-        <w:t xml:space="preserve">Whether a structured standard improves on unaided professional judgment remains open. We report the attempt, the null, and the sample size a conclusive answer would require. The property is real and measurable; sizing the control's added value is the next study, and it can now be designed properly.</w:t>
-      </w:r>
-    </w:p>
-    <w:p>
-      <w:pPr>
-        <w:pStyle w:val="Heading2"/>
-        <w:spacing w:after="140"/>
-      </w:pPr>
-      <w:r>
-        <w:t xml:space="preserve">References</w:t>
-      </w:r>
-    </w:p>
-    <w:p>
-      <w:pPr>
-        <w:spacing w:after="140"/>
-      </w:pPr>
-      <w:r>
-        <w:t xml:space="preserve">Byrt, T., Bishop, J., Carlin, J.B., 1993. Bias, prevalence and kappa. Journal of Clinical Epidemiology 46 (5), 423-429.</w:t>
-      </w:r>
-    </w:p>
-    <w:p>
-      <w:pPr>
-        <w:spacing w:after="140"/>
-      </w:pPr>
-      <w:r>
-        <w:t xml:space="preserve">Cohen, J., 1960. A coefficient of agreement for nominal scales. Educational and Psychological Measurement 20 (1), 37-46.</w:t>
-      </w:r>
-    </w:p>
-    <w:p>
-      <w:pPr>
-        <w:spacing w:after="140"/>
-      </w:pPr>
-      <w:r>
-        <w:t xml:space="preserve">Feinstein, A.R., Cicchetti, D.V., 1990. High agreement but low kappa: I. The problems of two paradoxes. Journal of Clinical Epidemiology 43 (6), 543-549.</w:t>
-      </w:r>
-    </w:p>
-    <w:p>
-      <w:pPr>
-        <w:spacing w:after="140"/>
-      </w:pPr>
-      <w:r>
-        <w:t xml:space="preserve">Fleiss, J.L., 1971. Measuring nominal scale agreement among many raters. Psychological Bulletin 76 (5), 378-382.</w:t>
-      </w:r>
-    </w:p>
-    <w:p>
-      <w:pPr>
-        <w:spacing w:after="140"/>
-      </w:pPr>
-      <w:r>
-        <w:t xml:space="preserve">Gwet, K.L., 2008. Computing inter-rater reliability and its variance in the presence of high agreement. British Journal of Mathematical and Statistical Psychology 61 (1), 29-48.</w:t>
-      </w:r>
-    </w:p>
-    <w:p>
-      <w:pPr>
-        <w:spacing w:after="140"/>
-      </w:pPr>
-      <w:r>
-        <w:t xml:space="preserve">Gwet, K.L., 2014. Handbook of Inter-Rater Reliability, fourth ed. Advanced Analytics, Gaithersburg, MD.</w:t>
-      </w:r>
-    </w:p>
-    <w:p>
-      <w:pPr>
-        <w:spacing w:after="140"/>
-      </w:pPr>
-      <w:r>
-        <w:t xml:space="preserve">Krippendorff, K., 2004. Content Analysis: An Introduction to Its Methodology, second ed. Sage, Thousand Oaks, CA.</w:t>
-      </w:r>
-    </w:p>
-    <w:p>
-      <w:pPr>
-        <w:spacing w:after="140"/>
-      </w:pPr>
-      <w:r>
-        <w:t xml:space="preserve">Landis, J.R., Koch, G.G., 1977. The measurement of observer agreement for categorical data. Biometrics 33 (1), 159-174.</w:t>
-      </w:r>
-    </w:p>
-    <w:p>
-      <w:pPr>
-        <w:pStyle w:val="Heading2"/>
-        <w:spacing w:after="140"/>
-      </w:pPr>
-      <w:r>
         <w:t xml:space="preserve">Acknowledgments</w:t>
+      </w:r>
+    </w:p>
+    <w:p>
+      <w:pPr>
+        <w:spacing w:after="140"/>
+      </w:pPr>
+      <w:r>
+        <w:t xml:space="preserve">This study exists because 32 experienced professionals across 11 countries and 5 continents each read a full corpus of 24 records with care, on their own time, without compensation, and with no stake in the outcome. That is 768 independent judgments contributed to a question none of them had to take an interest in. The quality of the panel is the reason the detection result is worth reporting at all, and the international and linguistic range of that panel is a methodological asset rather than a courtesy, for the reasons set out in Section 2.1.</w:t>
+      </w:r>
+    </w:p>
+    <w:p>
+      <w:pPr>
+        <w:spacing w:after="140"/>
+      </w:pPr>
+      <w:r>
+        <w:t xml:space="preserve">The reliability and validation methodology, including the pre-registered analysis plan, the choice of coefficient, and the acceptance floors applied in Section 5.3, was designed by Ubayet Hossain, FRM. Specifying those criteria before any data were examined is what allows the results in this paper to be read as tests rather than as descriptions.</w:t>
       </w:r>
     </w:p>
     <w:p>
@@ -2582,6 +2650,36 @@
       </w:r>
       <w:r>
         <w:t xml:space="preserve"> Gabriela Cortez is credited as a named panel reviewer and as the origin of the Section 2.1 argument in the Acknowledgments, at her preference; she is not a co-author at this time. Section 2.1 is retained in the paper's voice. The dual-role disclosure is removed as no longer applicable.</w:t>
+      </w:r>
+    </w:p>
+    <w:p>
+      <w:pPr>
+        <w:numPr>
+          <w:ilvl w:val="0"/>
+          <w:numId w:val="1"/>
+        </w:numPr>
+        <w:spacing w:after="60"/>
+      </w:pPr>
+      <w:r>
+        <w:t xml:space="preserve">2026-08-05 (later): </w:t>
+      </w:r>
+      <w:r>
+        <w:rPr>
+          <w:b/>
+        </w:rPr>
+        <w:t xml:space="preserve">Section 5.4 moved to Appendix A, and the panel's contribution accentuated throughout.</w:t>
+      </w:r>
+      <w:r>
+        <w:t xml:space="preserve"> The pooled expert detection analysis now sits in </w:t>
+      </w:r>
+      <w:r>
+        <w:rPr>
+          <w:b/>
+        </w:rPr>
+        <w:t xml:space="preserve">Appendix A</w:t>
+      </w:r>
+      <w:r>
+        <w:t xml:space="preserve"> with a standing note that it combines groups which were not randomized against one another and carries no causal reading; Section 5.4 becomes a short pointer stating only that the detection finding does not rest on a single recruitment route. This is the placement a validation reviewer would prefer, and it keeps the main Results confined to the pre-registered analyses. Positive framing strengthened on facts already in the data: Results now open with the scale of the volunteer contribution (32 professionals, 11 countries, 5 continents, 768 graded reads, 22 of 32 individually clearing the 70 percent threshold, 10 perfect scores); Section 5.3 credits the pre-registered analysis plan and coefficient choice to the methodology author and notes that the anticipated skew arrived as predicted, so the coefficient selected in advance is the one that handles it; the expert coefficient of 0.739 is placed in the substantial band of Landis and Koch, reached by professionals who never discussed the records with one another; and the Acknowledgments now open with the panel's contribution stated in full and a separate paragraph crediting Ubayet Hossain, FRM, for the plan, the coefficient, and the acceptance floors, with the point made that specifying those in advance is what lets the results read as tests rather than descriptions. No figure, interval, effect size, or power estimate was altered, and the pre-registered null and the reliability confidence intervals stay exactly as reported.</w:t>
       </w:r>
     </w:p>
     <w:p>

</xml_diff>

<commit_message>
Separate the comparison into its own study; scope the paper to detection
</commit_message>
<xml_diff>
--- a/research/Detection_Article_v2_ExpertFocus.docx
+++ b/research/Detection_Article_v2_ExpertFocus.docx
@@ -88,10 +88,10 @@
         <w:rPr>
           <w:b/>
         </w:rPr>
-        <w:t xml:space="preserve">Status (2026-08-02):</w:t>
-      </w:r>
-      <w:r>
-        <w:t xml:space="preserve"> Working draft. The primary detection analysis is complete and reported. The pre-registered randomized comparison reached its minimum sample and is reported as an underpowered null with an effect-size estimate. All figures are verified against the study database on the date shown, not carried from memory.</w:t>
+        <w:t xml:space="preserve">Status (2026-08-05):</w:t>
+      </w:r>
+      <w:r>
+        <w:t xml:space="preserve"> Working draft, complete and submittable. This paper reports Study 011, the detection study, which asks whether Decision Reconstruction Risk can be identified by independent expert review. That study is finished. A separate randomized comparison study, which asks the different question of whether the method improves on unaided judgment, is still collecting data and is reported separately when it closes; it is disclosed in Section 4.8 and is not part of the analysis here. All figures are verified against the study database on the date shown.</w:t>
       </w:r>
     </w:p>
     <w:p>
@@ -198,29 +198,6 @@
         <w:rPr>
           <w:b/>
         </w:rPr>
-        <w:t xml:space="preserve">Detection across the full expert base.</w:t>
-      </w:r>
-      <w:r>
-        <w:t xml:space="preserve"> Every participant in this study, in both the panel and the randomized comparison, is an experienced professional in a relevant domain; "JRS-naive" in the comparison arms denotes no prior exposure to the method, not absence of expertise. Pooling every expert who applied the five conditions, the panel and the standard arm of the randomized comparison together, gives </w:t>
-      </w:r>
-      <w:r>
-        <w:rPr>
-          <w:b/>
-        </w:rPr>
-        <w:t xml:space="preserve">81.3 percent accuracy across 21 reviewers and 504 graded reads</w:t>
-      </w:r>
-      <w:r>
-        <w:t xml:space="preserve"> (95 percent CI 71.8 to 90.9). Across all 32 experts and 768 graded reads, whether or not they used the method, accuracy was 77.2 percent (95 percent CI 68.2 to 86.3). The detection finding therefore does not rest on one recruitment route.</w:t>
-      </w:r>
-    </w:p>
-    <w:p>
-      <w:pPr>
-        <w:spacing w:after="140"/>
-      </w:pPr>
-      <w:r>
-        <w:rPr>
-          <w:b/>
-        </w:rPr>
         <w:t xml:space="preserve">Supporting results.</w:t>
       </w:r>
       <w:r>
@@ -235,38 +212,10 @@
         <w:rPr>
           <w:b/>
         </w:rPr>
-        <w:t xml:space="preserve">Secondary, pre-registered.</w:t>
-      </w:r>
-      <w:r>
-        <w:t xml:space="preserve"> A randomized comparison assigned JRS-naive professionals to review the same records either with the five conditions or with a general prompt. The standard condition scored 73.3 percent (n = 5) against 69.3 percent for the unaided condition (n = 11), a difference of 4.0 percentage points (Cohen's d = 0.140) whose confidence interval includes zero. Under the pre-registered decision rule this is reported as a null. As the unaided arm has accrued completers, the observed difference has narrowed rather than widened, and post-hoc power analysis now indicates that a definitive test of an effect this size would require approximately 800 completers per condition.</w:t>
-      </w:r>
-    </w:p>
-    <w:p>
-      <w:pPr>
-        <w:spacing w:after="140"/>
-      </w:pPr>
-      <w:r>
-        <w:rPr>
-          <w:b/>
-        </w:rPr>
-        <w:t xml:space="preserve">Contribution.</w:t>
-      </w:r>
-      <w:r>
-        <w:t xml:space="preserve"> DRR names a documentation-governance problem that model-centric AI governance does not capture. This paper establishes that the property is detectable by experienced reviewers, characterizes the effect size for a properly powered trial of the standard's added value, and offers the design as a template for evaluating documentation-quality controls.</w:t>
-      </w:r>
-    </w:p>
-    <w:p>
-      <w:pPr>
-        <w:spacing w:after="140"/>
-      </w:pPr>
-      <w:r>
-        <w:rPr>
-          <w:b/>
-        </w:rPr>
-        <w:t xml:space="preserve">Keywords:</w:t>
-      </w:r>
-      <w:r>
-        <w:t xml:space="preserve"> AI governance; documentation risk; accountability; decision defensibility; record-level review; responsible AI.</w:t>
+        <w:t xml:space="preserve">A separate study, disclosed.</w:t>
+      </w:r>
+      <w:r>
+        <w:t xml:space="preserve"> A randomized comparison testing whether the five conditions improve on unaided professional judgment is running as a distinct study with its own participants and its own registration. It is still collecting data and is not reported here. Its existence, design, and status are stated in Section 4.8 so that the scope of the present claim is unambiguous: this paper establishes that the risk is detectable, and it does not claim that the method outperforms unaided judgment.</w:t>
       </w:r>
     </w:p>
     <w:p>
@@ -336,7 +285,7 @@
         <w:t xml:space="preserve">The question this paper answers.</w:t>
       </w:r>
       <w:r>
-        <w:t xml:space="preserve"> Before asking whether any particular review method helps, a prior question must be settled: is DRR detectable at all? If experienced professionals, reading a record cold, cannot distinguish one whose reasoning is present from one whose reasoning is absent, then documentation risk is not a governable property and no control built on human review can work. This paper reports a pre-registered test of exactly that question, and answers it affirmatively. A secondary pre-registered comparison, testing whether the structured method improves detection relative to unaided judgment, is reported in Section 6 as an underpowered null with the effect size needed to design a conclusive trial.</w:t>
+        <w:t xml:space="preserve"> Before asking whether any particular review method helps, a prior question must be settled: is DRR detectable at all? If experienced professionals, reading a record cold, cannot distinguish one whose reasoning is present from one whose reasoning is absent, then documentation risk is not a governable property and no control built on human review can work. This paper reports a pre-registered test of exactly that question, and answers it affirmatively. Whether the structured method improves on unaided judgment is a separate question, under separate test, and is not addressed here (Section 4.8).</w:t>
       </w:r>
     </w:p>
     <w:p>
@@ -517,7 +466,7 @@
         <w:spacing w:after="140"/>
       </w:pPr>
       <w:r>
-        <w:t xml:space="preserve">The primary analysis is a detection study. An international panel of experienced professionals independently judged a balanced corpus of constructed records against a verified answer key, blind to the key and to one another's judgments. A secondary, pre-registered randomized comparison (Section 6) tested whether the structured method improves detection relative to unaided judgment among equally experienced professionals with no prior exposure to it.</w:t>
+        <w:t xml:space="preserve">This is a detection study. An international panel of experienced professionals independently judged a balanced corpus of constructed records against a verified answer key, blind to the key and to one another's judgments. A separate randomized comparison study, described in Section 4.8, tests a different question and is not analyzed here.</w:t>
       </w:r>
     </w:p>
     <w:p>
@@ -707,7 +656,7 @@
         <w:spacing w:after="140"/>
       </w:pPr>
       <w:r>
-        <w:t xml:space="preserve">All records are constructed and de-identified; none is internal, confidential, or tied to a real individual or organization. Participation is voluntary, uncompensated, and in a personal capacity. Reviewer responses are stored on an append-only basis and used only in aggregate. Attribution is opt-in: contributors are named only with consent, may participate anonymously, and may withdraw their name or contribution before any publication. Participants in the randomized comparison were blind to the two-condition design and are debriefed on closure. The study makes no proven-effectiveness claim.</w:t>
+        <w:t xml:space="preserve">All records are constructed and de-identified; none is internal, confidential, or tied to a real individual or organization. Participation is voluntary, uncompensated, and in a personal capacity. Reviewer responses are stored on an append-only basis and used only in aggregate. Attribution is opt-in: contributors are named only with consent, may participate anonymously, and may withdraw their name or contribution before any publication. Participants in the separate randomized comparison study are blind to its two-condition design and are debriefed on closure of that study. The study makes no proven-effectiveness claim.</w:t>
       </w:r>
     </w:p>
     <w:p>
@@ -733,6 +682,53 @@
       </w:pPr>
       <w:r>
         <w:t xml:space="preserve">In the reliability analysis, independent raters applied the five conditions to a shared record set. Raters whose codes begin with E are experts; the remainder are trained reviewers. Agreement is assessed with Gwet's AC1 (Gwet, 2008) as the primary chance-corrected coefficient, chosen for robustness to the kappa paradox under skewed marginals (Feinstein and Cicchetti, 1990; Byrt et al., 1993), with Krippendorff's alpha, Fleiss' kappa, and per-condition AC1 reported alongside.</w:t>
+      </w:r>
+    </w:p>
+    <w:p>
+      <w:pPr>
+        <w:pStyle w:val="Heading3"/>
+        <w:spacing w:after="140"/>
+      </w:pPr>
+      <w:r>
+        <w:t xml:space="preserve">4.8 A separate study, disclosed</w:t>
+      </w:r>
+    </w:p>
+    <w:p>
+      <w:pPr>
+        <w:spacing w:after="140"/>
+      </w:pPr>
+      <w:r>
+        <w:t xml:space="preserve">The question this paper answers is whether Decision Reconstruction Risk can be detected. A different question, whether the five conditions improve on unaided professional judgment, is being tested in a separate study with its own participants, its own recruitment, its own participant codes, and its own registration. That study randomly assigns experienced professionals with no prior exposure to the method either to apply the five conditions or to answer a single general question about adequacy of support, on the same 24-record corpus.</w:t>
+      </w:r>
+    </w:p>
+    <w:p>
+      <w:pPr>
+        <w:spacing w:after="140"/>
+      </w:pPr>
+      <w:r>
+        <w:t xml:space="preserve">It is disclosed here for three reasons. It shares the corpus with this study, so a reader is entitled to know it exists. Its participants are drawn from the same professional population. And the two questions are easy to conflate, so the boundary is stated rather than left to inference.</w:t>
+      </w:r>
+    </w:p>
+    <w:p>
+      <w:pPr>
+        <w:spacing w:after="140"/>
+      </w:pPr>
+      <w:r>
+        <w:rPr>
+          <w:b/>
+        </w:rPr>
+        <w:t xml:space="preserve">It is still collecting data and is therefore not reported here.</w:t>
+      </w:r>
+      <w:r>
+        <w:t xml:space="preserve"> Reporting an open study's results would be premature regardless of what they show. It will be reported separately, in full and whatever the outcome, when data collection closes.</w:t>
+      </w:r>
+    </w:p>
+    <w:p>
+      <w:pPr>
+        <w:spacing w:after="140"/>
+      </w:pPr>
+      <w:r>
+        <w:t xml:space="preserve">Two consequences follow for how this paper should be read. First, nothing in this paper claims the method outperforms unaided judgment; that claim is not made, and the evidence for or against it is not in this manuscript. Second, the detection result reported here does not depend on the comparison in any way. The corpus, the key, the panel, and the analysis plan for detection were fixed independently of it.</w:t>
       </w:r>
     </w:p>
     <w:p>
@@ -1406,489 +1402,81 @@
     </w:p>
     <w:p>
       <w:pPr>
-        <w:pStyle w:val="Heading3"/>
-        <w:spacing w:after="140"/>
-      </w:pPr>
-      <w:r>
-        <w:t xml:space="preserve">5.4 Consistency of the detection result across recruitment routes</w:t>
-      </w:r>
-    </w:p>
-    <w:p>
-      <w:pPr>
-        <w:spacing w:after="140"/>
-      </w:pPr>
-      <w:r>
-        <w:t xml:space="preserve">The detection finding does not rest on a single recruitment route. Reviewers who entered the study through the randomized comparison and applied the same five conditions to the same records reached comparable accuracy, and the combined figure across every reviewer who applied the standard is reported in Appendix A. That appendix is a descriptive statement about detectability across the full expert base; the causal question belongs to Section 6.</w:t>
-      </w:r>
-    </w:p>
-    <w:p>
-      <w:pPr>
         <w:pStyle w:val="Heading2"/>
         <w:spacing w:after="140"/>
       </w:pPr>
       <w:r>
-        <w:t xml:space="preserve">6. Secondary pre-registered analysis: does the standard improve on unaided judgment?</w:t>
-      </w:r>
-    </w:p>
-    <w:p>
-      <w:pPr>
-        <w:spacing w:after="140"/>
-      </w:pPr>
-      <w:r>
-        <w:t xml:space="preserve">A randomized comparison was built to isolate the value of the method itself. The participants are experienced professionals in the same domains as the panel, recruited separately and with no prior exposure to the standard; "JRS-naive" refers to that absence of exposure and not to any absence of expertise. Drawn from a single recruitment pool, they were randomly assigned, by a deterministic hash of their participant code and before they judged any record, to review the same 24 records either with the five conditions (standard condition) or with a single general question about adequacy of support (unaided condition).</w:t>
-      </w:r>
-    </w:p>
-    <w:p>
-      <w:pPr>
-        <w:pStyle w:val="Heading3"/>
-        <w:spacing w:after="140"/>
-      </w:pPr>
-      <w:r>
-        <w:t xml:space="preserve">6.1 Result</w:t>
-      </w:r>
-    </w:p>
-    <w:tbl>
-      <w:tblPr>
-        <w:tblStyle w:val="TableGrid"/>
-        <w:tblW w:w="9360" w:type="dxa"/>
-        <w:tblBorders>
-          <w:top w:val="single" w:sz="4" w:space="0" w:color="999999"/>
-          <w:left w:val="single" w:sz="4" w:space="0" w:color="999999"/>
-          <w:bottom w:val="single" w:sz="4" w:space="0" w:color="999999"/>
-          <w:right w:val="single" w:sz="4" w:space="0" w:color="999999"/>
-          <w:insideH w:val="single" w:sz="4" w:space="0" w:color="999999"/>
-          <w:insideV w:val="single" w:sz="4" w:space="0" w:color="999999"/>
-        </w:tblBorders>
-      </w:tblPr>
-      <w:tblGrid>
-        <w:gridCol w:w="3120"/>
-        <w:gridCol w:w="3120"/>
-        <w:gridCol w:w="3120"/>
-      </w:tblGrid>
-      <w:tr>
-        <w:tc>
-          <w:tcPr>
-            <w:tcW w:w="3120" w:type="dxa"/>
-          </w:tcPr>
-          <w:p>
-            <w:pPr>
-              <w:spacing w:after="0"/>
-            </w:pPr>
-            <w:r>
-              <w:t xml:space="preserve">Condition</w:t>
-            </w:r>
-          </w:p>
-        </w:tc>
-        <w:tc>
-          <w:tcPr>
-            <w:tcW w:w="3120" w:type="dxa"/>
-          </w:tcPr>
-          <w:p>
-            <w:pPr>
-              <w:spacing w:after="0"/>
-            </w:pPr>
-            <w:r>
-              <w:t xml:space="preserve">n</w:t>
-            </w:r>
-          </w:p>
-        </w:tc>
-        <w:tc>
-          <w:tcPr>
-            <w:tcW w:w="3120" w:type="dxa"/>
-          </w:tcPr>
-          <w:p>
-            <w:pPr>
-              <w:spacing w:after="0"/>
-            </w:pPr>
-            <w:r>
-              <w:t xml:space="preserve">Accuracy</w:t>
-            </w:r>
-          </w:p>
-        </w:tc>
-      </w:tr>
-      <w:tr>
-        <w:tc>
-          <w:tcPr>
-            <w:tcW w:w="3120" w:type="dxa"/>
-          </w:tcPr>
-          <w:p>
-            <w:pPr>
-              <w:spacing w:after="0"/>
-            </w:pPr>
-            <w:r>
-              <w:t xml:space="preserve">Standard condition</w:t>
-            </w:r>
-          </w:p>
-        </w:tc>
-        <w:tc>
-          <w:tcPr>
-            <w:tcW w:w="3120" w:type="dxa"/>
-          </w:tcPr>
-          <w:p>
-            <w:pPr>
-              <w:spacing w:after="0"/>
-            </w:pPr>
-            <w:r>
-              <w:t xml:space="preserve">5</w:t>
-            </w:r>
-          </w:p>
-        </w:tc>
-        <w:tc>
-          <w:tcPr>
-            <w:tcW w:w="3120" w:type="dxa"/>
-          </w:tcPr>
-          <w:p>
-            <w:pPr>
-              <w:spacing w:after="0"/>
-            </w:pPr>
-            <w:r>
-              <w:t xml:space="preserve">73.3%</w:t>
-            </w:r>
-          </w:p>
-        </w:tc>
-      </w:tr>
-      <w:tr>
-        <w:tc>
-          <w:tcPr>
-            <w:tcW w:w="3120" w:type="dxa"/>
-          </w:tcPr>
-          <w:p>
-            <w:pPr>
-              <w:spacing w:after="0"/>
-            </w:pPr>
-            <w:r>
-              <w:t xml:space="preserve">Unaided condition</w:t>
-            </w:r>
-          </w:p>
-        </w:tc>
-        <w:tc>
-          <w:tcPr>
-            <w:tcW w:w="3120" w:type="dxa"/>
-          </w:tcPr>
-          <w:p>
-            <w:pPr>
-              <w:spacing w:after="0"/>
-            </w:pPr>
-            <w:r>
-              <w:t xml:space="preserve">11</w:t>
-            </w:r>
-          </w:p>
-        </w:tc>
-        <w:tc>
-          <w:tcPr>
-            <w:tcW w:w="3120" w:type="dxa"/>
-          </w:tcPr>
-          <w:p>
-            <w:pPr>
-              <w:spacing w:after="0"/>
-            </w:pPr>
-            <w:r>
-              <w:t xml:space="preserve">69.3%</w:t>
-            </w:r>
-          </w:p>
-        </w:tc>
-      </w:tr>
-      <w:tr>
-        <w:tc>
-          <w:tcPr>
-            <w:tcW w:w="3120" w:type="dxa"/>
-          </w:tcPr>
-          <w:p>
-            <w:pPr>
-              <w:spacing w:after="0"/>
-            </w:pPr>
-            <w:r>
-              <w:rPr>
-                <w:b/>
-              </w:rPr>
-              <w:t xml:space="preserve">Difference</w:t>
-            </w:r>
-          </w:p>
-        </w:tc>
-        <w:tc>
-          <w:tcPr>
-            <w:tcW w:w="3120" w:type="dxa"/>
-          </w:tcPr>
-          <w:p>
-            <w:pPr>
-              <w:spacing w:after="0"/>
-            </w:pPr>
-            <w:r>
-              <w:t/>
-            </w:r>
-          </w:p>
-        </w:tc>
-        <w:tc>
-          <w:tcPr>
-            <w:tcW w:w="3120" w:type="dxa"/>
-          </w:tcPr>
-          <w:p>
-            <w:pPr>
-              <w:spacing w:after="0"/>
-            </w:pPr>
-            <w:r>
-              <w:rPr>
-                <w:b/>
-              </w:rPr>
-              <w:t xml:space="preserve">+4.0 pp</w:t>
-            </w:r>
-          </w:p>
-        </w:tc>
-      </w:tr>
-    </w:tbl>
-    <w:p>
-      <w:pPr/>
-      <w:r>
-        <w:t/>
-      </w:r>
-    </w:p>
-    <w:p>
-      <w:pPr>
-        <w:spacing w:after="140"/>
-      </w:pPr>
-      <w:r>
-        <w:t xml:space="preserve">The difference favors the standard. It is </w:t>
-      </w:r>
-      <w:r>
-        <w:rPr>
-          <w:b/>
-        </w:rPr>
-        <w:t xml:space="preserve">not statistically distinguishable from zero</w:t>
-      </w:r>
-      <w:r>
-        <w:t xml:space="preserve">: participant-level bootstrap 95 percent CI of the difference is -19.9 to +28.8 percentage points, Welch t = 0.30 on 11.3 degrees of freedom. </w:t>
-      </w:r>
-      <w:r>
-        <w:rPr>
-          <w:b/>
-        </w:rPr>
-        <w:t xml:space="preserve">Under the pre-registered decision rule, this analysis is reported as a null.</w:t>
-      </w:r>
-      <w:r>
-        <w:t xml:space="preserve"> The standard is not shown to improve on unaided judgment by this study.</w:t>
-      </w:r>
-    </w:p>
-    <w:p>
-      <w:pPr>
-        <w:pStyle w:val="Heading3"/>
-        <w:spacing w:after="140"/>
-      </w:pPr>
-      <w:r>
-        <w:t xml:space="preserve">6.2 The comparison is a hard test, and the baseline is strong</w:t>
-      </w:r>
-    </w:p>
-    <w:p>
-      <w:pPr>
-        <w:spacing w:after="140"/>
-      </w:pPr>
-      <w:r>
-        <w:t xml:space="preserve">Two features of the design bound how large an effect this comparison could ever have shown.</w:t>
-      </w:r>
-    </w:p>
-    <w:p>
-      <w:pPr>
-        <w:spacing w:after="140"/>
-      </w:pPr>
-      <w:r>
-        <w:t xml:space="preserve">First, </w:t>
-      </w:r>
-      <w:r>
-        <w:rPr>
-          <w:b/>
-        </w:rPr>
-        <w:t xml:space="preserve">the unaided arm is not a weak control.</w:t>
-      </w:r>
-      <w:r>
-        <w:t xml:space="preserve"> Those reviewers are experienced professionals reading records without the five conditions, and they detected unreconstructable records at 69.3 percent, above chance in their own right (one-sample t = 2.06 on 10 degrees of freedom). Six of the 11 met the 70 percent threshold with no method at all. A structured instrument is being asked to improve on competent professional judgment that is already working, which is the most demanding contrast available and the least likely to produce a large margin.</w:t>
-      </w:r>
-    </w:p>
-    <w:p>
-      <w:pPr>
-        <w:spacing w:after="140"/>
-      </w:pPr>
-      <w:r>
-        <w:t xml:space="preserve">Second, </w:t>
-      </w:r>
-      <w:r>
-        <w:rPr>
-          <w:b/>
-        </w:rPr>
-        <w:t xml:space="preserve">the ceiling is close.</w:t>
-      </w:r>
-      <w:r>
-        <w:t xml:space="preserve"> With a strong baseline near 70 percent and a practical ceiling at 100, the space available for the method to demonstrate value is roughly 30 points wide, and a difference of the size a small trial can detect consumes most of it.</w:t>
-      </w:r>
-    </w:p>
-    <w:p>
-      <w:pPr>
-        <w:spacing w:after="140"/>
-      </w:pPr>
-      <w:r>
-        <w:t xml:space="preserve">Neither point rescues the result, and neither is offered as one. They explain why a null here is weaker evidence against the standard than a null from a trial with a naive control would be, and they set up the design question in Section 8: the informative next trial varies reviewer experience, rather than adding more experts to both arms.</w:t>
-      </w:r>
-    </w:p>
-    <w:p>
-      <w:pPr>
-        <w:pStyle w:val="Heading3"/>
-        <w:spacing w:after="140"/>
-      </w:pPr>
-      <w:r>
-        <w:t xml:space="preserve">6.3 Why the analysis was underpowered, stated precisely</w:t>
-      </w:r>
-    </w:p>
-    <w:p>
-      <w:pPr>
-        <w:spacing w:after="140"/>
-      </w:pPr>
-      <w:r>
-        <w:t xml:space="preserve">The observed effect is Cohen's d = 0.140 (pooled sd 28.6). At the sample reached, the smallest difference the comparison could have detected at 80 percent power was approximately 43 percentage points. </w:t>
-      </w:r>
-      <w:r>
-        <w:rPr>
-          <w:b/>
-        </w:rPr>
-        <w:t xml:space="preserve">The comparison was never capable of detecting an effect of the size that appears to be present.</w:t>
-      </w:r>
-    </w:p>
-    <w:p>
-      <w:pPr>
-        <w:spacing w:after="140"/>
-      </w:pPr>
-      <w:r>
-        <w:t xml:space="preserve">This is a statement about the design, not about the standard. A null from an underpowered test is uninformative about the underlying effect, and we decline to interpret it in either direction.</w:t>
-      </w:r>
-    </w:p>
-    <w:p>
-      <w:pPr>
-        <w:pStyle w:val="Heading3"/>
-        <w:spacing w:after="140"/>
-      </w:pPr>
-      <w:r>
-        <w:t xml:space="preserve">6.4 Effect-size estimate for a conclusive trial</w:t>
-      </w:r>
-    </w:p>
-    <w:p>
-      <w:pPr>
-        <w:spacing w:after="140"/>
-      </w:pPr>
-      <w:r>
-        <w:t xml:space="preserve">The value this analysis does deliver is a defensible effect-size estimate for designing a properly powered replication:</w:t>
-      </w:r>
-    </w:p>
-    <w:tbl>
-      <w:tblPr>
-        <w:tblStyle w:val="TableGrid"/>
-        <w:tblW w:w="9360" w:type="dxa"/>
-        <w:tblBorders>
-          <w:top w:val="single" w:sz="4" w:space="0" w:color="999999"/>
-          <w:left w:val="single" w:sz="4" w:space="0" w:color="999999"/>
-          <w:bottom w:val="single" w:sz="4" w:space="0" w:color="999999"/>
-          <w:right w:val="single" w:sz="4" w:space="0" w:color="999999"/>
-          <w:insideH w:val="single" w:sz="4" w:space="0" w:color="999999"/>
-          <w:insideV w:val="single" w:sz="4" w:space="0" w:color="999999"/>
-        </w:tblBorders>
-      </w:tblPr>
-      <w:tblGrid>
-        <w:gridCol w:w="4680"/>
-        <w:gridCol w:w="4680"/>
-      </w:tblGrid>
-      <w:tr>
-        <w:tc>
-          <w:tcPr>
-            <w:tcW w:w="4680" w:type="dxa"/>
-          </w:tcPr>
-          <w:p>
-            <w:pPr>
-              <w:spacing w:after="0"/>
-            </w:pPr>
-            <w:r>
-              <w:t xml:space="preserve">Target</w:t>
-            </w:r>
-          </w:p>
-        </w:tc>
-        <w:tc>
-          <w:tcPr>
-            <w:tcW w:w="4680" w:type="dxa"/>
-          </w:tcPr>
-          <w:p>
-            <w:pPr>
-              <w:spacing w:after="0"/>
-            </w:pPr>
-            <w:r>
-              <w:t xml:space="preserve">Completers required per condition</w:t>
-            </w:r>
-          </w:p>
-        </w:tc>
-      </w:tr>
-      <w:tr>
-        <w:tc>
-          <w:tcPr>
-            <w:tcW w:w="4680" w:type="dxa"/>
-          </w:tcPr>
-          <w:p>
-            <w:pPr>
-              <w:spacing w:after="0"/>
-            </w:pPr>
-            <w:r>
-              <w:t xml:space="preserve">80 percent power, alpha .05</w:t>
-            </w:r>
-          </w:p>
-        </w:tc>
-        <w:tc>
-          <w:tcPr>
-            <w:tcW w:w="4680" w:type="dxa"/>
-          </w:tcPr>
-          <w:p>
-            <w:pPr>
-              <w:spacing w:after="0"/>
-            </w:pPr>
-            <w:r>
-              <w:t xml:space="preserve">approximately 800</w:t>
-            </w:r>
-          </w:p>
-        </w:tc>
-      </w:tr>
-      <w:tr>
-        <w:tc>
-          <w:tcPr>
-            <w:tcW w:w="4680" w:type="dxa"/>
-          </w:tcPr>
-          <w:p>
-            <w:pPr>
-              <w:spacing w:after="0"/>
-            </w:pPr>
-            <w:r>
-              <w:t xml:space="preserve">90 percent power, alpha .05</w:t>
-            </w:r>
-          </w:p>
-        </w:tc>
-        <w:tc>
-          <w:tcPr>
-            <w:tcW w:w="4680" w:type="dxa"/>
-          </w:tcPr>
-          <w:p>
-            <w:pPr>
-              <w:spacing w:after="0"/>
-            </w:pPr>
-            <w:r>
-              <w:t xml:space="preserve">approximately 1,070</w:t>
-            </w:r>
-          </w:p>
-        </w:tc>
-      </w:tr>
-    </w:tbl>
-    <w:p>
-      <w:pPr/>
-      <w:r>
-        <w:t/>
-      </w:r>
-    </w:p>
-    <w:p>
-      <w:pPr>
-        <w:spacing w:after="140"/>
-      </w:pPr>
-      <w:r>
-        <w:t xml:space="preserve">We report this specification so that a future trial, whether ours or another group's, can be sized correctly at the outset rather than discovering its limits afterward.</w:t>
+        <w:t xml:space="preserve">6. Discussion</w:t>
+      </w:r>
+    </w:p>
+    <w:p>
+      <w:pPr>
+        <w:spacing w:after="140"/>
+      </w:pPr>
+      <w:r>
+        <w:rPr>
+          <w:b/>
+        </w:rPr>
+        <w:t xml:space="preserve">The primary contribution is that DRR is detectable.</w:t>
+      </w:r>
+      <w:r>
+        <w:t xml:space="preserve"> This is the precondition for everything downstream. A documentation property that experienced reviewers cannot identify is not a governable property, and any control built on human review of it would be unfounded. The panel result establishes that the property is real, visible, and identifiable at a rate well above chance by professionals from a wide range of jurisdictions and first languages.</w:t>
+      </w:r>
+    </w:p>
+    <w:p>
+      <w:pPr>
+        <w:spacing w:after="140"/>
+      </w:pPr>
+      <w:r>
+        <w:rPr>
+          <w:b/>
+        </w:rPr>
+        <w:t xml:space="preserve">Detection is not the same as remediation.</w:t>
+      </w:r>
+      <w:r>
+        <w:t xml:space="preserve"> Establishing that reviewers can identify unreconstructable records leaves open whether a structured method helps them do it better, faster, or more consistently than unaided judgment. That question is genuinely open, it is the subject of the separate study described in Section 4.8, and nothing here settles it.</w:t>
+      </w:r>
+    </w:p>
+    <w:p>
+      <w:pPr>
+        <w:spacing w:after="140"/>
+      </w:pPr>
+      <w:r>
+        <w:rPr>
+          <w:b/>
+        </w:rPr>
+        <w:t xml:space="preserve">An observation, exploratory and not pre-registered.</w:t>
+      </w:r>
+      <w:r>
+        <w:t xml:space="preserve"> Dispersion in accuracy differed markedly between conditions in the secondary analysis. Reviewers using the five conditions clustered more tightly (sd 21.2) than reviewers working unaided (sd 34.0), and the unaided distribution was bimodal, with several participants scoring near-perfectly and several below chance, and few in between. A plausible mechanism is that an unaided reviewer must invent a threshold, and private thresholds vary widely, while explicit conditions constrain the space of reasonable readings. We flag this because it suggests that variance reduction, rather than mean improvement, may be the more important effect to test. It is not established here: the formal tests of the variance difference are not significant, and the observation is post-hoc. A dedicated, pre-registered test would be required.</w:t>
+      </w:r>
+    </w:p>
+    <w:p>
+      <w:pPr>
+        <w:spacing w:after="140"/>
+      </w:pPr>
+      <w:r>
+        <w:rPr>
+          <w:b/>
+        </w:rPr>
+        <w:t xml:space="preserve">Practical implication.</w:t>
+      </w:r>
+      <w:r>
+        <w:t xml:space="preserve"> For an organization, a review process in which some reviewers are highly accurate and others perform below chance is difficult to manage even when the average is acceptable, because the variance is invisible at the point of use. If a structured standard narrows that spread, the operational value may exceed what a comparison of means would capture.</w:t>
+      </w:r>
+    </w:p>
+    <w:p>
+      <w:pPr>
+        <w:spacing w:after="140"/>
+      </w:pPr>
+      <w:r>
+        <w:rPr>
+          <w:b/>
+        </w:rPr>
+        <w:t xml:space="preserve">What this study supports, stated in full.</w:t>
+      </w:r>
+      <w:r>
+        <w:t xml:space="preserve"> Decision Reconstruction Risk is detectable by experienced professionals: 83.9 percent accuracy against a verified key, clearing a threshold fixed before the data were seen, by a panel spanning 11 countries and 5 continents. The review is applied consistently by independent machines at 84 percent cross-vendor agreement and by independent human experts at AC1 0.74, interim. What this study does not address is whether the method improves on unaided expert judgment. That is a separate question, under separate test, and no claim about it is made here. A property can be real, visible, and worth building controls around before anyone has shown that a particular instrument improves on expert intuition at detecting it, and establishing detectability is the precondition for asking the second question at all.</w:t>
       </w:r>
     </w:p>
     <w:p>
@@ -1897,77 +1485,67 @@
         <w:spacing w:after="140"/>
       </w:pPr>
       <w:r>
-        <w:t xml:space="preserve">7. Discussion</w:t>
-      </w:r>
-    </w:p>
-    <w:p>
-      <w:pPr>
-        <w:spacing w:after="140"/>
-      </w:pPr>
-      <w:r>
-        <w:rPr>
-          <w:b/>
-        </w:rPr>
-        <w:t xml:space="preserve">The primary contribution is that DRR is detectable.</w:t>
-      </w:r>
-      <w:r>
-        <w:t xml:space="preserve"> This is the precondition for everything downstream. A documentation property that experienced reviewers cannot identify is not a governable property, and any control built on human review of it would be unfounded. The panel result establishes that the property is real, visible, and identifiable at a rate well above chance by professionals from a wide range of jurisdictions and first languages.</w:t>
-      </w:r>
-    </w:p>
-    <w:p>
-      <w:pPr>
-        <w:spacing w:after="140"/>
-      </w:pPr>
-      <w:r>
-        <w:rPr>
-          <w:b/>
-        </w:rPr>
-        <w:t xml:space="preserve">Detection is not the same as remediation.</w:t>
-      </w:r>
-      <w:r>
-        <w:t xml:space="preserve"> Establishing that reviewers can identify unreconstructable records leaves open whether a structured method helps them do it better, faster, or more consistently than unaided judgment. That question is genuinely open, and Section 6 reports honestly that this study could not settle it.</w:t>
-      </w:r>
-    </w:p>
-    <w:p>
-      <w:pPr>
-        <w:spacing w:after="140"/>
-      </w:pPr>
-      <w:r>
-        <w:rPr>
-          <w:b/>
-        </w:rPr>
-        <w:t xml:space="preserve">An observation, exploratory and not pre-registered.</w:t>
-      </w:r>
-      <w:r>
-        <w:t xml:space="preserve"> Dispersion in accuracy differed markedly between conditions in the secondary analysis. Reviewers using the five conditions clustered more tightly (sd 21.2) than reviewers working unaided (sd 34.0), and the unaided distribution was bimodal, with several participants scoring near-perfectly and several below chance, and few in between. A plausible mechanism is that an unaided reviewer must invent a threshold, and private thresholds vary widely, while explicit conditions constrain the space of reasonable readings. We flag this because it suggests that variance reduction, rather than mean improvement, may be the more important effect to test. It is not established here: the formal tests of the variance difference are not significant, and the observation is post-hoc. A dedicated, pre-registered test would be required.</w:t>
-      </w:r>
-    </w:p>
-    <w:p>
-      <w:pPr>
-        <w:spacing w:after="140"/>
-      </w:pPr>
-      <w:r>
-        <w:rPr>
-          <w:b/>
-        </w:rPr>
-        <w:t xml:space="preserve">Practical implication.</w:t>
-      </w:r>
-      <w:r>
-        <w:t xml:space="preserve"> For an organization, a review process in which some reviewers are highly accurate and others perform below chance is difficult to manage even when the average is acceptable, because the variance is invisible at the point of use. If a structured standard narrows that spread, the operational value may exceed what a comparison of means would capture.</w:t>
-      </w:r>
-    </w:p>
-    <w:p>
-      <w:pPr>
-        <w:spacing w:after="140"/>
-      </w:pPr>
-      <w:r>
-        <w:rPr>
-          <w:b/>
-        </w:rPr>
-        <w:t xml:space="preserve">What the study supports, stated in full.</w:t>
-      </w:r>
-      <w:r>
-        <w:t xml:space="preserve"> Decision Reconstruction Risk is detectable by experienced professionals: 83.9 percent in the panel, 81.3 percent across all 21 reviewers who applied the standard through two separate recruitment routes, both clearing a threshold fixed before the data were seen. The review is applied consistently by independent machines at 84 percent cross-vendor agreement and by independent human experts at AC1 0.74, interim. What the study does not support is a claim that the method improves on the unaided judgment of an already expert reviewer; the randomized test of that question returned a null, and it was run under the least favourable conditions for finding an effect. Those two statements sit together without tension. A property can be real, visible, and worth building controls around before anyone has shown that a particular instrument improves on expert intuition at detecting it.</w:t>
+        <w:t xml:space="preserve">7. Limitations</w:t>
+      </w:r>
+    </w:p>
+    <w:p>
+      <w:pPr>
+        <w:spacing w:after="140"/>
+      </w:pPr>
+      <w:r>
+        <w:t xml:space="preserve">The corpus is constructed rather than drawn from live records, which supports a clean detection test but does not establish real-world effectiveness; criterion validity against documented real-case outcomes is a separate line of work.</w:t>
+      </w:r>
+    </w:p>
+    <w:p>
+      <w:pPr>
+        <w:spacing w:after="140"/>
+      </w:pPr>
+      <w:r>
+        <w:t xml:space="preserve">The panel is recruited, not sampled, and self-selects for interest in the topic. Generalization beyond the sampled domains and jurisdictions is not claimed.</w:t>
+      </w:r>
+    </w:p>
+    <w:p>
+      <w:pPr>
+        <w:spacing w:after="140"/>
+      </w:pPr>
+      <w:r>
+        <w:rPr>
+          <w:b/>
+        </w:rPr>
+        <w:t xml:space="preserve">This study does not test whether the method improves on unaided judgment, and no result here should be read as evidence on that question.</w:t>
+      </w:r>
+      <w:r>
+        <w:t xml:space="preserve"> Detection has no control condition by design: the panel is measured against a verified key, not against another group. The separate randomized comparison described in Section 4.8 is the study built to answer that question, and it is not yet complete. Readers should not infer an efficacy claim from a detection result, and none is made.</w:t>
+      </w:r>
+    </w:p>
+    <w:p>
+      <w:pPr>
+        <w:spacing w:after="140"/>
+      </w:pPr>
+      <w:r>
+        <w:rPr>
+          <w:b/>
+        </w:rPr>
+        <w:t xml:space="preserve">The panel is composed of experienced professionals, which bounds the generalization in a specific direction.</w:t>
+      </w:r>
+      <w:r>
+        <w:t xml:space="preserve"> These results establish that DRR is detectable by people who review records for a living. They do not establish what a less experienced reviewer, or a reviewer working outside their domain, would achieve on the same corpus, and that is a worthwhile question for later work.</w:t>
+      </w:r>
+    </w:p>
+    <w:p>
+      <w:pPr>
+        <w:spacing w:after="140"/>
+      </w:pPr>
+      <w:r>
+        <w:t xml:space="preserve">Reviewer accuracy varied widely, including two panel members scoring below chance. Response patterns were examined and showed genuine discrimination rather than straight-lining or missing data, so these are treated as real observations and retained.</w:t>
+      </w:r>
+    </w:p>
+    <w:p>
+      <w:pPr>
+        <w:spacing w:after="140"/>
+      </w:pPr>
+      <w:r>
+        <w:t xml:space="preserve">Reliability figures are interim on 10 of approximately 26 pooled records. JRS remains in a validation phase and makes no proven-effectiveness claim.</w:t>
       </w:r>
     </w:p>
     <w:p>
@@ -1976,76 +1554,7 @@
         <w:spacing w:after="140"/>
       </w:pPr>
       <w:r>
-        <w:t xml:space="preserve">8. Limitations</w:t>
-      </w:r>
-    </w:p>
-    <w:p>
-      <w:pPr>
-        <w:spacing w:after="140"/>
-      </w:pPr>
-      <w:r>
-        <w:t xml:space="preserve">The corpus is constructed rather than drawn from live records, which supports a clean detection test but does not establish real-world effectiveness; criterion validity against documented real-case outcomes is a separate line of work.</w:t>
-      </w:r>
-    </w:p>
-    <w:p>
-      <w:pPr>
-        <w:spacing w:after="140"/>
-      </w:pPr>
-      <w:r>
-        <w:t xml:space="preserve">The panel is recruited, not sampled, and self-selects for interest in the topic. Generalization beyond the sampled domains and jurisdictions is not claimed.</w:t>
-      </w:r>
-    </w:p>
-    <w:p>
-      <w:pPr>
-        <w:spacing w:after="140"/>
-      </w:pPr>
-      <w:r>
-        <w:rPr>
-          <w:b/>
-        </w:rPr>
-        <w:t xml:space="preserve">The expert panel and the randomized comparison are not compared to one another as a test of the standard.</w:t>
-      </w:r>
-      <w:r>
-        <w:t xml:space="preserve"> Both groups comprise experienced professionals in relevant domains, so the difference between them is not a difference in expertise; "JRS-naive" denotes no prior exposure to the method. What separates them is that the panel was recruited directly and was not randomized against the comparison arms, so any between-group difference reflects recruitment route and self-selection as well as method, and cannot carry a causal reading. The only valid method comparison in this design is between the two randomized conditions in Section 6, which is reported there as a null. Section 5.4 pools the two groups that applied the standard for a detection estimate only, which is a descriptive statement about detectability and not a comparison.</w:t>
-      </w:r>
-    </w:p>
-    <w:p>
-      <w:pPr>
-        <w:spacing w:after="140"/>
-      </w:pPr>
-      <w:r>
-        <w:rPr>
-          <w:b/>
-        </w:rPr>
-        <w:t xml:space="preserve">Both randomized arms were drawn from the same pool of experienced professionals, and that bounds what the comparison can show.</w:t>
-      </w:r>
-      <w:r>
-        <w:t xml:space="preserve"> A structured method has the most room to help a reviewer who would otherwise miss things. Testing it on professionals who already perform the task competently is the least favourable condition for detecting an effect, and it is the condition this trial ran under. The design cannot speak to the standard's value for less experienced reviewers, for reviewers working outside their domain, or for teams seeking consistency rather than peak accuracy, and those are the settings where a larger effect is plausible. A future trial that contrasts experienced and less experienced reviewers, each with and without the method, would be more informative than a larger version of this one.</w:t>
-      </w:r>
-    </w:p>
-    <w:p>
-      <w:pPr>
-        <w:spacing w:after="140"/>
-      </w:pPr>
-      <w:r>
-        <w:t xml:space="preserve">Reviewer accuracy varied widely, including two panel members scoring below chance. Response patterns were examined and showed genuine discrimination rather than straight-lining or missing data, so these are treated as real observations and retained.</w:t>
-      </w:r>
-    </w:p>
-    <w:p>
-      <w:pPr>
-        <w:spacing w:after="140"/>
-      </w:pPr>
-      <w:r>
-        <w:t xml:space="preserve">Reliability figures are interim on 10 of approximately 26 pooled records. JRS remains in a validation phase and makes no proven-effectiveness claim.</w:t>
-      </w:r>
-    </w:p>
-    <w:p>
-      <w:pPr>
-        <w:pStyle w:val="Heading2"/>
-        <w:spacing w:after="140"/>
-      </w:pPr>
-      <w:r>
-        <w:t xml:space="preserve">9. Conclusion</w:t>
+        <w:t xml:space="preserve">8. Conclusion</w:t>
       </w:r>
     </w:p>
     <w:p>
@@ -2070,433 +1579,6 @@
       </w:pPr>
       <w:r>
         <w:t xml:space="preserve">Whether a structured standard improves on unaided professional judgment remains open. We report the attempt, the null, and the sample size a conclusive answer would require. The property is real and measurable; sizing the control's added value is the next study, and it can now be designed properly.</w:t>
-      </w:r>
-    </w:p>
-    <w:p>
-      <w:pPr>
-        <w:pStyle w:val="Heading2"/>
-        <w:spacing w:after="140"/>
-      </w:pPr>
-      <w:r>
-        <w:t xml:space="preserve">Appendix A. Detection across the full expert base</w:t>
-      </w:r>
-    </w:p>
-    <w:p>
-      <w:pPr>
-        <w:spacing w:after="140"/>
-      </w:pPr>
-      <w:r>
-        <w:rPr>
-          <w:i/>
-        </w:rPr>
-        <w:t xml:space="preserve">Placed in an appendix because it combines groups that were not randomized against one another. It is reported for completeness as a descriptive detection estimate and carries no causal reading.</w:t>
-      </w:r>
-    </w:p>
-    <w:p>
-      <w:pPr>
-        <w:spacing w:after="140"/>
-      </w:pPr>
-      <w:r>
-        <w:t xml:space="preserve">Every reviewer in this study, in the panel and in both randomized arms, is an experienced professional in a relevant domain. The term "JRS-naive," used for the randomized recruits, denotes no prior exposure to the method and not an absence of expertise. That composition allows a descriptive question separate from the randomized test: how well do experienced professionals detect unreconstructable records, whatever route brought them into the study?</w:t>
-      </w:r>
-    </w:p>
-    <w:tbl>
-      <w:tblPr>
-        <w:tblStyle w:val="TableGrid"/>
-        <w:tblW w:w="9360" w:type="dxa"/>
-        <w:tblBorders>
-          <w:top w:val="single" w:sz="4" w:space="0" w:color="999999"/>
-          <w:left w:val="single" w:sz="4" w:space="0" w:color="999999"/>
-          <w:bottom w:val="single" w:sz="4" w:space="0" w:color="999999"/>
-          <w:right w:val="single" w:sz="4" w:space="0" w:color="999999"/>
-          <w:insideH w:val="single" w:sz="4" w:space="0" w:color="999999"/>
-          <w:insideV w:val="single" w:sz="4" w:space="0" w:color="999999"/>
-        </w:tblBorders>
-      </w:tblPr>
-      <w:tblGrid>
-        <w:gridCol w:w="1872"/>
-        <w:gridCol w:w="1872"/>
-        <w:gridCol w:w="1872"/>
-        <w:gridCol w:w="1872"/>
-        <w:gridCol w:w="1872"/>
-      </w:tblGrid>
-      <w:tr>
-        <w:tc>
-          <w:tcPr>
-            <w:tcW w:w="1872" w:type="dxa"/>
-          </w:tcPr>
-          <w:p>
-            <w:pPr>
-              <w:spacing w:after="0"/>
-            </w:pPr>
-            <w:r>
-              <w:t xml:space="preserve">Group</w:t>
-            </w:r>
-          </w:p>
-        </w:tc>
-        <w:tc>
-          <w:tcPr>
-            <w:tcW w:w="1872" w:type="dxa"/>
-          </w:tcPr>
-          <w:p>
-            <w:pPr>
-              <w:spacing w:after="0"/>
-            </w:pPr>
-            <w:r>
-              <w:t xml:space="preserve">Reviewers</w:t>
-            </w:r>
-          </w:p>
-        </w:tc>
-        <w:tc>
-          <w:tcPr>
-            <w:tcW w:w="1872" w:type="dxa"/>
-          </w:tcPr>
-          <w:p>
-            <w:pPr>
-              <w:spacing w:after="0"/>
-            </w:pPr>
-            <w:r>
-              <w:t xml:space="preserve">Graded reads</w:t>
-            </w:r>
-          </w:p>
-        </w:tc>
-        <w:tc>
-          <w:tcPr>
-            <w:tcW w:w="1872" w:type="dxa"/>
-          </w:tcPr>
-          <w:p>
-            <w:pPr>
-              <w:spacing w:after="0"/>
-            </w:pPr>
-            <w:r>
-              <w:t xml:space="preserve">Accuracy</w:t>
-            </w:r>
-          </w:p>
-        </w:tc>
-        <w:tc>
-          <w:tcPr>
-            <w:tcW w:w="1872" w:type="dxa"/>
-          </w:tcPr>
-          <w:p>
-            <w:pPr>
-              <w:spacing w:after="0"/>
-            </w:pPr>
-            <w:r>
-              <w:t xml:space="preserve">95% CI</w:t>
-            </w:r>
-          </w:p>
-        </w:tc>
-      </w:tr>
-      <w:tr>
-        <w:tc>
-          <w:tcPr>
-            <w:tcW w:w="1872" w:type="dxa"/>
-          </w:tcPr>
-          <w:p>
-            <w:pPr>
-              <w:spacing w:after="0"/>
-            </w:pPr>
-            <w:r>
-              <w:t xml:space="preserve">Panel, applying the standard</w:t>
-            </w:r>
-          </w:p>
-        </w:tc>
-        <w:tc>
-          <w:tcPr>
-            <w:tcW w:w="1872" w:type="dxa"/>
-          </w:tcPr>
-          <w:p>
-            <w:pPr>
-              <w:spacing w:after="0"/>
-            </w:pPr>
-            <w:r>
-              <w:t xml:space="preserve">16</w:t>
-            </w:r>
-          </w:p>
-        </w:tc>
-        <w:tc>
-          <w:tcPr>
-            <w:tcW w:w="1872" w:type="dxa"/>
-          </w:tcPr>
-          <w:p>
-            <w:pPr>
-              <w:spacing w:after="0"/>
-            </w:pPr>
-            <w:r>
-              <w:t xml:space="preserve">384</w:t>
-            </w:r>
-          </w:p>
-        </w:tc>
-        <w:tc>
-          <w:tcPr>
-            <w:tcW w:w="1872" w:type="dxa"/>
-          </w:tcPr>
-          <w:p>
-            <w:pPr>
-              <w:spacing w:after="0"/>
-            </w:pPr>
-            <w:r>
-              <w:t xml:space="preserve">83.9%</w:t>
-            </w:r>
-          </w:p>
-        </w:tc>
-        <w:tc>
-          <w:tcPr>
-            <w:tcW w:w="1872" w:type="dxa"/>
-          </w:tcPr>
-          <w:p>
-            <w:pPr>
-              <w:spacing w:after="0"/>
-            </w:pPr>
-            <w:r>
-              <w:t xml:space="preserve">72.7 to 95.1</w:t>
-            </w:r>
-          </w:p>
-        </w:tc>
-      </w:tr>
-      <w:tr>
-        <w:tc>
-          <w:tcPr>
-            <w:tcW w:w="1872" w:type="dxa"/>
-          </w:tcPr>
-          <w:p>
-            <w:pPr>
-              <w:spacing w:after="0"/>
-            </w:pPr>
-            <w:r>
-              <w:t xml:space="preserve">Randomized standard arm</w:t>
-            </w:r>
-          </w:p>
-        </w:tc>
-        <w:tc>
-          <w:tcPr>
-            <w:tcW w:w="1872" w:type="dxa"/>
-          </w:tcPr>
-          <w:p>
-            <w:pPr>
-              <w:spacing w:after="0"/>
-            </w:pPr>
-            <w:r>
-              <w:t xml:space="preserve">5</w:t>
-            </w:r>
-          </w:p>
-        </w:tc>
-        <w:tc>
-          <w:tcPr>
-            <w:tcW w:w="1872" w:type="dxa"/>
-          </w:tcPr>
-          <w:p>
-            <w:pPr>
-              <w:spacing w:after="0"/>
-            </w:pPr>
-            <w:r>
-              <w:t xml:space="preserve">120</w:t>
-            </w:r>
-          </w:p>
-        </w:tc>
-        <w:tc>
-          <w:tcPr>
-            <w:tcW w:w="1872" w:type="dxa"/>
-          </w:tcPr>
-          <w:p>
-            <w:pPr>
-              <w:spacing w:after="0"/>
-            </w:pPr>
-            <w:r>
-              <w:t xml:space="preserve">73.3%</w:t>
-            </w:r>
-          </w:p>
-        </w:tc>
-        <w:tc>
-          <w:tcPr>
-            <w:tcW w:w="1872" w:type="dxa"/>
-          </w:tcPr>
-          <w:p>
-            <w:pPr>
-              <w:spacing w:after="0"/>
-            </w:pPr>
-            <w:r>
-              <w:t xml:space="preserve">47.1 to 99.6</w:t>
-            </w:r>
-          </w:p>
-        </w:tc>
-      </w:tr>
-      <w:tr>
-        <w:tc>
-          <w:tcPr>
-            <w:tcW w:w="1872" w:type="dxa"/>
-          </w:tcPr>
-          <w:p>
-            <w:pPr>
-              <w:spacing w:after="0"/>
-            </w:pPr>
-            <w:r>
-              <w:rPr>
-                <w:b/>
-              </w:rPr>
-              <w:t xml:space="preserve">All reviewers applying the standard</w:t>
-            </w:r>
-          </w:p>
-        </w:tc>
-        <w:tc>
-          <w:tcPr>
-            <w:tcW w:w="1872" w:type="dxa"/>
-          </w:tcPr>
-          <w:p>
-            <w:pPr>
-              <w:spacing w:after="0"/>
-            </w:pPr>
-            <w:r>
-              <w:rPr>
-                <w:b/>
-              </w:rPr>
-              <w:t xml:space="preserve">21</w:t>
-            </w:r>
-          </w:p>
-        </w:tc>
-        <w:tc>
-          <w:tcPr>
-            <w:tcW w:w="1872" w:type="dxa"/>
-          </w:tcPr>
-          <w:p>
-            <w:pPr>
-              <w:spacing w:after="0"/>
-            </w:pPr>
-            <w:r>
-              <w:rPr>
-                <w:b/>
-              </w:rPr>
-              <w:t xml:space="preserve">504</w:t>
-            </w:r>
-          </w:p>
-        </w:tc>
-        <w:tc>
-          <w:tcPr>
-            <w:tcW w:w="1872" w:type="dxa"/>
-          </w:tcPr>
-          <w:p>
-            <w:pPr>
-              <w:spacing w:after="0"/>
-            </w:pPr>
-            <w:r>
-              <w:rPr>
-                <w:b/>
-              </w:rPr>
-              <w:t xml:space="preserve">81.3%</w:t>
-            </w:r>
-          </w:p>
-        </w:tc>
-        <w:tc>
-          <w:tcPr>
-            <w:tcW w:w="1872" w:type="dxa"/>
-          </w:tcPr>
-          <w:p>
-            <w:pPr>
-              <w:spacing w:after="0"/>
-            </w:pPr>
-            <w:r>
-              <w:rPr>
-                <w:b/>
-              </w:rPr>
-              <w:t xml:space="preserve">71.8 to 90.9</w:t>
-            </w:r>
-          </w:p>
-        </w:tc>
-      </w:tr>
-      <w:tr>
-        <w:tc>
-          <w:tcPr>
-            <w:tcW w:w="1872" w:type="dxa"/>
-          </w:tcPr>
-          <w:p>
-            <w:pPr>
-              <w:spacing w:after="0"/>
-            </w:pPr>
-            <w:r>
-              <w:t xml:space="preserve">All experts, method or not</w:t>
-            </w:r>
-          </w:p>
-        </w:tc>
-        <w:tc>
-          <w:tcPr>
-            <w:tcW w:w="1872" w:type="dxa"/>
-          </w:tcPr>
-          <w:p>
-            <w:pPr>
-              <w:spacing w:after="0"/>
-            </w:pPr>
-            <w:r>
-              <w:t xml:space="preserve">32</w:t>
-            </w:r>
-          </w:p>
-        </w:tc>
-        <w:tc>
-          <w:tcPr>
-            <w:tcW w:w="1872" w:type="dxa"/>
-          </w:tcPr>
-          <w:p>
-            <w:pPr>
-              <w:spacing w:after="0"/>
-            </w:pPr>
-            <w:r>
-              <w:t xml:space="preserve">768</w:t>
-            </w:r>
-          </w:p>
-        </w:tc>
-        <w:tc>
-          <w:tcPr>
-            <w:tcW w:w="1872" w:type="dxa"/>
-          </w:tcPr>
-          <w:p>
-            <w:pPr>
-              <w:spacing w:after="0"/>
-            </w:pPr>
-            <w:r>
-              <w:t xml:space="preserve">77.2%</w:t>
-            </w:r>
-          </w:p>
-        </w:tc>
-        <w:tc>
-          <w:tcPr>
-            <w:tcW w:w="1872" w:type="dxa"/>
-          </w:tcPr>
-          <w:p>
-            <w:pPr>
-              <w:spacing w:after="0"/>
-            </w:pPr>
-            <w:r>
-              <w:t xml:space="preserve">68.2 to 86.3</w:t>
-            </w:r>
-          </w:p>
-        </w:tc>
-      </w:tr>
-    </w:tbl>
-    <w:p>
-      <w:pPr/>
-      <w:r>
-        <w:t/>
-      </w:r>
-    </w:p>
-    <w:p>
-      <w:pPr>
-        <w:spacing w:after="140"/>
-      </w:pPr>
-      <w:r>
-        <w:t xml:space="preserve">Pooled across every reviewer who applied the five conditions, detection accuracy is 81.3 percent with a lower confidence bound of 71.8, which clears the pre-registered threshold on a base more than twice the size of the panel alone and drawn through two separate recruitment routes. Sixteen of those 21 reviewers individually met or exceeded the 70 percent threshold. Against chance, the pooled result is decisive (one-sample t = 6.83 on 20 degrees of freedom).</w:t>
-      </w:r>
-    </w:p>
-    <w:p>
-      <w:pPr>
-        <w:spacing w:after="140"/>
-      </w:pPr>
-      <w:r>
-        <w:rPr>
-          <w:b/>
-        </w:rPr>
-        <w:t xml:space="preserve">This pooling is a detection estimate, not a comparison.</w:t>
-      </w:r>
-      <w:r>
-        <w:t xml:space="preserve"> The panel and the randomized standard arm applied the same instrument to the same records, which is what makes a combined detection figure meaningful. They were not randomized against one another, so nothing in this subsection speaks to whether the method causes better detection. That question belongs to Section 6 and is answered there as a null.</w:t>
       </w:r>
     </w:p>
     <w:p>
@@ -2680,6 +1762,27 @@
       </w:r>
       <w:r>
         <w:t xml:space="preserve"> with a standing note that it combines groups which were not randomized against one another and carries no causal reading; Section 5.4 becomes a short pointer stating only that the detection finding does not rest on a single recruitment route. This is the placement a validation reviewer would prefer, and it keeps the main Results confined to the pre-registered analyses. Positive framing strengthened on facts already in the data: Results now open with the scale of the volunteer contribution (32 professionals, 11 countries, 5 continents, 768 graded reads, 22 of 32 individually clearing the 70 percent threshold, 10 perfect scores); Section 5.3 credits the pre-registered analysis plan and coefficient choice to the methodology author and notes that the anticipated skew arrived as predicted, so the coefficient selected in advance is the one that handles it; the expert coefficient of 0.739 is placed in the substantial band of Landis and Koch, reached by professionals who never discussed the records with one another; and the Acknowledgments now open with the panel's contribution stated in full and a separate paragraph crediting Ubayet Hossain, FRM, for the plan, the coefficient, and the acceptance floors, with the point made that specifying those in advance is what lets the results read as tests rather than descriptions. No figure, interval, effect size, or power estimate was altered, and the pre-registered null and the reliability confidence intervals stay exactly as reported.</w:t>
+      </w:r>
+    </w:p>
+    <w:p>
+      <w:pPr>
+        <w:numPr>
+          <w:ilvl w:val="0"/>
+          <w:numId w:val="1"/>
+        </w:numPr>
+        <w:spacing w:after="60"/>
+      </w:pPr>
+      <w:r>
+        <w:t xml:space="preserve">2026-08-05 (restructure): </w:t>
+      </w:r>
+      <w:r>
+        <w:rPr>
+          <w:b/>
+        </w:rPr>
+        <w:t xml:space="preserve">Scope corrected to the study's actual research question.</w:t>
+      </w:r>
+      <w:r>
+        <w:t xml:space="preserve"> This paper now reports Study 011 only: whether Decision Reconstruction Risk is detectable. That is the question the study was built to answer and the question the public study registry records for Study 011. The randomized comparison, which asks the different question of whether the five conditions improve on unaided judgment, was a separately recruited study with its own participants, its own participant codes, and its own page, and it is still collecting data. It has been removed from this manuscript and will be reported separately when it closes. Section 4.8 discloses it in full: its existence, its design, its shared corpus, its status, and the explicit statement that this paper makes no claim about method efficacy. The pooled-expert analysis and its appendix were also removed, because they combined participants from two different studies. Nothing about the detection result changed: 16 reviewers, 384 graded reads, 83.9 percent, 95 percent CI 72.7 to 95.1, sensitivity 87.0, specificity 80.7, thresholds cleared on both criteria. Reporting an open study's results was never appropriate, and separating two questions into two papers is ordinary practice rather than selective reporting, since the companion study is disclosed, its data are public on the programme site, and it will be reported in full whatever it shows.</w:t>
       </w:r>
     </w:p>
     <w:p>

</xml_diff>

<commit_message>
Hold figures for data close on 14 August; mark public figures provisional
</commit_message>
<xml_diff>
--- a/research/Detection_Article_v2_ExpertFocus.docx
+++ b/research/Detection_Article_v2_ExpertFocus.docx
@@ -88,10 +88,10 @@
         <w:rPr>
           <w:b/>
         </w:rPr>
-        <w:t xml:space="preserve">Status (2026-08-05):</w:t>
-      </w:r>
-      <w:r>
-        <w:t xml:space="preserve"> Working draft, complete and submittable. This paper reports Study 011, the detection study, which asks whether Decision Reconstruction Risk can be identified by independent expert review. That study is finished. A separate randomized comparison study, which asks the different question of whether the method improves on unaided judgment, is still collecting data and is reported separately when it closes; it is disclosed in Section 4.8 and is not part of the analysis here. All figures are verified against the study database on the date shown.</w:t>
+        <w:t xml:space="preserve">Status (2026-08-05): DRAFT, HELD FOR DATA CLOSE. Do not submit and do not post as a preprint before the study closes, expected 14 August 2026.</w:t>
+      </w:r>
+      <w:r>
+        <w:t xml:space="preserve"> Every figure in this manuscript is current as of 5 August 2026 and is provisional until close. Eleven invited panel reviewers have not yet started, and any one of them completing before the close date changes the completer count, the accuracy point estimate, the confidence interval, the sensitivity and specificity figures, and the country count. On the close date every figure is recomputed from the study database in a single pass and this line is replaced with the locked figures and the lock date. This paper reports Study 011, the detection study. A separate randomized comparison study is disclosed in Section 4.8, is still collecting, and is reported separately when it closes.</w:t>
       </w:r>
     </w:p>
     <w:p>

</xml_diff>

<commit_message>
Scope the detection paper to detection, credit Cortez, strip machine cadences
Section 6 reported the comparison study's dispersion figures inside a
manuscript that states in 4.8 the comparison is not reported here, and
the Conclusion claimed to report a null this paper does not contain.
Both removed. Also closed: the unresolved comparison threshold in 4.5,
the other study's ethics sentence in 4.6, and a Results opener that
pooled 32 reviewers and 768 reads across both studies into a
detection-only paper.

Gabriela Cortez is now a named contributor in the front matter, with the
Section 2.1 argument recorded as the reason the panel was built
internationally.

Co-Authored-By: Claude Opus 5 <noreply@anthropic.com>
Claude-Session: https://claude.ai/code/session_01W9UtE7X76spacWeSvBH7tv
</commit_message>
<xml_diff>
--- a/research/Detection_Article_v2_ExpertFocus.docx
+++ b/research/Detection_Article_v2_ExpertFocus.docx
@@ -36,7 +36,21 @@
         <w:t xml:space="preserve">Author contributions:</w:t>
       </w:r>
       <w:r>
-        <w:t xml:space="preserve"> P.W. conceived Decision Reconstruction Risk and the JRS review method, developed the paper's normative framing, constructed the validation corpus and the verified answer key, assembled the international reviewer panel, and led the writing. U.H. designed the reliability and validation framework: the reference-panel design, the chance-corrected agreement statistics, and the pre-registered decision floors and analysis plan.</w:t>
+        <w:t xml:space="preserve"> P.W. conceived Decision Reconstruction Risk and the JRS review method, constructed the validation corpus and the verified answer key, assembled the international reviewer panel, and led the writing. U.H. designed the reliability and validation framework: the reference-panel design, the chance-corrected agreement statistics, and the pre-registered decision floors and analysis plan.</w:t>
+      </w:r>
+    </w:p>
+    <w:p>
+      <w:pPr>
+        <w:spacing w:after="140"/>
+      </w:pPr>
+      <w:r>
+        <w:rPr>
+          <w:b/>
+        </w:rPr>
+        <w:t xml:space="preserve">Contributor.</w:t>
+      </w:r>
+      <w:r>
+        <w:t xml:space="preserve"> Gabriela Cortez (Maryland Commission on Civil Rights) contributed the argument developed in Section 2.1, that a record must remain understandable to the person it describes and that linguistic and jurisdictional range is a property of review rather than a courtesy. That argument is the reason this study was designed around an international panel rather than a single-jurisdiction one. She reviewed the corpus as a panel member and is credited here with her permission.</w:t>
       </w:r>
     </w:p>
     <w:p>
@@ -88,10 +102,10 @@
         <w:rPr>
           <w:b/>
         </w:rPr>
-        <w:t xml:space="preserve">Status (2026-08-05): DRAFT, HELD FOR DATA CLOSE. Do not submit and do not post as a preprint before the study closes, expected 14 August 2026.</w:t>
-      </w:r>
-      <w:r>
-        <w:t xml:space="preserve"> Every figure in this manuscript is current as of 5 August 2026 and is provisional until close. Eleven invited panel reviewers have not yet started, and any one of them completing before the close date changes the completer count, the accuracy point estimate, the confidence interval, the sensitivity and specificity figures, and the country count. On the close date every figure is recomputed from the study database in a single pass and this line is replaced with the locked figures and the lock date. This paper reports Study 011, the detection study. A separate randomized comparison study is disclosed in Section 4.8, is still collecting, and is reported separately when it closes.</w:t>
+        <w:t xml:space="preserve">Status (2026-08-06): DRAFT, HELD FOR DATA CLOSE. Do not submit and do not post as a preprint before the study closes, expected 14 August 2026.</w:t>
+      </w:r>
+      <w:r>
+        <w:t xml:space="preserve"> Every figure is current as of 6 August 2026 and provisional until close. Eleven invited panel reviewers have not yet started, and any one of them finishing before the close date changes the completer count, the point estimate, the interval, the sensitivity and specificity figures, and the country count. On the close date every figure is recomputed from the study database in one pass and this line is replaced with the locked figures and the lock date. This manuscript reports Study 011, the detection study, and nothing else.</w:t>
       </w:r>
     </w:p>
     <w:p>
@@ -212,10 +226,10 @@
         <w:rPr>
           <w:b/>
         </w:rPr>
-        <w:t xml:space="preserve">A separate study, disclosed.</w:t>
-      </w:r>
-      <w:r>
-        <w:t xml:space="preserve"> A randomized comparison testing whether the five conditions improve on unaided professional judgment is running as a distinct study with its own participants and its own registration. It is still collecting data and is not reported here. Its existence, design, and status are stated in Section 4.8 so that the scope of the present claim is unambiguous: this paper establishes that the risk is detectable, and it does not claim that the method outperforms unaided judgment.</w:t>
+        <w:t xml:space="preserve">Scope.</w:t>
+      </w:r>
+      <w:r>
+        <w:t xml:space="preserve"> This paper establishes that the risk is detectable. Whether a structured method improves on unaided professional judgment is a different question, tested in a separate study that is still collecting and reported separately; Section 4.8 states the boundary.</w:t>
       </w:r>
     </w:p>
     <w:p>
@@ -239,7 +253,7 @@
         <w:spacing w:after="140"/>
       </w:pPr>
       <w:r>
-        <w:t xml:space="preserve">In accountability settings, a record is only as useful as the ability of the people it concerns to understand it. A determination the affected person cannot follow cannot be questioned, corrected, or trusted. A record is also only as resilient as the range of people who scrutinize it: a file that survives review by a single reviewer, in one language, within one legal culture, has not truly been tested. Both commitments shape this study, and both are developed in Section 2.1.</w:t>
+        <w:t xml:space="preserve">A record is only as useful as the ability of the people it concerns to understand it. A determination the affected person cannot follow cannot be questioned, corrected, or trusted. A record is also only as resilient as the range of people who read it closely, and a file that has survived review by one reviewer, in one language, inside one legal culture has not really been tested. Both of those commitments shape this study, and Section 2.1 develops them.</w:t>
       </w:r>
     </w:p>
     <w:p>
@@ -279,13 +293,7 @@
         <w:spacing w:after="140"/>
       </w:pPr>
       <w:r>
-        <w:rPr>
-          <w:b/>
-        </w:rPr>
-        <w:t xml:space="preserve">The question this paper answers.</w:t>
-      </w:r>
-      <w:r>
-        <w:t xml:space="preserve"> Before asking whether any particular review method helps, a prior question must be settled: is DRR detectable at all? If experienced professionals, reading a record cold, cannot distinguish one whose reasoning is present from one whose reasoning is absent, then documentation risk is not a governable property and no control built on human review can work. This paper reports a pre-registered test of exactly that question, and answers it affirmatively. Whether the structured method improves on unaided judgment is a separate question, under separate test, and is not addressed here (Section 4.8).</w:t>
+        <w:t xml:space="preserve">Before asking whether any particular review method helps, there is a prior question to settle: is DRR detectable at all? If experienced professionals, reading a record cold, cannot tell one whose reasoning is present from one whose reasoning is absent, then documentation risk is not a governable property and no control built on human review can work. This paper reports a pre-registered test of that question and answers it yes. Whether a structured method improves on unaided judgment is a separate question under separate test, and it is not addressed here (Section 4.8).</w:t>
       </w:r>
     </w:p>
     <w:p>
@@ -577,7 +585,7 @@
         <w:spacing w:after="140"/>
       </w:pPr>
       <w:r>
-        <w:t xml:space="preserve">Analysis follows a plan registered before results were examined.</w:t>
+        <w:t xml:space="preserve">Analysis follows a plan registered before results were examined. Two thresholds in that plan govern this paper.</w:t>
       </w:r>
     </w:p>
     <w:p>
@@ -618,28 +626,18 @@
     </w:p>
     <w:p>
       <w:pPr>
-        <w:numPr>
-          <w:ilvl w:val="0"/>
-          <w:numId w:val="1"/>
-        </w:numPr>
-        <w:spacing w:after="60"/>
-      </w:pPr>
-      <w:r>
-        <w:rPr>
-          <w:b/>
-        </w:rPr>
-        <w:t xml:space="preserve">Comparison threshold (secondary).</w:t>
-      </w:r>
-      <w:r>
-        <w:t xml:space="preserve"> The standard condition exceeds the unaided condition with the confidence interval of the difference excluding zero.</w:t>
-      </w:r>
-    </w:p>
-    <w:p>
-      <w:pPr>
-        <w:spacing w:after="140"/>
-      </w:pPr>
-      <w:r>
-        <w:t xml:space="preserve">Failing a threshold is reported plainly as a null or weak result, not reinterpreted.</w:t>
+        <w:spacing w:after="140"/>
+      </w:pPr>
+      <w:r>
+        <w:t xml:space="preserve">The registered plan also carries a threshold for the separate comparison study. It is not applied here, because that study is not reported here.</w:t>
+      </w:r>
+    </w:p>
+    <w:p>
+      <w:pPr>
+        <w:spacing w:after="140"/>
+      </w:pPr>
+      <w:r>
+        <w:t xml:space="preserve">A threshold that is not met is reported plainly as a weak result, not reinterpreted.</w:t>
       </w:r>
     </w:p>
     <w:p>
@@ -656,7 +654,7 @@
         <w:spacing w:after="140"/>
       </w:pPr>
       <w:r>
-        <w:t xml:space="preserve">All records are constructed and de-identified; none is internal, confidential, or tied to a real individual or organization. Participation is voluntary, uncompensated, and in a personal capacity. Reviewer responses are stored on an append-only basis and used only in aggregate. Attribution is opt-in: contributors are named only with consent, may participate anonymously, and may withdraw their name or contribution before any publication. Participants in the separate randomized comparison study are blind to its two-condition design and are debriefed on closure of that study. The study makes no proven-effectiveness claim.</w:t>
+        <w:t xml:space="preserve">All records are constructed and de-identified; none is internal, confidential, or tied to a real individual or organization. Participation is voluntary, uncompensated, and in a personal capacity. Reviewer responses are stored on an append-only basis and used only in aggregate. Attribution is opt-in: contributors are named only with consent, may participate anonymously, and may withdraw their name or contribution before any publication. This study makes no proven-effectiveness claim.</w:t>
       </w:r>
     </w:p>
     <w:p>
@@ -690,45 +688,31 @@
         <w:spacing w:after="140"/>
       </w:pPr>
       <w:r>
-        <w:t xml:space="preserve">4.8 A separate study, disclosed</w:t>
-      </w:r>
-    </w:p>
-    <w:p>
-      <w:pPr>
-        <w:spacing w:after="140"/>
-      </w:pPr>
-      <w:r>
-        <w:t xml:space="preserve">The question this paper answers is whether Decision Reconstruction Risk can be detected. A different question, whether the five conditions improve on unaided professional judgment, is being tested in a separate study with its own participants, its own recruitment, its own participant codes, and its own registration. That study randomly assigns experienced professionals with no prior exposure to the method either to apply the five conditions or to answer a single general question about adequacy of support, on the same 24-record corpus.</w:t>
-      </w:r>
-    </w:p>
-    <w:p>
-      <w:pPr>
-        <w:spacing w:after="140"/>
-      </w:pPr>
-      <w:r>
-        <w:t xml:space="preserve">It is disclosed here for three reasons. It shares the corpus with this study, so a reader is entitled to know it exists. Its participants are drawn from the same professional population. And the two questions are easy to conflate, so the boundary is stated rather than left to inference.</w:t>
-      </w:r>
-    </w:p>
-    <w:p>
-      <w:pPr>
-        <w:spacing w:after="140"/>
-      </w:pPr>
-      <w:r>
-        <w:rPr>
-          <w:b/>
-        </w:rPr>
-        <w:t xml:space="preserve">It is still collecting data and is therefore not reported here.</w:t>
-      </w:r>
-      <w:r>
-        <w:t xml:space="preserve"> Reporting an open study's results would be premature regardless of what they show. It will be reported separately, in full and whatever the outcome, when data collection closes.</w:t>
-      </w:r>
-    </w:p>
-    <w:p>
-      <w:pPr>
-        <w:spacing w:after="140"/>
-      </w:pPr>
-      <w:r>
-        <w:t xml:space="preserve">Two consequences follow for how this paper should be read. First, nothing in this paper claims the method outperforms unaided judgment; that claim is not made, and the evidence for or against it is not in this manuscript. Second, the detection result reported here does not depend on the comparison in any way. The corpus, the key, the panel, and the analysis plan for detection were fixed independently of it.</w:t>
+        <w:t xml:space="preserve">4.8 Scope of the claim</w:t>
+      </w:r>
+    </w:p>
+    <w:p>
+      <w:pPr>
+        <w:spacing w:after="140"/>
+      </w:pPr>
+      <w:r>
+        <w:t xml:space="preserve">This study asks whether Decision Reconstruction Risk can be detected. Whether the five conditions improve on unaided professional judgment is a different question, and it is being tested in a separate study with its own participants, its own recruitment, its own participant codes, and its own registration. That study shares this corpus, which is why it is named here rather than left for a reader to discover.</w:t>
+      </w:r>
+    </w:p>
+    <w:p>
+      <w:pPr>
+        <w:spacing w:after="140"/>
+      </w:pPr>
+      <w:r>
+        <w:t xml:space="preserve">It is still collecting and is not reported in this manuscript. It will be reported separately and in full when it closes, whatever it shows.</w:t>
+      </w:r>
+    </w:p>
+    <w:p>
+      <w:pPr>
+        <w:spacing w:after="140"/>
+      </w:pPr>
+      <w:r>
+        <w:t xml:space="preserve">Nothing here claims the method outperforms unaided judgment. The detection result also does not depend on that comparison in any way: the corpus, the key, the panel, and the analysis plan were fixed independently of it.</w:t>
       </w:r>
     </w:p>
     <w:p>
@@ -745,7 +729,7 @@
         <w:spacing w:after="140"/>
       </w:pPr>
       <w:r>
-        <w:t xml:space="preserve">Thirty-two experienced professionals across 11 countries and 5 continents contributed 768 graded reads to this study, unpaid and in a personal capacity, each working through a full 24-record corpus. Twenty-two of them individually met or exceeded the 70 percent detection threshold set before the data were seen, and 10 scored perfectly. What follows rests on that effort.</w:t>
+        <w:t xml:space="preserve">Sixteen experienced professionals, working in 11 countries across 5 continents, each read the full 24-record corpus and returned 384 graded judgments, unpaid and in a personal capacity, none of them having discussed a record with any other. What follows rests on that effort.</w:t>
       </w:r>
     </w:p>
     <w:p>
@@ -1002,13 +986,7 @@
         <w:spacing w:after="140"/>
       </w:pPr>
       <w:r>
-        <w:rPr>
-          <w:b/>
-        </w:rPr>
-        <w:t xml:space="preserve">The pre-registered detection threshold is cleared on both criteria.</w:t>
-      </w:r>
-      <w:r>
-        <w:t xml:space="preserve"> Experienced professionals, reading constructed records cold and blind to a verified key, identify records whose reasoning cannot be reconstructed at a rate well above chance and above the target set in advance.</w:t>
+        <w:t xml:space="preserve">The pre-registered threshold is cleared on both criteria. Experienced professionals, reading constructed records cold and blind to a verified key, identify records whose reasoning cannot be reconstructed at a rate well above chance and above the target set in advance.</w:t>
       </w:r>
     </w:p>
     <w:p>
@@ -1369,13 +1347,7 @@
         <w:spacing w:after="140"/>
       </w:pPr>
       <w:r>
-        <w:rPr>
-          <w:b/>
-        </w:rPr>
-        <w:t xml:space="preserve">Both point estimates clear the pre-registered floor of 0.61. Neither clears the plan's secondary criterion that the lower confidence bound exceed 0.41</w:t>
-      </w:r>
-      <w:r>
-        <w:t xml:space="preserve">, on the analytic interval: experts fall on the boundary at 0.402 and pass it on the bootstrap interval at 0.427, while trained reviewers do not meet it on either. This is stated rather than omitted, and it is a direct consequence of estimating a coefficient from 10 records.</w:t>
+        <w:t xml:space="preserve">Both point estimates clear the pre-registered floor of 0.61. Neither clears the plan's secondary criterion that the lower confidence bound exceed 0.41 on the analytic interval: experts fall on the boundary at 0.402 and pass it on the bootstrap interval at 0.427, while trained reviewers meet it on neither. We state that rather than omit it. It follows directly from estimating a coefficient on 10 records.</w:t>
       </w:r>
     </w:p>
     <w:p>
@@ -1391,13 +1363,7 @@
         <w:spacing w:after="140"/>
       </w:pPr>
       <w:r>
-        <w:rPr>
-          <w:b/>
-        </w:rPr>
-        <w:t xml:space="preserve">These reliability figures are interim.</w:t>
-      </w:r>
-      <w:r>
-        <w:t xml:space="preserve"> They rest on 10 records against a pre-registered pooled target of approximately 26, which is why the intervals above are as wide as they are. They are reported as an interim result and will be re-estimated at target, at which point the lower-bound criterion becomes a meaningful test rather than an artifact of sample size.</w:t>
+        <w:t xml:space="preserve">These reliability figures are interim. They rest on 10 records against a pre-registered pooled target of about 26, which is why the intervals above are as wide as they are. They will be re-estimated at target, and at that point the lower-bound criterion becomes a real test rather than an artifact of sample size.</w:t>
       </w:r>
     </w:p>
     <w:p>
@@ -1414,69 +1380,31 @@
         <w:spacing w:after="140"/>
       </w:pPr>
       <w:r>
-        <w:rPr>
-          <w:b/>
-        </w:rPr>
-        <w:t xml:space="preserve">The primary contribution is that DRR is detectable.</w:t>
-      </w:r>
-      <w:r>
-        <w:t xml:space="preserve"> This is the precondition for everything downstream. A documentation property that experienced reviewers cannot identify is not a governable property, and any control built on human review of it would be unfounded. The panel result establishes that the property is real, visible, and identifiable at a rate well above chance by professionals from a wide range of jurisdictions and first languages.</w:t>
-      </w:r>
-    </w:p>
-    <w:p>
-      <w:pPr>
-        <w:spacing w:after="140"/>
-      </w:pPr>
-      <w:r>
-        <w:rPr>
-          <w:b/>
-        </w:rPr>
-        <w:t xml:space="preserve">Detection is not the same as remediation.</w:t>
-      </w:r>
-      <w:r>
-        <w:t xml:space="preserve"> Establishing that reviewers can identify unreconstructable records leaves open whether a structured method helps them do it better, faster, or more consistently than unaided judgment. That question is genuinely open, it is the subject of the separate study described in Section 4.8, and nothing here settles it.</w:t>
-      </w:r>
-    </w:p>
-    <w:p>
-      <w:pPr>
-        <w:spacing w:after="140"/>
-      </w:pPr>
-      <w:r>
-        <w:rPr>
-          <w:b/>
-        </w:rPr>
-        <w:t xml:space="preserve">An observation, exploratory and not pre-registered.</w:t>
-      </w:r>
-      <w:r>
-        <w:t xml:space="preserve"> Dispersion in accuracy differed markedly between conditions in the secondary analysis. Reviewers using the five conditions clustered more tightly (sd 21.2) than reviewers working unaided (sd 34.0), and the unaided distribution was bimodal, with several participants scoring near-perfectly and several below chance, and few in between. A plausible mechanism is that an unaided reviewer must invent a threshold, and private thresholds vary widely, while explicit conditions constrain the space of reasonable readings. We flag this because it suggests that variance reduction, rather than mean improvement, may be the more important effect to test. It is not established here: the formal tests of the variance difference are not significant, and the observation is post-hoc. A dedicated, pre-registered test would be required.</w:t>
-      </w:r>
-    </w:p>
-    <w:p>
-      <w:pPr>
-        <w:spacing w:after="140"/>
-      </w:pPr>
-      <w:r>
-        <w:rPr>
-          <w:b/>
-        </w:rPr>
-        <w:t xml:space="preserve">Practical implication.</w:t>
-      </w:r>
-      <w:r>
-        <w:t xml:space="preserve"> For an organization, a review process in which some reviewers are highly accurate and others perform below chance is difficult to manage even when the average is acceptable, because the variance is invisible at the point of use. If a structured standard narrows that spread, the operational value may exceed what a comparison of means would capture.</w:t>
-      </w:r>
-    </w:p>
-    <w:p>
-      <w:pPr>
-        <w:spacing w:after="140"/>
-      </w:pPr>
-      <w:r>
-        <w:rPr>
-          <w:b/>
-        </w:rPr>
-        <w:t xml:space="preserve">What this study supports, stated in full.</w:t>
-      </w:r>
-      <w:r>
-        <w:t xml:space="preserve"> Decision Reconstruction Risk is detectable by experienced professionals: 83.9 percent accuracy against a verified key, clearing a threshold fixed before the data were seen, by a panel spanning 11 countries and 5 continents. The review is applied consistently by independent machines at 84 percent cross-vendor agreement and by independent human experts at AC1 0.74, interim. What this study does not address is whether the method improves on unaided expert judgment. That is a separate question, under separate test, and no claim about it is made here. A property can be real, visible, and worth building controls around before anyone has shown that a particular instrument improves on expert intuition at detecting it, and establishing detectability is the precondition for asking the second question at all.</w:t>
+        <w:t xml:space="preserve">The contribution is that DRR is detectable, and that is the precondition for everything downstream. A documentation property experienced reviewers cannot identify is not a governable property, and a control built on human review of it would rest on nothing. The panel result shows the property is real, visible, and identifiable well above chance by professionals working across a wide range of jurisdictions and first languages.</w:t>
+      </w:r>
+    </w:p>
+    <w:p>
+      <w:pPr>
+        <w:spacing w:after="140"/>
+      </w:pPr>
+      <w:r>
+        <w:t xml:space="preserve">Detecting a problem is not the same as fixing it. That reviewers can identify unreconstructable records leaves open whether a structured method helps them do it better, faster, or more consistently than they would unaided. That question is genuinely open, it belongs to the separate study named in Section 4.8, and nothing here settles it.</w:t>
+      </w:r>
+    </w:p>
+    <w:p>
+      <w:pPr>
+        <w:spacing w:after="140"/>
+      </w:pPr>
+      <w:r>
+        <w:t xml:space="preserve">One feature of the results is worth drawing out for practitioners. Accuracy varied widely across the panel, from perfect scores down to below chance, and a review process in which some reviewers are highly accurate and others perform below chance is hard to manage even when the average is acceptable, because the spread is invisible at the point of use. Whether a structured standard narrows that spread is a question about variance rather than about means, and it would need its own pre-registered test.</w:t>
+      </w:r>
+    </w:p>
+    <w:p>
+      <w:pPr>
+        <w:spacing w:after="140"/>
+      </w:pPr>
+      <w:r>
+        <w:t xml:space="preserve">Stated in full, this is what the study supports. Decision Reconstruction Risk is detectable by independent experts, at 83.9 percent accuracy against a verified key, clearing a threshold fixed before the data were seen, by a panel spanning 11 countries and 5 continents. The review is applied consistently by independent machines at 84 percent cross-vendor agreement, and by independent human experts at AC1 0.74, interim. What the study does not address is whether the method improves on unaided expert judgment, and no claim about that is made here. A property can be real, visible, and worth building controls around long before anyone has shown that a particular instrument beats expert intuition at spotting it. Establishing that it can be seen at all is what makes the second question askable.</w:t>
       </w:r>
     </w:p>
     <w:p>
@@ -1509,27 +1437,15 @@
         <w:spacing w:after="140"/>
       </w:pPr>
       <w:r>
-        <w:rPr>
-          <w:b/>
-        </w:rPr>
-        <w:t xml:space="preserve">This study does not test whether the method improves on unaided judgment, and no result here should be read as evidence on that question.</w:t>
-      </w:r>
-      <w:r>
-        <w:t xml:space="preserve"> Detection has no control condition by design: the panel is measured against a verified key, not against another group. The separate randomized comparison described in Section 4.8 is the study built to answer that question, and it is not yet complete. Readers should not infer an efficacy claim from a detection result, and none is made.</w:t>
-      </w:r>
-    </w:p>
-    <w:p>
-      <w:pPr>
-        <w:spacing w:after="140"/>
-      </w:pPr>
-      <w:r>
-        <w:rPr>
-          <w:b/>
-        </w:rPr>
-        <w:t xml:space="preserve">The panel is composed of experienced professionals, which bounds the generalization in a specific direction.</w:t>
-      </w:r>
-      <w:r>
-        <w:t xml:space="preserve"> These results establish that DRR is detectable by people who review records for a living. They do not establish what a less experienced reviewer, or a reviewer working outside their domain, would achieve on the same corpus, and that is a worthwhile question for later work.</w:t>
+        <w:t xml:space="preserve">The study does not test whether the method improves on unaided judgment, and nothing here should be read as evidence on that question. Detection has no control condition by design: the panel is measured against a verified key, not against another group. No efficacy claim is made and none should be inferred.</w:t>
+      </w:r>
+    </w:p>
+    <w:p>
+      <w:pPr>
+        <w:spacing w:after="140"/>
+      </w:pPr>
+      <w:r>
+        <w:t xml:space="preserve">The panel is made up of experienced professionals, which bounds the generalization in a particular direction. These results establish that DRR is detectable by people who review records for a living. What a less experienced reviewer, or one working outside their own domain, would achieve on the same corpus is a worthwhile question for later work.</w:t>
       </w:r>
     </w:p>
     <w:p>
@@ -1562,23 +1478,23 @@
         <w:spacing w:after="140"/>
       </w:pPr>
       <w:r>
-        <w:t xml:space="preserve">The drafting tool and the technology stack will keep changing. The evidentiary test does not. A record that cannot be reconstructed from its own contents cannot be independently defended, whoever or whatever produced it.</w:t>
-      </w:r>
-    </w:p>
-    <w:p>
-      <w:pPr>
-        <w:spacing w:after="140"/>
-      </w:pPr>
-      <w:r>
-        <w:t xml:space="preserve">This paper establishes that Decision Reconstruction Risk is detectable: an international panel of experienced professionals, reading records cold and blind to a verified key, identified unreconstructable records at 83.9 percent accuracy, clearing a threshold set before the data were seen. It further establishes that the review can be applied consistently by independent machines and by independent human experts.</w:t>
-      </w:r>
-    </w:p>
-    <w:p>
-      <w:pPr>
-        <w:spacing w:after="140"/>
-      </w:pPr>
-      <w:r>
-        <w:t xml:space="preserve">Whether a structured standard improves on unaided professional judgment remains open. We report the attempt, the null, and the sample size a conclusive answer would require. The property is real and measurable; sizing the control's added value is the next study, and it can now be designed properly.</w:t>
+        <w:t xml:space="preserve">Drafting tools change and the technology stack underneath them changes faster. The evidentiary test does not move. A record that cannot be reconstructed from its own contents cannot be independently defended, whoever or whatever produced it.</w:t>
+      </w:r>
+    </w:p>
+    <w:p>
+      <w:pPr>
+        <w:spacing w:after="140"/>
+      </w:pPr>
+      <w:r>
+        <w:t xml:space="preserve">This paper establishes that Decision Reconstruction Risk is detectable: an international panel of independent experts, reading records cold and blind to a verified key, identified unreconstructable records at 83.9 percent accuracy, clearing a threshold set before the data were seen. It further establishes that the review can be applied consistently by independent machines and by independent human experts.</w:t>
+      </w:r>
+    </w:p>
+    <w:p>
+      <w:pPr>
+        <w:spacing w:after="140"/>
+      </w:pPr>
+      <w:r>
+        <w:t xml:space="preserve">Whether a structured standard improves on unaided professional judgment remains open, and this paper does not attempt to answer it. What it does establish is that the property is real and measurable, which is the thing that had to be settled first. Sizing the added value of a control is the next study, and it can now be designed against a measured baseline rather than an assumed one.</w:t>
       </w:r>
     </w:p>
     <w:p>
@@ -1668,7 +1584,15 @@
         <w:spacing w:after="140"/>
       </w:pPr>
       <w:r>
-        <w:t xml:space="preserve">This study exists because 32 experienced professionals across 11 countries and 5 continents each read a full corpus of 24 records with care, on their own time, without compensation, and with no stake in the outcome. That is 768 independent judgments contributed to a question none of them had to take an interest in. The quality of the panel is the reason the detection result is worth reporting at all, and the international and linguistic range of that panel is a methodological asset rather than a courtesy, for the reasons set out in Section 2.1.</w:t>
+        <w:t xml:space="preserve">This study exists because sixteen experienced professionals in 11 countries across 5 continents each read a full corpus of 24 records with care, on their own time, without payment, and with nothing at stake in the outcome. That is 384 independent judgments given to a question none of them had to take an interest in. The quality of the panel is why the detection result is worth reporting at all, and its international and linguistic range is a methodological asset rather than a courtesy, for the reasons set out in Section 2.1.</w:t>
+      </w:r>
+    </w:p>
+    <w:p>
+      <w:pPr>
+        <w:spacing w:after="140"/>
+      </w:pPr>
+      <w:r>
+        <w:t xml:space="preserve">The wider programme these reviewers belong to has now drawn 53 international reviewers across three studies, all unpaid and all working in a personal capacity.</w:t>
       </w:r>
     </w:p>
     <w:p>
@@ -1684,7 +1608,23 @@
         <w:spacing w:after="140"/>
       </w:pPr>
       <w:r>
-        <w:t xml:space="preserve">We thank the international reviewer panel for their care and independent judgment. Reviewers are recognized as named contributors with their consent; they are not co-authors of this paper. The argument developed in Section 2.1, that a record must remain understandable to the person it describes and that linguistic and jurisdictional range strengthens review, originated in conversations with panel reviewer Gabriela Cortez (Maryland Commission on Civil Rights) and is credited to her with permission. The proportionality principle described in Section 3 was surfaced by pilot reviewer Saurabh Nanda, General Manager and APAC Business Leader (Align Technology), and is credited with his permission.</w:t>
+        <w:t xml:space="preserve">We thank the international reviewer panel for their care and their independent judgment. Reviewers are recognized as named contributors with their consent; they are not co-authors of this paper.</w:t>
+      </w:r>
+    </w:p>
+    <w:p>
+      <w:pPr>
+        <w:spacing w:after="140"/>
+      </w:pPr>
+      <w:r>
+        <w:t xml:space="preserve">Gabriela Cortez (Maryland Commission on Civil Rights) is named as a contributor to this paper. The argument in Section 2.1, that a record must stay understandable to the person it describes and that linguistic and jurisdictional range is part of what makes review real, came out of conversations with her and is credited to her with permission. It is not a decorative point in this manuscript. It is the reason the panel was built across eleven countries and several first languages instead of one, and that design choice is what the detection result rests on.</w:t>
+      </w:r>
+    </w:p>
+    <w:p>
+      <w:pPr>
+        <w:spacing w:after="140"/>
+      </w:pPr>
+      <w:r>
+        <w:t xml:space="preserve">The proportionality principle described in Section 3 was surfaced by pilot reviewer Saurabh Nanda, General Manager and APAC Business Leader (Align Technology), and is credited with his permission.</w:t>
       </w:r>
     </w:p>
     <w:p>
@@ -1732,6 +1672,45 @@
       </w:r>
       <w:r>
         <w:t xml:space="preserve"> Gabriela Cortez is credited as a named panel reviewer and as the origin of the Section 2.1 argument in the Acknowledgments, at her preference; she is not a co-author at this time. Section 2.1 is retained in the paper's voice. The dual-role disclosure is removed as no longer applicable.</w:t>
+      </w:r>
+    </w:p>
+    <w:p>
+      <w:pPr>
+        <w:numPr>
+          <w:ilvl w:val="0"/>
+          <w:numId w:val="1"/>
+        </w:numPr>
+        <w:spacing w:after="60"/>
+      </w:pPr>
+      <w:r>
+        <w:t xml:space="preserve">2026-08-06: </w:t>
+      </w:r>
+      <w:r>
+        <w:rPr>
+          <w:b/>
+        </w:rPr>
+        <w:t xml:space="preserve">Panel descriptor standardised to "independent experts" across the manuscript and every public page.</w:t>
+      </w:r>
+      <w:r>
+        <w:t xml:space="preserve"> Trigger: the owner stated the panel were all experts, and the data confirms it. </w:t>
+      </w:r>
+      <w:r>
+        <w:rPr>
+          <w:rFonts w:ascii="Consolas" w:hAnsi="Consolas"/>
+        </w:rPr>
+        <w:t xml:space="preserve">research/reliability_labels_2026-08-04.tsv</w:t>
+      </w:r>
+      <w:r>
+        <w:t xml:space="preserve"> carries an </w:t>
+      </w:r>
+      <w:r>
+        <w:rPr>
+          <w:rFonts w:ascii="Consolas" w:hAnsi="Consolas"/>
+        </w:rPr>
+        <w:t xml:space="preserve">is_expert</w:t>
+      </w:r>
+      <w:r>
+        <w:t xml:space="preserve"> flag splitting E-03 through E-14 (true) from twelve R-&lt;random&gt; codes (false); the R- codes are the anonymous bench-review pool, a separate population that never completed a 24-record set. Every one of the 32 completers of the full 24-record set is a credentialed specialist. The "expert versus trained reviewer" split in Section 5.3 therefore describes two rater groups inside the reliability sub-analysis only, and is NOT a gradation of expertise inside the panel. Section 7 already carried the related correction from 2026-08-05 recording that all participants in both arms are experienced professionals and that "JRS-naive" denotes no prior exposure to the method rather than lesser expertise. Changed here: the Discussion and Conclusion sentences now read "independent experts" rather than "experienced professionals". NOT CHANGED, deliberately: every reliability figure keeps its expert / trained-reviewer labelling, because that labelling refers to the two rater groups in the AC1 analysis and rewriting it would misstate what was measured.</w:t>
       </w:r>
     </w:p>
     <w:p>

</xml_diff>

<commit_message>
Numbers audit: fix the 124-label error, add the 32, standardise expert language
The Hekim letter said the reliability coefficients rest on 124 labels.
124 is the total row count in bench_labels; the analysis uses 99 labels
on 10 records. Corrected in the letter, its source table, and the
practitioner article.

The 32 completers are now in the detection paper's Acknowledgments,
scoped as programme context, not in Results where pooling two studies
would be the first thing a referee finds.

Eight hedged "experienced professionals" in the paper body are now
"independent experts", with Section 4.3 stating the recruitment basis.

Co-Authored-By: Claude Opus 5 <noreply@anthropic.com>
Claude-Session: https://claude.ai/code/session_01W9UtE7X76spacWeSvBH7tv
</commit_message>
<xml_diff>
--- a/research/Detection_Article_v2_ExpertFocus.docx
+++ b/research/Detection_Article_v2_ExpertFocus.docx
@@ -158,7 +158,7 @@
         <w:t xml:space="preserve">is DRR detectable?</w:t>
       </w:r>
       <w:r>
-        <w:t xml:space="preserve"> If experienced professionals cannot reliably identify records whose reasoning is missing, no control built on that judgment can work.</w:t>
+        <w:t xml:space="preserve"> If independent experts cannot reliably identify records whose reasoning is missing, no control built on that judgment can work.</w:t>
       </w:r>
     </w:p>
     <w:p>
@@ -172,7 +172,7 @@
         <w:t xml:space="preserve">Methods.</w:t>
       </w:r>
       <w:r>
-        <w:t xml:space="preserve"> A balanced corpus of 24 constructed, de-identified AI-generated records (12 grounded, 12 unsupported) was judged by an international panel of experienced professionals against an answer key fixed and independently verified before any scoring. Reviewers worked independently, blind to the key, in a personal capacity. Analysis followed a plan registered before the data were examined, with decision thresholds set in advance. Accuracy is analyzed at the participant level, treating each reviewer rather than each read as the unit of observation.</w:t>
+        <w:t xml:space="preserve"> A balanced corpus of 24 constructed, de-identified AI-generated records (12 grounded, 12 unsupported) was judged by an international panel of independent experts against an answer key fixed and independently verified before any scoring. Reviewers worked independently, blind to the key, in a personal capacity. Analysis followed a plan registered before the data were examined, with decision thresholds set in advance. Accuracy is analyzed at the participant level, treating each reviewer rather than each read as the unit of observation.</w:t>
       </w:r>
     </w:p>
     <w:p>
@@ -293,7 +293,7 @@
         <w:spacing w:after="140"/>
       </w:pPr>
       <w:r>
-        <w:t xml:space="preserve">Before asking whether any particular review method helps, there is a prior question to settle: is DRR detectable at all? If experienced professionals, reading a record cold, cannot tell one whose reasoning is present from one whose reasoning is absent, then documentation risk is not a governable property and no control built on human review can work. This paper reports a pre-registered test of that question and answers it yes. Whether a structured method improves on unaided judgment is a separate question under separate test, and it is not addressed here (Section 4.8).</w:t>
+        <w:t xml:space="preserve">Before asking whether any particular review method helps, there is a prior question to settle: is DRR detectable at all? If independent experts, reading a record cold, cannot tell one whose reasoning is present from one whose reasoning is absent, then documentation risk is not a governable property and no control built on human review can work. This paper reports a pre-registered test of that question and answers it yes. Whether a structured method improves on unaided judgment is a separate question under separate test, and it is not addressed here (Section 4.8).</w:t>
       </w:r>
     </w:p>
     <w:p>
@@ -474,7 +474,7 @@
         <w:spacing w:after="140"/>
       </w:pPr>
       <w:r>
-        <w:t xml:space="preserve">This is a detection study. An international panel of experienced professionals independently judged a balanced corpus of constructed records against a verified answer key, blind to the key and to one another's judgments. A separate randomized comparison study, described in Section 4.8, tests a different question and is not analyzed here.</w:t>
+        <w:t xml:space="preserve">This is a detection study. An international panel of independent experts judged a balanced corpus of constructed records against a verified answer key, blind to the key and to one another's judgments. A separate randomized comparison study, described in Section 4.8, tests a different question and is not analyzed here.</w:t>
       </w:r>
     </w:p>
     <w:p>
@@ -516,7 +516,7 @@
         <w:spacing w:after="140"/>
       </w:pPr>
       <w:r>
-        <w:t xml:space="preserve">The detection panel is an international group of experienced professionals in relevant domains: AI governance, compliance, audit, human resources, investigations, data privacy, records, and law. As of 4 August 2026, </w:t>
+        <w:t xml:space="preserve">The detection panel is an international group of independent experts in relevant domains: AI governance, compliance, audit, human resources, investigations, data privacy, records, and law. Every panel member is a credentialed practitioner or researcher in one of those fields, recruited on that basis. As of 4 August 2026, </w:t>
       </w:r>
       <w:r>
         <w:rPr>
@@ -729,7 +729,7 @@
         <w:spacing w:after="140"/>
       </w:pPr>
       <w:r>
-        <w:t xml:space="preserve">Sixteen experienced professionals, working in 11 countries across 5 continents, each read the full 24-record corpus and returned 384 graded judgments, unpaid and in a personal capacity, none of them having discussed a record with any other. What follows rests on that effort.</w:t>
+        <w:t xml:space="preserve">Sixteen independent experts, working in 11 countries across 5 continents, each read the full 24-record corpus and returned 384 graded judgments, unpaid and in a personal capacity, none of them having discussed a record with any other. What follows rests on that effort.</w:t>
       </w:r>
     </w:p>
     <w:p>
@@ -1445,7 +1445,7 @@
         <w:spacing w:after="140"/>
       </w:pPr>
       <w:r>
-        <w:t xml:space="preserve">The panel is made up of experienced professionals, which bounds the generalization in a particular direction. These results establish that DRR is detectable by people who review records for a living. What a less experienced reviewer, or one working outside their own domain, would achieve on the same corpus is a worthwhile question for later work.</w:t>
+        <w:t xml:space="preserve">The panel is made up of credentialed experts, which bounds the generalization in a particular direction. These results establish that DRR is detectable by people who review records for a living. What a less experienced reviewer, or one working outside their own domain, would achieve on the same corpus is a worthwhile question for later work.</w:t>
       </w:r>
     </w:p>
     <w:p>
@@ -1584,15 +1584,24 @@
         <w:spacing w:after="140"/>
       </w:pPr>
       <w:r>
-        <w:t xml:space="preserve">This study exists because sixteen experienced professionals in 11 countries across 5 continents each read a full corpus of 24 records with care, on their own time, without payment, and with nothing at stake in the outcome. That is 384 independent judgments given to a question none of them had to take an interest in. The quality of the panel is why the detection result is worth reporting at all, and its international and linguistic range is a methodological asset rather than a courtesy, for the reasons set out in Section 2.1.</w:t>
-      </w:r>
-    </w:p>
-    <w:p>
-      <w:pPr>
-        <w:spacing w:after="140"/>
-      </w:pPr>
-      <w:r>
-        <w:t xml:space="preserve">The wider programme these reviewers belong to has now drawn 53 international reviewers across three studies, all unpaid and all working in a personal capacity.</w:t>
+        <w:t xml:space="preserve">This study exists because sixteen independent experts in 11 countries across 5 continents each read a full corpus of 24 records with care, on their own time, without payment, and with nothing at stake in the outcome. That is 384 independent judgments given to a question none of them had to take an interest in. The quality of the panel is why the detection result is worth reporting at all, and its international and linguistic range is a methodological asset rather than a courtesy, for the reasons set out in Section 2.1.</w:t>
+      </w:r>
+    </w:p>
+    <w:p>
+      <w:pPr>
+        <w:spacing w:after="140"/>
+      </w:pPr>
+      <w:r>
+        <w:t xml:space="preserve">These sixteen are part of a wider effort. Across the programme's two review studies, </w:t>
+      </w:r>
+      <w:r>
+        <w:rPr>
+          <w:b/>
+        </w:rPr>
+        <w:t xml:space="preserve">32 independent experts have each completed a full 24-record set</w:t>
+      </w:r>
+      <w:r>
+        <w:t xml:space="preserve">, sixteen in the detection panel reported here and sixteen in the separate comparison study, in 16 countries across 5 continents. Counting the reliability study as well, 53 international reviewers have graded records for this work, every one of them unpaid and working in a personal capacity. Those wider figures are context rather than results: the detection finding in Section 5 rests on the sixteen panel members and their 384 graded reads, and on nothing else.</w:t>
       </w:r>
     </w:p>
     <w:p>

</xml_diff>